<commit_message>
Task 3 Assignemnt 3
</commit_message>
<xml_diff>
--- a/Practica 3/Ladder Design Timers REV02.docx
+++ b/Practica 3/Ladder Design Timers REV02.docx
@@ -246,11 +246,24 @@
       <w:r>
         <w:t xml:space="preserve">operations and the programming of </w:t>
       </w:r>
+      <w:proofErr w:type="gramStart"/>
       <w:r>
         <w:t xml:space="preserve">a </w:t>
       </w:r>
       <w:r>
-        <w:t>simple ladder diagrams. Students will download their programs to the Mitsubishi FX</w:t>
+        <w:t>simple</w:t>
+      </w:r>
+      <w:proofErr w:type="gramEnd"/>
+      <w:r>
+        <w:t xml:space="preserve"> ladder </w:t>
+      </w:r>
+      <w:proofErr w:type="gramStart"/>
+      <w:r>
+        <w:t>diagrams</w:t>
+      </w:r>
+      <w:proofErr w:type="gramEnd"/>
+      <w:r>
+        <w:t>. Students will download their programs to the Mitsubishi FX</w:t>
       </w:r>
       <w:r>
         <w:t>3G</w:t>
@@ -292,11 +305,16 @@
       <w:r>
         <w:t xml:space="preserve"> using </w:t>
       </w:r>
+      <w:proofErr w:type="gramStart"/>
       <w:r>
         <w:t xml:space="preserve">timers </w:t>
       </w:r>
       <w:r>
-        <w:t xml:space="preserve"> for outputs</w:t>
+        <w:t xml:space="preserve"> for</w:t>
+      </w:r>
+      <w:proofErr w:type="gramEnd"/>
+      <w:r>
+        <w:t xml:space="preserve"> outputs</w:t>
       </w:r>
       <w:r>
         <w:t xml:space="preserve"> for various Scenarios. </w:t>
@@ -402,10 +420,26 @@
         <w:t>Y0</w:t>
       </w:r>
       <w:r>
-        <w:t xml:space="preserve"> should only be turned on for 10 seconds and then turn off. </w:t>
-      </w:r>
-      <w:r>
-        <w:t xml:space="preserve">The Lamp Y0 should only be turned for 10 seconds, even if push button S1 is held longer than 10 seconds </w:t>
+        <w:t xml:space="preserve"> should only be turned on for 10 seconds and then </w:t>
+      </w:r>
+      <w:proofErr w:type="gramStart"/>
+      <w:r>
+        <w:t>turn</w:t>
+      </w:r>
+      <w:proofErr w:type="gramEnd"/>
+      <w:r>
+        <w:t xml:space="preserve"> off. </w:t>
+      </w:r>
+      <w:r>
+        <w:t xml:space="preserve">The Lamp Y0 should only be turned for 10 seconds, even if push button S1 is </w:t>
+      </w:r>
+      <w:proofErr w:type="gramStart"/>
+      <w:r>
+        <w:t>held</w:t>
+      </w:r>
+      <w:proofErr w:type="gramEnd"/>
+      <w:r>
+        <w:t xml:space="preserve"> longer than 10 seconds </w:t>
       </w:r>
     </w:p>
     <w:p>
@@ -549,6 +583,7 @@
       <w:r>
         <w:tab/>
       </w:r>
+      <w:proofErr w:type="gramStart"/>
       <w:r>
         <w:rPr>
           <w:b/>
@@ -568,7 +603,15 @@
           <w:b/>
           <w:bCs/>
         </w:rPr>
-        <w:t>0 Marks)</w:t>
+        <w:t>0</w:t>
+      </w:r>
+      <w:proofErr w:type="gramEnd"/>
+      <w:r>
+        <w:rPr>
+          <w:b/>
+          <w:bCs/>
+        </w:rPr>
+        <w:t xml:space="preserve"> Marks)</w:t>
       </w:r>
     </w:p>
     <w:bookmarkEnd w:id="1"/>
@@ -860,6 +903,7 @@
       <w:r>
         <w:tab/>
       </w:r>
+      <w:proofErr w:type="gramStart"/>
       <w:r>
         <w:rPr>
           <w:b/>
@@ -881,6 +925,7 @@
         </w:rPr>
         <w:t>0</w:t>
       </w:r>
+      <w:proofErr w:type="gramEnd"/>
       <w:r>
         <w:rPr>
           <w:b/>
@@ -1011,16 +1056,27 @@
         <w:spacing w:line="360" w:lineRule="auto"/>
       </w:pPr>
       <w:r>
-        <w:t>The process requires a constant green for vehicles. When a person wants to cross the road</w:t>
-      </w:r>
-      <w:r>
-        <w:t xml:space="preserve"> they must press the button on the pole at either side of the road. The two button</w:t>
+        <w:t xml:space="preserve"> </w:t>
+      </w:r>
+      <w:r>
+        <w:t xml:space="preserve"> </w:t>
+      </w:r>
+      <w:r>
+        <w:t>. The two button</w:t>
       </w:r>
       <w:r>
         <w:t>s</w:t>
       </w:r>
       <w:r>
-        <w:t xml:space="preserve"> named S1 and S2</w:t>
+        <w:t xml:space="preserve"> </w:t>
+      </w:r>
+      <w:proofErr w:type="gramStart"/>
+      <w:r>
+        <w:t>named</w:t>
+      </w:r>
+      <w:proofErr w:type="gramEnd"/>
+      <w:r>
+        <w:t xml:space="preserve"> S1 and S2</w:t>
       </w:r>
       <w:r>
         <w:t xml:space="preserve">. The person may only cross the road when there is a red light for </w:t>
@@ -1082,7 +1138,6 @@
     </w:p>
     <w:p>
       <w:r>
-        <w:lastRenderedPageBreak/>
         <w:t xml:space="preserve">1: Develop and I/0 table for the process. </w:t>
       </w:r>
     </w:p>
@@ -1093,6 +1148,7 @@
     </w:p>
     <w:p>
       <w:r>
+        <w:lastRenderedPageBreak/>
         <w:t>3: Test on Simulator to ensure correct Operation</w:t>
       </w:r>
     </w:p>
@@ -1152,6 +1208,7 @@
       <w:r>
         <w:tab/>
       </w:r>
+      <w:proofErr w:type="gramStart"/>
       <w:r>
         <w:rPr>
           <w:b/>
@@ -1166,6 +1223,7 @@
         </w:rPr>
         <w:t>50</w:t>
       </w:r>
+      <w:proofErr w:type="gramEnd"/>
       <w:r>
         <w:rPr>
           <w:b/>

</xml_diff>

<commit_message>
Task 3 Exercises 2 and 3 done
</commit_message>
<xml_diff>
--- a/Practica 3/Ladder Design Timers REV02.docx
+++ b/Practica 3/Ladder Design Timers REV02.docx
@@ -4,7 +4,7 @@
   <w:body>
     <w:p>
       <w:pPr>
-        <w:pStyle w:val="Title"/>
+        <w:pStyle w:val="Ttulo"/>
         <w:rPr>
           <w:b/>
           <w:sz w:val="40"/>
@@ -66,7 +66,7 @@
     </w:p>
     <w:p>
       <w:pPr>
-        <w:pStyle w:val="Title"/>
+        <w:pStyle w:val="Ttulo"/>
         <w:jc w:val="center"/>
         <w:rPr>
           <w:b/>
@@ -76,7 +76,7 @@
     </w:p>
     <w:p>
       <w:pPr>
-        <w:pStyle w:val="Title"/>
+        <w:pStyle w:val="Ttulo"/>
         <w:jc w:val="center"/>
       </w:pPr>
       <w:r>
@@ -198,7 +198,7 @@
     <w:p/>
     <w:p>
       <w:pPr>
-        <w:pStyle w:val="Heading1"/>
+        <w:pStyle w:val="Ttulo1"/>
       </w:pPr>
       <w:r>
         <w:t xml:space="preserve">Section 1 – </w:t>
@@ -209,7 +209,7 @@
     </w:p>
     <w:p>
       <w:pPr>
-        <w:pStyle w:val="Heading2"/>
+        <w:pStyle w:val="Ttulo2"/>
       </w:pPr>
       <w:r>
         <w:t>Abstract</w:t>
@@ -286,7 +286,7 @@
     </w:p>
     <w:p>
       <w:pPr>
-        <w:pStyle w:val="Heading2"/>
+        <w:pStyle w:val="Ttulo2"/>
       </w:pPr>
       <w:r>
         <w:t>Objective</w:t>
@@ -322,25 +322,25 @@
     </w:p>
     <w:p>
       <w:pPr>
-        <w:pStyle w:val="Heading2"/>
+        <w:pStyle w:val="Ttulo2"/>
         <w:spacing w:line="360" w:lineRule="auto"/>
       </w:pPr>
     </w:p>
     <w:p>
       <w:pPr>
-        <w:pStyle w:val="Heading2"/>
+        <w:pStyle w:val="Ttulo2"/>
       </w:pPr>
     </w:p>
     <w:p/>
     <w:p>
       <w:pPr>
-        <w:pStyle w:val="Heading2"/>
+        <w:pStyle w:val="Ttulo2"/>
       </w:pPr>
     </w:p>
     <w:p/>
     <w:p>
       <w:pPr>
-        <w:pStyle w:val="ListNumber"/>
+        <w:pStyle w:val="Listaconnmeros"/>
         <w:numPr>
           <w:ilvl w:val="0"/>
           <w:numId w:val="0"/>
@@ -385,7 +385,7 @@
     <w:bookmarkEnd w:id="0"/>
     <w:p>
       <w:pPr>
-        <w:pStyle w:val="ListNumber"/>
+        <w:pStyle w:val="Listaconnmeros"/>
         <w:numPr>
           <w:ilvl w:val="0"/>
           <w:numId w:val="0"/>
@@ -400,7 +400,7 @@
     </w:p>
     <w:p>
       <w:pPr>
-        <w:pStyle w:val="ListNumber"/>
+        <w:pStyle w:val="Listaconnmeros"/>
         <w:numPr>
           <w:ilvl w:val="0"/>
           <w:numId w:val="0"/>
@@ -444,7 +444,7 @@
     </w:p>
     <w:p>
       <w:pPr>
-        <w:pStyle w:val="ListNumber"/>
+        <w:pStyle w:val="Listaconnmeros"/>
         <w:numPr>
           <w:ilvl w:val="0"/>
           <w:numId w:val="0"/>
@@ -454,7 +454,7 @@
     </w:p>
     <w:p>
       <w:pPr>
-        <w:pStyle w:val="ListNumber"/>
+        <w:pStyle w:val="Listaconnmeros"/>
         <w:numPr>
           <w:ilvl w:val="0"/>
           <w:numId w:val="0"/>
@@ -503,7 +503,7 @@
     </w:p>
     <w:p>
       <w:pPr>
-        <w:pStyle w:val="ListNumber"/>
+        <w:pStyle w:val="Listaconnmeros"/>
         <w:numPr>
           <w:ilvl w:val="0"/>
           <w:numId w:val="0"/>
@@ -512,7 +512,7 @@
     </w:p>
     <w:p>
       <w:pPr>
-        <w:pStyle w:val="ListNumber"/>
+        <w:pStyle w:val="Listaconnmeros"/>
         <w:numPr>
           <w:ilvl w:val="0"/>
           <w:numId w:val="0"/>
@@ -628,7 +628,7 @@
     <w:p/>
     <w:p>
       <w:pPr>
-        <w:pStyle w:val="ListNumber"/>
+        <w:pStyle w:val="Listaconnmeros"/>
         <w:numPr>
           <w:ilvl w:val="0"/>
           <w:numId w:val="0"/>
@@ -662,7 +662,7 @@
     </w:p>
     <w:p>
       <w:pPr>
-        <w:pStyle w:val="ListNumber"/>
+        <w:pStyle w:val="Listaconnmeros"/>
         <w:numPr>
           <w:ilvl w:val="0"/>
           <w:numId w:val="0"/>
@@ -676,7 +676,7 @@
     </w:p>
     <w:p>
       <w:pPr>
-        <w:pStyle w:val="ListNumber"/>
+        <w:pStyle w:val="Listaconnmeros"/>
         <w:numPr>
           <w:ilvl w:val="0"/>
           <w:numId w:val="0"/>
@@ -786,7 +786,7 @@
     </w:p>
     <w:p>
       <w:pPr>
-        <w:pStyle w:val="ListNumber"/>
+        <w:pStyle w:val="Listaconnmeros"/>
         <w:numPr>
           <w:ilvl w:val="0"/>
           <w:numId w:val="0"/>
@@ -1234,7 +1234,519 @@
     </w:p>
     <w:p>
       <w:pPr>
-        <w:pStyle w:val="ListNumber"/>
+        <w:rPr>
+          <w:b/>
+          <w:bCs/>
+        </w:rPr>
+      </w:pPr>
+    </w:p>
+    <w:tbl>
+      <w:tblPr>
+        <w:tblStyle w:val="Tablaconcuadrcula"/>
+        <w:tblW w:w="0" w:type="auto"/>
+        <w:tblLook w:val="04A0" w:firstRow="1" w:lastRow="0" w:firstColumn="1" w:lastColumn="0" w:noHBand="0" w:noVBand="1"/>
+      </w:tblPr>
+      <w:tblGrid>
+        <w:gridCol w:w="2157"/>
+        <w:gridCol w:w="2157"/>
+        <w:gridCol w:w="2158"/>
+        <w:gridCol w:w="2158"/>
+      </w:tblGrid>
+      <w:tr>
+        <w:tc>
+          <w:tcPr>
+            <w:tcW w:w="2157" w:type="dxa"/>
+          </w:tcPr>
+          <w:p>
+            <w:pPr>
+              <w:jc w:val="center"/>
+              <w:rPr>
+                <w:b/>
+                <w:bCs/>
+                <w:sz w:val="24"/>
+                <w:szCs w:val="24"/>
+              </w:rPr>
+            </w:pPr>
+            <w:r>
+              <w:rPr>
+                <w:b/>
+                <w:bCs/>
+                <w:sz w:val="24"/>
+                <w:szCs w:val="24"/>
+              </w:rPr>
+              <w:t>Symbols</w:t>
+            </w:r>
+          </w:p>
+        </w:tc>
+        <w:tc>
+          <w:tcPr>
+            <w:tcW w:w="2157" w:type="dxa"/>
+          </w:tcPr>
+          <w:p>
+            <w:pPr>
+              <w:jc w:val="center"/>
+              <w:rPr>
+                <w:b/>
+                <w:bCs/>
+                <w:sz w:val="24"/>
+                <w:szCs w:val="24"/>
+              </w:rPr>
+            </w:pPr>
+            <w:r>
+              <w:rPr>
+                <w:b/>
+                <w:bCs/>
+                <w:sz w:val="24"/>
+                <w:szCs w:val="24"/>
+              </w:rPr>
+              <w:t>PLC Adress</w:t>
+            </w:r>
+          </w:p>
+        </w:tc>
+        <w:tc>
+          <w:tcPr>
+            <w:tcW w:w="2158" w:type="dxa"/>
+          </w:tcPr>
+          <w:p>
+            <w:pPr>
+              <w:jc w:val="center"/>
+              <w:rPr>
+                <w:b/>
+                <w:bCs/>
+                <w:sz w:val="24"/>
+                <w:szCs w:val="24"/>
+              </w:rPr>
+            </w:pPr>
+            <w:r>
+              <w:rPr>
+                <w:b/>
+                <w:bCs/>
+                <w:sz w:val="24"/>
+                <w:szCs w:val="24"/>
+              </w:rPr>
+              <w:t>I/O</w:t>
+            </w:r>
+          </w:p>
+        </w:tc>
+        <w:tc>
+          <w:tcPr>
+            <w:tcW w:w="2158" w:type="dxa"/>
+          </w:tcPr>
+          <w:p>
+            <w:pPr>
+              <w:jc w:val="center"/>
+              <w:rPr>
+                <w:b/>
+                <w:bCs/>
+                <w:sz w:val="24"/>
+                <w:szCs w:val="24"/>
+              </w:rPr>
+            </w:pPr>
+            <w:r>
+              <w:rPr>
+                <w:b/>
+                <w:bCs/>
+                <w:sz w:val="24"/>
+                <w:szCs w:val="24"/>
+              </w:rPr>
+              <w:t>Description</w:t>
+            </w:r>
+          </w:p>
+        </w:tc>
+      </w:tr>
+      <w:tr>
+        <w:tc>
+          <w:tcPr>
+            <w:tcW w:w="2157" w:type="dxa"/>
+          </w:tcPr>
+          <w:p>
+            <w:pPr>
+              <w:jc w:val="center"/>
+            </w:pPr>
+            <w:r>
+              <w:t>S1</w:t>
+            </w:r>
+          </w:p>
+        </w:tc>
+        <w:tc>
+          <w:tcPr>
+            <w:tcW w:w="2157" w:type="dxa"/>
+          </w:tcPr>
+          <w:p>
+            <w:pPr>
+              <w:jc w:val="center"/>
+            </w:pPr>
+            <w:r>
+              <w:t>X0</w:t>
+            </w:r>
+          </w:p>
+        </w:tc>
+        <w:tc>
+          <w:tcPr>
+            <w:tcW w:w="2158" w:type="dxa"/>
+          </w:tcPr>
+          <w:p>
+            <w:pPr>
+              <w:jc w:val="center"/>
+            </w:pPr>
+            <w:r>
+              <w:t>Input</w:t>
+            </w:r>
+          </w:p>
+        </w:tc>
+        <w:tc>
+          <w:tcPr>
+            <w:tcW w:w="2158" w:type="dxa"/>
+          </w:tcPr>
+          <w:p>
+            <w:pPr>
+              <w:jc w:val="center"/>
+            </w:pPr>
+            <w:r>
+              <w:t>Pedestrian push button 1</w:t>
+            </w:r>
+          </w:p>
+        </w:tc>
+      </w:tr>
+      <w:tr>
+        <w:tc>
+          <w:tcPr>
+            <w:tcW w:w="2157" w:type="dxa"/>
+          </w:tcPr>
+          <w:p>
+            <w:pPr>
+              <w:jc w:val="center"/>
+            </w:pPr>
+            <w:r>
+              <w:t>S2</w:t>
+            </w:r>
+          </w:p>
+        </w:tc>
+        <w:tc>
+          <w:tcPr>
+            <w:tcW w:w="2157" w:type="dxa"/>
+          </w:tcPr>
+          <w:p>
+            <w:pPr>
+              <w:jc w:val="center"/>
+            </w:pPr>
+            <w:r>
+              <w:t>X1</w:t>
+            </w:r>
+          </w:p>
+        </w:tc>
+        <w:tc>
+          <w:tcPr>
+            <w:tcW w:w="2158" w:type="dxa"/>
+          </w:tcPr>
+          <w:p>
+            <w:pPr>
+              <w:jc w:val="center"/>
+            </w:pPr>
+            <w:r>
+              <w:t xml:space="preserve">Input </w:t>
+            </w:r>
+          </w:p>
+        </w:tc>
+        <w:tc>
+          <w:tcPr>
+            <w:tcW w:w="2158" w:type="dxa"/>
+          </w:tcPr>
+          <w:p>
+            <w:pPr>
+              <w:jc w:val="center"/>
+            </w:pPr>
+            <w:r>
+              <w:t>Pedestrian push button 2</w:t>
+            </w:r>
+          </w:p>
+        </w:tc>
+      </w:tr>
+      <w:tr>
+        <w:tc>
+          <w:tcPr>
+            <w:tcW w:w="2157" w:type="dxa"/>
+          </w:tcPr>
+          <w:p>
+            <w:pPr>
+              <w:jc w:val="center"/>
+            </w:pPr>
+            <w:r>
+              <w:t>P1</w:t>
+            </w:r>
+          </w:p>
+        </w:tc>
+        <w:tc>
+          <w:tcPr>
+            <w:tcW w:w="2157" w:type="dxa"/>
+          </w:tcPr>
+          <w:p>
+            <w:pPr>
+              <w:jc w:val="center"/>
+            </w:pPr>
+            <w:r>
+              <w:t>Y0</w:t>
+            </w:r>
+          </w:p>
+        </w:tc>
+        <w:tc>
+          <w:tcPr>
+            <w:tcW w:w="2158" w:type="dxa"/>
+          </w:tcPr>
+          <w:p>
+            <w:pPr>
+              <w:jc w:val="center"/>
+            </w:pPr>
+            <w:r>
+              <w:t>Output</w:t>
+            </w:r>
+          </w:p>
+        </w:tc>
+        <w:tc>
+          <w:tcPr>
+            <w:tcW w:w="2158" w:type="dxa"/>
+          </w:tcPr>
+          <w:p>
+            <w:pPr>
+              <w:jc w:val="center"/>
+            </w:pPr>
+            <w:r>
+              <w:t>Red</w:t>
+            </w:r>
+            <w:r>
+              <w:t xml:space="preserve"> Light</w:t>
+            </w:r>
+          </w:p>
+        </w:tc>
+      </w:tr>
+      <w:tr>
+        <w:tc>
+          <w:tcPr>
+            <w:tcW w:w="2157" w:type="dxa"/>
+          </w:tcPr>
+          <w:p>
+            <w:pPr>
+              <w:jc w:val="center"/>
+            </w:pPr>
+            <w:r>
+              <w:t>P2</w:t>
+            </w:r>
+          </w:p>
+        </w:tc>
+        <w:tc>
+          <w:tcPr>
+            <w:tcW w:w="2157" w:type="dxa"/>
+          </w:tcPr>
+          <w:p>
+            <w:pPr>
+              <w:jc w:val="center"/>
+            </w:pPr>
+            <w:r>
+              <w:t>Y1</w:t>
+            </w:r>
+          </w:p>
+        </w:tc>
+        <w:tc>
+          <w:tcPr>
+            <w:tcW w:w="2158" w:type="dxa"/>
+          </w:tcPr>
+          <w:p>
+            <w:pPr>
+              <w:jc w:val="center"/>
+            </w:pPr>
+            <w:r>
+              <w:t>Output</w:t>
+            </w:r>
+          </w:p>
+        </w:tc>
+        <w:tc>
+          <w:tcPr>
+            <w:tcW w:w="2158" w:type="dxa"/>
+          </w:tcPr>
+          <w:p>
+            <w:pPr>
+              <w:jc w:val="center"/>
+            </w:pPr>
+            <w:r>
+              <w:t>Amber Light</w:t>
+            </w:r>
+          </w:p>
+        </w:tc>
+      </w:tr>
+      <w:tr>
+        <w:tc>
+          <w:tcPr>
+            <w:tcW w:w="2157" w:type="dxa"/>
+          </w:tcPr>
+          <w:p>
+            <w:pPr>
+              <w:jc w:val="center"/>
+            </w:pPr>
+            <w:r>
+              <w:t xml:space="preserve">P3 </w:t>
+            </w:r>
+          </w:p>
+        </w:tc>
+        <w:tc>
+          <w:tcPr>
+            <w:tcW w:w="2157" w:type="dxa"/>
+          </w:tcPr>
+          <w:p>
+            <w:pPr>
+              <w:jc w:val="center"/>
+            </w:pPr>
+            <w:r>
+              <w:t>Y2</w:t>
+            </w:r>
+          </w:p>
+        </w:tc>
+        <w:tc>
+          <w:tcPr>
+            <w:tcW w:w="2158" w:type="dxa"/>
+          </w:tcPr>
+          <w:p>
+            <w:pPr>
+              <w:jc w:val="center"/>
+            </w:pPr>
+            <w:r>
+              <w:t>Output</w:t>
+            </w:r>
+          </w:p>
+        </w:tc>
+        <w:tc>
+          <w:tcPr>
+            <w:tcW w:w="2158" w:type="dxa"/>
+          </w:tcPr>
+          <w:p>
+            <w:pPr>
+              <w:jc w:val="center"/>
+            </w:pPr>
+            <w:r>
+              <w:t>Green Light</w:t>
+            </w:r>
+          </w:p>
+        </w:tc>
+      </w:tr>
+      <w:tr>
+        <w:tc>
+          <w:tcPr>
+            <w:tcW w:w="2157" w:type="dxa"/>
+          </w:tcPr>
+          <w:p>
+            <w:pPr>
+              <w:jc w:val="center"/>
+            </w:pPr>
+            <w:r>
+              <w:t>P4</w:t>
+            </w:r>
+          </w:p>
+        </w:tc>
+        <w:tc>
+          <w:tcPr>
+            <w:tcW w:w="2157" w:type="dxa"/>
+          </w:tcPr>
+          <w:p>
+            <w:pPr>
+              <w:jc w:val="center"/>
+            </w:pPr>
+            <w:r>
+              <w:t>Y3</w:t>
+            </w:r>
+          </w:p>
+        </w:tc>
+        <w:tc>
+          <w:tcPr>
+            <w:tcW w:w="2158" w:type="dxa"/>
+          </w:tcPr>
+          <w:p>
+            <w:pPr>
+              <w:jc w:val="center"/>
+            </w:pPr>
+            <w:r>
+              <w:t>Output</w:t>
+            </w:r>
+          </w:p>
+        </w:tc>
+        <w:tc>
+          <w:tcPr>
+            <w:tcW w:w="2158" w:type="dxa"/>
+          </w:tcPr>
+          <w:p>
+            <w:pPr>
+              <w:jc w:val="center"/>
+            </w:pPr>
+            <w:r>
+              <w:t>Pedestrian Red Light</w:t>
+            </w:r>
+          </w:p>
+        </w:tc>
+      </w:tr>
+      <w:tr>
+        <w:tc>
+          <w:tcPr>
+            <w:tcW w:w="2157" w:type="dxa"/>
+          </w:tcPr>
+          <w:p>
+            <w:pPr>
+              <w:jc w:val="center"/>
+            </w:pPr>
+            <w:r>
+              <w:t xml:space="preserve">P5 </w:t>
+            </w:r>
+          </w:p>
+        </w:tc>
+        <w:tc>
+          <w:tcPr>
+            <w:tcW w:w="2157" w:type="dxa"/>
+          </w:tcPr>
+          <w:p>
+            <w:pPr>
+              <w:jc w:val="center"/>
+            </w:pPr>
+            <w:r>
+              <w:t>Y4</w:t>
+            </w:r>
+          </w:p>
+        </w:tc>
+        <w:tc>
+          <w:tcPr>
+            <w:tcW w:w="2158" w:type="dxa"/>
+          </w:tcPr>
+          <w:p>
+            <w:pPr>
+              <w:jc w:val="center"/>
+            </w:pPr>
+            <w:r>
+              <w:t>Output</w:t>
+            </w:r>
+          </w:p>
+        </w:tc>
+        <w:tc>
+          <w:tcPr>
+            <w:tcW w:w="2158" w:type="dxa"/>
+          </w:tcPr>
+          <w:p>
+            <w:pPr>
+              <w:jc w:val="center"/>
+            </w:pPr>
+            <w:r>
+              <w:t>Pedestrian Green Light</w:t>
+            </w:r>
+          </w:p>
+        </w:tc>
+      </w:tr>
+    </w:tbl>
+    <w:p>
+      <w:pPr>
+        <w:rPr>
+          <w:b/>
+          <w:bCs/>
+        </w:rPr>
+      </w:pPr>
+    </w:p>
+    <w:p>
+      <w:pPr>
+        <w:pStyle w:val="Listaconnmeros"/>
         <w:numPr>
           <w:ilvl w:val="0"/>
           <w:numId w:val="0"/>
@@ -1341,7 +1853,7 @@
 <w:hdr xmlns:wpc="http://schemas.microsoft.com/office/word/2010/wordprocessingCanvas" xmlns:cx="http://schemas.microsoft.com/office/drawing/2014/chartex" xmlns:cx1="http://schemas.microsoft.com/office/drawing/2015/9/8/chartex" xmlns:cx2="http://schemas.microsoft.com/office/drawing/2015/10/21/chartex" xmlns:cx3="http://schemas.microsoft.com/office/drawing/2016/5/9/chartex" xmlns:cx4="http://schemas.microsoft.com/office/drawing/2016/5/10/chartex" xmlns:cx5="http://schemas.microsoft.com/office/drawing/2016/5/11/chartex" xmlns:cx6="http://schemas.microsoft.com/office/drawing/2016/5/12/chartex" xmlns:cx7="http://schemas.microsoft.com/office/drawing/2016/5/13/chartex" xmlns:cx8="http://schemas.microsoft.com/office/drawing/2016/5/14/chartex" xmlns:mc="http://schemas.openxmlformats.org/markup-compatibility/2006" xmlns:aink="http://schemas.microsoft.com/office/drawing/2016/ink" xmlns:am3d="http://schemas.microsoft.com/office/drawing/2017/model3d" xmlns:o="urn:schemas-microsoft-com:office:office" xmlns:oel="http://schemas.microsoft.com/office/2019/extlst" xmlns:r="http://schemas.openxmlformats.org/officeDocument/2006/relationships" xmlns:m="http://schemas.openxmlformats.org/officeDocument/2006/math" xmlns:v="urn:schemas-microsoft-com:vml" xmlns:wp14="http://schemas.microsoft.com/office/word/2010/wordprocessingDrawing" xmlns:wp="http://schemas.openxmlformats.org/drawingml/2006/wordprocessingDrawing" xmlns:w10="urn:schemas-microsoft-com:office:word" xmlns:w="http://schemas.openxmlformats.org/wordprocessingml/2006/main" xmlns:w14="http://schemas.microsoft.com/office/word/2010/wordml" xmlns:w15="http://schemas.microsoft.com/office/word/2012/wordml" xmlns:w16cex="http://schemas.microsoft.com/office/word/2018/wordml/cex" xmlns:w16cid="http://schemas.microsoft.com/office/word/2016/wordml/cid" xmlns:w16="http://schemas.microsoft.com/office/word/2018/wordml" xmlns:w16du="http://schemas.microsoft.com/office/word/2023/wordml/word16du" xmlns:w16sdtdh="http://schemas.microsoft.com/office/word/2020/wordml/sdtdatahash" xmlns:w16sdtfl="http://schemas.microsoft.com/office/word/2024/wordml/sdtformatlock" xmlns:w16se="http://schemas.microsoft.com/office/word/2015/wordml/symex" xmlns:wpg="http://schemas.microsoft.com/office/word/2010/wordprocessingGroup" xmlns:wpi="http://schemas.microsoft.com/office/word/2010/wordprocessingInk" xmlns:wne="http://schemas.microsoft.com/office/word/2006/wordml" xmlns:wps="http://schemas.microsoft.com/office/word/2010/wordprocessingShape" mc:Ignorable="w14 w15 w16se w16cid w16 w16cex w16sdtdh w16sdtfl w16du wp14">
   <w:p>
     <w:pPr>
-      <w:pStyle w:val="Header"/>
+      <w:pStyle w:val="Encabezado"/>
     </w:pPr>
   </w:p>
 </w:hdr>
@@ -1390,7 +1902,7 @@
     <w:lvl w:ilvl="0">
       <w:start w:val="1"/>
       <w:numFmt w:val="decimal"/>
-      <w:pStyle w:val="ListNumber3"/>
+      <w:pStyle w:val="Listaconnmeros3"/>
       <w:lvlText w:val="%1."/>
       <w:lvlJc w:val="left"/>
       <w:pPr>
@@ -1408,7 +1920,7 @@
     <w:lvl w:ilvl="0">
       <w:start w:val="1"/>
       <w:numFmt w:val="decimal"/>
-      <w:pStyle w:val="ListNumber2"/>
+      <w:pStyle w:val="Listaconnmeros2"/>
       <w:lvlText w:val="%1."/>
       <w:lvlJc w:val="left"/>
       <w:pPr>
@@ -1446,7 +1958,7 @@
     <w:lvl w:ilvl="0">
       <w:start w:val="1"/>
       <w:numFmt w:val="bullet"/>
-      <w:pStyle w:val="ListBullet3"/>
+      <w:pStyle w:val="Listaconvietas3"/>
       <w:lvlText w:val=""/>
       <w:lvlJc w:val="left"/>
       <w:pPr>
@@ -1467,7 +1979,7 @@
     <w:lvl w:ilvl="0">
       <w:start w:val="1"/>
       <w:numFmt w:val="bullet"/>
-      <w:pStyle w:val="ListBullet2"/>
+      <w:pStyle w:val="Listaconvietas2"/>
       <w:lvlText w:val=""/>
       <w:lvlJc w:val="left"/>
       <w:pPr>
@@ -1488,7 +2000,7 @@
     <w:lvl w:ilvl="0">
       <w:start w:val="1"/>
       <w:numFmt w:val="decimal"/>
-      <w:pStyle w:val="ListNumber"/>
+      <w:pStyle w:val="Listaconnmeros"/>
       <w:lvlText w:val="%1."/>
       <w:lvlJc w:val="left"/>
       <w:pPr>
@@ -1506,7 +2018,7 @@
     <w:lvl w:ilvl="0">
       <w:start w:val="1"/>
       <w:numFmt w:val="bullet"/>
-      <w:pStyle w:val="ListBullet"/>
+      <w:pStyle w:val="Listaconvietas"/>
       <w:lvlText w:val=""/>
       <w:lvlJc w:val="left"/>
       <w:pPr>
@@ -3009,11 +3521,11 @@
     <w:qFormat/>
     <w:rsid w:val="00B54E14"/>
   </w:style>
-  <w:style w:type="paragraph" w:styleId="Heading1">
+  <w:style w:type="paragraph" w:styleId="Ttulo1">
     <w:name w:val="heading 1"/>
     <w:basedOn w:val="Normal"/>
     <w:next w:val="Normal"/>
-    <w:link w:val="Heading1Char"/>
+    <w:link w:val="Ttulo1Car"/>
     <w:uiPriority w:val="9"/>
     <w:qFormat/>
     <w:rsid w:val="00FC693F"/>
@@ -3032,11 +3544,11 @@
       <w:szCs w:val="28"/>
     </w:rPr>
   </w:style>
-  <w:style w:type="paragraph" w:styleId="Heading2">
+  <w:style w:type="paragraph" w:styleId="Ttulo2">
     <w:name w:val="heading 2"/>
     <w:basedOn w:val="Normal"/>
     <w:next w:val="Normal"/>
-    <w:link w:val="Heading2Char"/>
+    <w:link w:val="Ttulo2Car"/>
     <w:uiPriority w:val="9"/>
     <w:unhideWhenUsed/>
     <w:qFormat/>
@@ -3056,11 +3568,11 @@
       <w:szCs w:val="26"/>
     </w:rPr>
   </w:style>
-  <w:style w:type="paragraph" w:styleId="Heading3">
+  <w:style w:type="paragraph" w:styleId="Ttulo3">
     <w:name w:val="heading 3"/>
     <w:basedOn w:val="Normal"/>
     <w:next w:val="Normal"/>
-    <w:link w:val="Heading3Char"/>
+    <w:link w:val="Ttulo3Car"/>
     <w:uiPriority w:val="9"/>
     <w:unhideWhenUsed/>
     <w:qFormat/>
@@ -3078,11 +3590,11 @@
       <w:color w:val="4F81BD" w:themeColor="accent1"/>
     </w:rPr>
   </w:style>
-  <w:style w:type="paragraph" w:styleId="Heading4">
+  <w:style w:type="paragraph" w:styleId="Ttulo4">
     <w:name w:val="heading 4"/>
     <w:basedOn w:val="Normal"/>
     <w:next w:val="Normal"/>
-    <w:link w:val="Heading4Char"/>
+    <w:link w:val="Ttulo4Car"/>
     <w:uiPriority w:val="9"/>
     <w:semiHidden/>
     <w:unhideWhenUsed/>
@@ -3103,11 +3615,11 @@
       <w:color w:val="4F81BD" w:themeColor="accent1"/>
     </w:rPr>
   </w:style>
-  <w:style w:type="paragraph" w:styleId="Heading5">
+  <w:style w:type="paragraph" w:styleId="Ttulo5">
     <w:name w:val="heading 5"/>
     <w:basedOn w:val="Normal"/>
     <w:next w:val="Normal"/>
-    <w:link w:val="Heading5Char"/>
+    <w:link w:val="Ttulo5Car"/>
     <w:uiPriority w:val="9"/>
     <w:semiHidden/>
     <w:unhideWhenUsed/>
@@ -3124,11 +3636,11 @@
       <w:color w:val="243F60" w:themeColor="accent1" w:themeShade="7F"/>
     </w:rPr>
   </w:style>
-  <w:style w:type="paragraph" w:styleId="Heading6">
+  <w:style w:type="paragraph" w:styleId="Ttulo6">
     <w:name w:val="heading 6"/>
     <w:basedOn w:val="Normal"/>
     <w:next w:val="Normal"/>
-    <w:link w:val="Heading6Char"/>
+    <w:link w:val="Ttulo6Car"/>
     <w:uiPriority w:val="9"/>
     <w:semiHidden/>
     <w:unhideWhenUsed/>
@@ -3147,11 +3659,11 @@
       <w:color w:val="243F60" w:themeColor="accent1" w:themeShade="7F"/>
     </w:rPr>
   </w:style>
-  <w:style w:type="paragraph" w:styleId="Heading7">
+  <w:style w:type="paragraph" w:styleId="Ttulo7">
     <w:name w:val="heading 7"/>
     <w:basedOn w:val="Normal"/>
     <w:next w:val="Normal"/>
-    <w:link w:val="Heading7Char"/>
+    <w:link w:val="Ttulo7Car"/>
     <w:uiPriority w:val="9"/>
     <w:semiHidden/>
     <w:unhideWhenUsed/>
@@ -3170,11 +3682,11 @@
       <w:color w:val="404040" w:themeColor="text1" w:themeTint="BF"/>
     </w:rPr>
   </w:style>
-  <w:style w:type="paragraph" w:styleId="Heading8">
+  <w:style w:type="paragraph" w:styleId="Ttulo8">
     <w:name w:val="heading 8"/>
     <w:basedOn w:val="Normal"/>
     <w:next w:val="Normal"/>
-    <w:link w:val="Heading8Char"/>
+    <w:link w:val="Ttulo8Car"/>
     <w:uiPriority w:val="9"/>
     <w:semiHidden/>
     <w:unhideWhenUsed/>
@@ -3193,11 +3705,11 @@
       <w:szCs w:val="20"/>
     </w:rPr>
   </w:style>
-  <w:style w:type="paragraph" w:styleId="Heading9">
+  <w:style w:type="paragraph" w:styleId="Ttulo9">
     <w:name w:val="heading 9"/>
     <w:basedOn w:val="Normal"/>
     <w:next w:val="Normal"/>
-    <w:link w:val="Heading9Char"/>
+    <w:link w:val="Ttulo9Car"/>
     <w:uiPriority w:val="9"/>
     <w:semiHidden/>
     <w:unhideWhenUsed/>
@@ -3218,13 +3730,13 @@
       <w:szCs w:val="20"/>
     </w:rPr>
   </w:style>
-  <w:style w:type="character" w:default="1" w:styleId="DefaultParagraphFont">
+  <w:style w:type="character" w:default="1" w:styleId="Fuentedeprrafopredeter">
     <w:name w:val="Default Paragraph Font"/>
     <w:uiPriority w:val="1"/>
     <w:semiHidden/>
     <w:unhideWhenUsed/>
   </w:style>
-  <w:style w:type="table" w:default="1" w:styleId="TableNormal">
+  <w:style w:type="table" w:default="1" w:styleId="Tablanormal">
     <w:name w:val="Normal Table"/>
     <w:uiPriority w:val="99"/>
     <w:semiHidden/>
@@ -3239,16 +3751,16 @@
       </w:tblCellMar>
     </w:tblPr>
   </w:style>
-  <w:style w:type="numbering" w:default="1" w:styleId="NoList">
+  <w:style w:type="numbering" w:default="1" w:styleId="Sinlista">
     <w:name w:val="No List"/>
     <w:uiPriority w:val="99"/>
     <w:semiHidden/>
     <w:unhideWhenUsed/>
   </w:style>
-  <w:style w:type="paragraph" w:styleId="Header">
+  <w:style w:type="paragraph" w:styleId="Encabezado">
     <w:name w:val="header"/>
     <w:basedOn w:val="Normal"/>
-    <w:link w:val="HeaderChar"/>
+    <w:link w:val="EncabezadoCar"/>
     <w:uiPriority w:val="99"/>
     <w:unhideWhenUsed/>
     <w:rsid w:val="00E618BF"/>
@@ -3260,17 +3772,17 @@
       <w:spacing w:after="0" w:line="240" w:lineRule="auto"/>
     </w:pPr>
   </w:style>
-  <w:style w:type="character" w:customStyle="1" w:styleId="HeaderChar">
-    <w:name w:val="Header Char"/>
-    <w:basedOn w:val="DefaultParagraphFont"/>
-    <w:link w:val="Header"/>
+  <w:style w:type="character" w:customStyle="1" w:styleId="EncabezadoCar">
+    <w:name w:val="Encabezado Car"/>
+    <w:basedOn w:val="Fuentedeprrafopredeter"/>
+    <w:link w:val="Encabezado"/>
     <w:uiPriority w:val="99"/>
     <w:rsid w:val="00E618BF"/>
   </w:style>
-  <w:style w:type="paragraph" w:styleId="Footer">
+  <w:style w:type="paragraph" w:styleId="Piedepgina">
     <w:name w:val="footer"/>
     <w:basedOn w:val="Normal"/>
-    <w:link w:val="FooterChar"/>
+    <w:link w:val="PiedepginaCar"/>
     <w:uiPriority w:val="99"/>
     <w:unhideWhenUsed/>
     <w:rsid w:val="00E618BF"/>
@@ -3282,14 +3794,14 @@
       <w:spacing w:after="0" w:line="240" w:lineRule="auto"/>
     </w:pPr>
   </w:style>
-  <w:style w:type="character" w:customStyle="1" w:styleId="FooterChar">
-    <w:name w:val="Footer Char"/>
-    <w:basedOn w:val="DefaultParagraphFont"/>
-    <w:link w:val="Footer"/>
+  <w:style w:type="character" w:customStyle="1" w:styleId="PiedepginaCar">
+    <w:name w:val="Pie de página Car"/>
+    <w:basedOn w:val="Fuentedeprrafopredeter"/>
+    <w:link w:val="Piedepgina"/>
     <w:uiPriority w:val="99"/>
     <w:rsid w:val="00E618BF"/>
   </w:style>
-  <w:style w:type="paragraph" w:styleId="NoSpacing">
+  <w:style w:type="paragraph" w:styleId="Sinespaciado">
     <w:name w:val="No Spacing"/>
     <w:uiPriority w:val="1"/>
     <w:qFormat/>
@@ -3298,10 +3810,10 @@
       <w:spacing w:after="0" w:line="240" w:lineRule="auto"/>
     </w:pPr>
   </w:style>
-  <w:style w:type="character" w:customStyle="1" w:styleId="Heading1Char">
-    <w:name w:val="Heading 1 Char"/>
-    <w:basedOn w:val="DefaultParagraphFont"/>
-    <w:link w:val="Heading1"/>
+  <w:style w:type="character" w:customStyle="1" w:styleId="Ttulo1Car">
+    <w:name w:val="Título 1 Car"/>
+    <w:basedOn w:val="Fuentedeprrafopredeter"/>
+    <w:link w:val="Ttulo1"/>
     <w:uiPriority w:val="9"/>
     <w:rsid w:val="00FC693F"/>
     <w:rPr>
@@ -3313,10 +3825,10 @@
       <w:szCs w:val="28"/>
     </w:rPr>
   </w:style>
-  <w:style w:type="character" w:customStyle="1" w:styleId="Heading2Char">
-    <w:name w:val="Heading 2 Char"/>
-    <w:basedOn w:val="DefaultParagraphFont"/>
-    <w:link w:val="Heading2"/>
+  <w:style w:type="character" w:customStyle="1" w:styleId="Ttulo2Car">
+    <w:name w:val="Título 2 Car"/>
+    <w:basedOn w:val="Fuentedeprrafopredeter"/>
+    <w:link w:val="Ttulo2"/>
     <w:uiPriority w:val="9"/>
     <w:rsid w:val="00FC693F"/>
     <w:rPr>
@@ -3328,10 +3840,10 @@
       <w:szCs w:val="26"/>
     </w:rPr>
   </w:style>
-  <w:style w:type="character" w:customStyle="1" w:styleId="Heading3Char">
-    <w:name w:val="Heading 3 Char"/>
-    <w:basedOn w:val="DefaultParagraphFont"/>
-    <w:link w:val="Heading3"/>
+  <w:style w:type="character" w:customStyle="1" w:styleId="Ttulo3Car">
+    <w:name w:val="Título 3 Car"/>
+    <w:basedOn w:val="Fuentedeprrafopredeter"/>
+    <w:link w:val="Ttulo3"/>
     <w:uiPriority w:val="9"/>
     <w:rsid w:val="00FC693F"/>
     <w:rPr>
@@ -3341,11 +3853,11 @@
       <w:color w:val="4F81BD" w:themeColor="accent1"/>
     </w:rPr>
   </w:style>
-  <w:style w:type="paragraph" w:styleId="Title">
+  <w:style w:type="paragraph" w:styleId="Ttulo">
     <w:name w:val="Title"/>
     <w:basedOn w:val="Normal"/>
     <w:next w:val="Normal"/>
-    <w:link w:val="TitleChar"/>
+    <w:link w:val="TtuloCar"/>
     <w:uiPriority w:val="10"/>
     <w:qFormat/>
     <w:rsid w:val="00FC693F"/>
@@ -3365,10 +3877,10 @@
       <w:szCs w:val="52"/>
     </w:rPr>
   </w:style>
-  <w:style w:type="character" w:customStyle="1" w:styleId="TitleChar">
-    <w:name w:val="Title Char"/>
-    <w:basedOn w:val="DefaultParagraphFont"/>
-    <w:link w:val="Title"/>
+  <w:style w:type="character" w:customStyle="1" w:styleId="TtuloCar">
+    <w:name w:val="Título Car"/>
+    <w:basedOn w:val="Fuentedeprrafopredeter"/>
+    <w:link w:val="Ttulo"/>
     <w:uiPriority w:val="10"/>
     <w:rsid w:val="00FC693F"/>
     <w:rPr>
@@ -3380,11 +3892,11 @@
       <w:szCs w:val="52"/>
     </w:rPr>
   </w:style>
-  <w:style w:type="paragraph" w:styleId="Subtitle">
+  <w:style w:type="paragraph" w:styleId="Subttulo">
     <w:name w:val="Subtitle"/>
     <w:basedOn w:val="Normal"/>
     <w:next w:val="Normal"/>
-    <w:link w:val="SubtitleChar"/>
+    <w:link w:val="SubttuloCar"/>
     <w:uiPriority w:val="11"/>
     <w:qFormat/>
     <w:rsid w:val="00FC693F"/>
@@ -3403,10 +3915,10 @@
       <w:szCs w:val="24"/>
     </w:rPr>
   </w:style>
-  <w:style w:type="character" w:customStyle="1" w:styleId="SubtitleChar">
-    <w:name w:val="Subtitle Char"/>
-    <w:basedOn w:val="DefaultParagraphFont"/>
-    <w:link w:val="Subtitle"/>
+  <w:style w:type="character" w:customStyle="1" w:styleId="SubttuloCar">
+    <w:name w:val="Subtítulo Car"/>
+    <w:basedOn w:val="Fuentedeprrafopredeter"/>
+    <w:link w:val="Subttulo"/>
     <w:uiPriority w:val="11"/>
     <w:rsid w:val="00FC693F"/>
     <w:rPr>
@@ -3419,7 +3931,7 @@
       <w:szCs w:val="24"/>
     </w:rPr>
   </w:style>
-  <w:style w:type="paragraph" w:styleId="ListParagraph">
+  <w:style w:type="paragraph" w:styleId="Prrafodelista">
     <w:name w:val="List Paragraph"/>
     <w:basedOn w:val="Normal"/>
     <w:uiPriority w:val="34"/>
@@ -3430,10 +3942,10 @@
       <w:contextualSpacing/>
     </w:pPr>
   </w:style>
-  <w:style w:type="paragraph" w:styleId="BodyText">
+  <w:style w:type="paragraph" w:styleId="Textoindependiente">
     <w:name w:val="Body Text"/>
     <w:basedOn w:val="Normal"/>
-    <w:link w:val="BodyTextChar"/>
+    <w:link w:val="TextoindependienteCar"/>
     <w:uiPriority w:val="99"/>
     <w:unhideWhenUsed/>
     <w:rsid w:val="00AA1D8D"/>
@@ -3441,17 +3953,17 @@
       <w:spacing w:after="120"/>
     </w:pPr>
   </w:style>
-  <w:style w:type="character" w:customStyle="1" w:styleId="BodyTextChar">
-    <w:name w:val="Body Text Char"/>
-    <w:basedOn w:val="DefaultParagraphFont"/>
-    <w:link w:val="BodyText"/>
+  <w:style w:type="character" w:customStyle="1" w:styleId="TextoindependienteCar">
+    <w:name w:val="Texto independiente Car"/>
+    <w:basedOn w:val="Fuentedeprrafopredeter"/>
+    <w:link w:val="Textoindependiente"/>
     <w:uiPriority w:val="99"/>
     <w:rsid w:val="00AA1D8D"/>
   </w:style>
-  <w:style w:type="paragraph" w:styleId="BodyText2">
+  <w:style w:type="paragraph" w:styleId="Textoindependiente2">
     <w:name w:val="Body Text 2"/>
     <w:basedOn w:val="Normal"/>
-    <w:link w:val="BodyText2Char"/>
+    <w:link w:val="Textoindependiente2Car"/>
     <w:uiPriority w:val="99"/>
     <w:unhideWhenUsed/>
     <w:rsid w:val="00AA1D8D"/>
@@ -3459,17 +3971,17 @@
       <w:spacing w:after="120" w:line="480" w:lineRule="auto"/>
     </w:pPr>
   </w:style>
-  <w:style w:type="character" w:customStyle="1" w:styleId="BodyText2Char">
-    <w:name w:val="Body Text 2 Char"/>
-    <w:basedOn w:val="DefaultParagraphFont"/>
-    <w:link w:val="BodyText2"/>
+  <w:style w:type="character" w:customStyle="1" w:styleId="Textoindependiente2Car">
+    <w:name w:val="Texto independiente 2 Car"/>
+    <w:basedOn w:val="Fuentedeprrafopredeter"/>
+    <w:link w:val="Textoindependiente2"/>
     <w:uiPriority w:val="99"/>
     <w:rsid w:val="00AA1D8D"/>
   </w:style>
-  <w:style w:type="paragraph" w:styleId="BodyText3">
+  <w:style w:type="paragraph" w:styleId="Textoindependiente3">
     <w:name w:val="Body Text 3"/>
     <w:basedOn w:val="Normal"/>
-    <w:link w:val="BodyText3Char"/>
+    <w:link w:val="Textoindependiente3Car"/>
     <w:uiPriority w:val="99"/>
     <w:unhideWhenUsed/>
     <w:rsid w:val="00AA1D8D"/>
@@ -3481,10 +3993,10 @@
       <w:szCs w:val="16"/>
     </w:rPr>
   </w:style>
-  <w:style w:type="character" w:customStyle="1" w:styleId="BodyText3Char">
-    <w:name w:val="Body Text 3 Char"/>
-    <w:basedOn w:val="DefaultParagraphFont"/>
-    <w:link w:val="BodyText3"/>
+  <w:style w:type="character" w:customStyle="1" w:styleId="Textoindependiente3Car">
+    <w:name w:val="Texto independiente 3 Car"/>
+    <w:basedOn w:val="Fuentedeprrafopredeter"/>
+    <w:link w:val="Textoindependiente3"/>
     <w:uiPriority w:val="99"/>
     <w:rsid w:val="00AA1D8D"/>
     <w:rPr>
@@ -3492,7 +4004,7 @@
       <w:szCs w:val="16"/>
     </w:rPr>
   </w:style>
-  <w:style w:type="paragraph" w:styleId="List">
+  <w:style w:type="paragraph" w:styleId="Lista">
     <w:name w:val="List"/>
     <w:basedOn w:val="Normal"/>
     <w:uiPriority w:val="99"/>
@@ -3503,7 +4015,7 @@
       <w:contextualSpacing/>
     </w:pPr>
   </w:style>
-  <w:style w:type="paragraph" w:styleId="List2">
+  <w:style w:type="paragraph" w:styleId="Lista2">
     <w:name w:val="List 2"/>
     <w:basedOn w:val="Normal"/>
     <w:uiPriority w:val="99"/>
@@ -3514,7 +4026,7 @@
       <w:contextualSpacing/>
     </w:pPr>
   </w:style>
-  <w:style w:type="paragraph" w:styleId="List3">
+  <w:style w:type="paragraph" w:styleId="Lista3">
     <w:name w:val="List 3"/>
     <w:basedOn w:val="Normal"/>
     <w:uiPriority w:val="99"/>
@@ -3525,7 +4037,7 @@
       <w:contextualSpacing/>
     </w:pPr>
   </w:style>
-  <w:style w:type="paragraph" w:styleId="ListBullet">
+  <w:style w:type="paragraph" w:styleId="Listaconvietas">
     <w:name w:val="List Bullet"/>
     <w:basedOn w:val="Normal"/>
     <w:uiPriority w:val="99"/>
@@ -3538,7 +4050,7 @@
       <w:contextualSpacing/>
     </w:pPr>
   </w:style>
-  <w:style w:type="paragraph" w:styleId="ListBullet2">
+  <w:style w:type="paragraph" w:styleId="Listaconvietas2">
     <w:name w:val="List Bullet 2"/>
     <w:basedOn w:val="Normal"/>
     <w:uiPriority w:val="99"/>
@@ -3551,7 +4063,7 @@
       <w:contextualSpacing/>
     </w:pPr>
   </w:style>
-  <w:style w:type="paragraph" w:styleId="ListBullet3">
+  <w:style w:type="paragraph" w:styleId="Listaconvietas3">
     <w:name w:val="List Bullet 3"/>
     <w:basedOn w:val="Normal"/>
     <w:uiPriority w:val="99"/>
@@ -3564,7 +4076,7 @@
       <w:contextualSpacing/>
     </w:pPr>
   </w:style>
-  <w:style w:type="paragraph" w:styleId="ListNumber">
+  <w:style w:type="paragraph" w:styleId="Listaconnmeros">
     <w:name w:val="List Number"/>
     <w:basedOn w:val="Normal"/>
     <w:uiPriority w:val="99"/>
@@ -3577,7 +4089,7 @@
       <w:contextualSpacing/>
     </w:pPr>
   </w:style>
-  <w:style w:type="paragraph" w:styleId="ListNumber2">
+  <w:style w:type="paragraph" w:styleId="Listaconnmeros2">
     <w:name w:val="List Number 2"/>
     <w:basedOn w:val="Normal"/>
     <w:uiPriority w:val="99"/>
@@ -3590,7 +4102,7 @@
       <w:contextualSpacing/>
     </w:pPr>
   </w:style>
-  <w:style w:type="paragraph" w:styleId="ListNumber3">
+  <w:style w:type="paragraph" w:styleId="Listaconnmeros3">
     <w:name w:val="List Number 3"/>
     <w:basedOn w:val="Normal"/>
     <w:uiPriority w:val="99"/>
@@ -3603,7 +4115,7 @@
       <w:contextualSpacing/>
     </w:pPr>
   </w:style>
-  <w:style w:type="paragraph" w:styleId="ListContinue">
+  <w:style w:type="paragraph" w:styleId="Continuarlista">
     <w:name w:val="List Continue"/>
     <w:basedOn w:val="Normal"/>
     <w:uiPriority w:val="99"/>
@@ -3615,7 +4127,7 @@
       <w:contextualSpacing/>
     </w:pPr>
   </w:style>
-  <w:style w:type="paragraph" w:styleId="ListContinue2">
+  <w:style w:type="paragraph" w:styleId="Continuarlista2">
     <w:name w:val="List Continue 2"/>
     <w:basedOn w:val="Normal"/>
     <w:uiPriority w:val="99"/>
@@ -3627,7 +4139,7 @@
       <w:contextualSpacing/>
     </w:pPr>
   </w:style>
-  <w:style w:type="paragraph" w:styleId="ListContinue3">
+  <w:style w:type="paragraph" w:styleId="Continuarlista3">
     <w:name w:val="List Continue 3"/>
     <w:basedOn w:val="Normal"/>
     <w:uiPriority w:val="99"/>
@@ -3639,9 +4151,9 @@
       <w:contextualSpacing/>
     </w:pPr>
   </w:style>
-  <w:style w:type="paragraph" w:styleId="MacroText">
+  <w:style w:type="paragraph" w:styleId="Textomacro">
     <w:name w:val="macro"/>
-    <w:link w:val="MacroTextChar"/>
+    <w:link w:val="TextomacroCar"/>
     <w:uiPriority w:val="99"/>
     <w:unhideWhenUsed/>
     <w:rsid w:val="0029639D"/>
@@ -3662,10 +4174,10 @@
       <w:szCs w:val="20"/>
     </w:rPr>
   </w:style>
-  <w:style w:type="character" w:customStyle="1" w:styleId="MacroTextChar">
-    <w:name w:val="Macro Text Char"/>
-    <w:basedOn w:val="DefaultParagraphFont"/>
-    <w:link w:val="MacroText"/>
+  <w:style w:type="character" w:customStyle="1" w:styleId="TextomacroCar">
+    <w:name w:val="Texto macro Car"/>
+    <w:basedOn w:val="Fuentedeprrafopredeter"/>
+    <w:link w:val="Textomacro"/>
     <w:uiPriority w:val="99"/>
     <w:rsid w:val="0029639D"/>
     <w:rPr>
@@ -3674,11 +4186,11 @@
       <w:szCs w:val="20"/>
     </w:rPr>
   </w:style>
-  <w:style w:type="paragraph" w:styleId="Quote">
+  <w:style w:type="paragraph" w:styleId="Cita">
     <w:name w:val="Quote"/>
     <w:basedOn w:val="Normal"/>
     <w:next w:val="Normal"/>
-    <w:link w:val="QuoteChar"/>
+    <w:link w:val="CitaCar"/>
     <w:uiPriority w:val="29"/>
     <w:qFormat/>
     <w:rsid w:val="00FC693F"/>
@@ -3688,10 +4200,10 @@
       <w:color w:val="000000" w:themeColor="text1"/>
     </w:rPr>
   </w:style>
-  <w:style w:type="character" w:customStyle="1" w:styleId="QuoteChar">
-    <w:name w:val="Quote Char"/>
-    <w:basedOn w:val="DefaultParagraphFont"/>
-    <w:link w:val="Quote"/>
+  <w:style w:type="character" w:customStyle="1" w:styleId="CitaCar">
+    <w:name w:val="Cita Car"/>
+    <w:basedOn w:val="Fuentedeprrafopredeter"/>
+    <w:link w:val="Cita"/>
     <w:uiPriority w:val="29"/>
     <w:rsid w:val="00FC693F"/>
     <w:rPr>
@@ -3700,10 +4212,10 @@
       <w:color w:val="000000" w:themeColor="text1"/>
     </w:rPr>
   </w:style>
-  <w:style w:type="character" w:customStyle="1" w:styleId="Heading4Char">
-    <w:name w:val="Heading 4 Char"/>
-    <w:basedOn w:val="DefaultParagraphFont"/>
-    <w:link w:val="Heading4"/>
+  <w:style w:type="character" w:customStyle="1" w:styleId="Ttulo4Car">
+    <w:name w:val="Título 4 Car"/>
+    <w:basedOn w:val="Fuentedeprrafopredeter"/>
+    <w:link w:val="Ttulo4"/>
     <w:uiPriority w:val="9"/>
     <w:semiHidden/>
     <w:rsid w:val="00FC693F"/>
@@ -3716,10 +4228,10 @@
       <w:color w:val="4F81BD" w:themeColor="accent1"/>
     </w:rPr>
   </w:style>
-  <w:style w:type="character" w:customStyle="1" w:styleId="Heading5Char">
-    <w:name w:val="Heading 5 Char"/>
-    <w:basedOn w:val="DefaultParagraphFont"/>
-    <w:link w:val="Heading5"/>
+  <w:style w:type="character" w:customStyle="1" w:styleId="Ttulo5Car">
+    <w:name w:val="Título 5 Car"/>
+    <w:basedOn w:val="Fuentedeprrafopredeter"/>
+    <w:link w:val="Ttulo5"/>
     <w:uiPriority w:val="9"/>
     <w:semiHidden/>
     <w:rsid w:val="00FC693F"/>
@@ -3728,10 +4240,10 @@
       <w:color w:val="243F60" w:themeColor="accent1" w:themeShade="7F"/>
     </w:rPr>
   </w:style>
-  <w:style w:type="character" w:customStyle="1" w:styleId="Heading6Char">
-    <w:name w:val="Heading 6 Char"/>
-    <w:basedOn w:val="DefaultParagraphFont"/>
-    <w:link w:val="Heading6"/>
+  <w:style w:type="character" w:customStyle="1" w:styleId="Ttulo6Car">
+    <w:name w:val="Título 6 Car"/>
+    <w:basedOn w:val="Fuentedeprrafopredeter"/>
+    <w:link w:val="Ttulo6"/>
     <w:uiPriority w:val="9"/>
     <w:semiHidden/>
     <w:rsid w:val="00FC693F"/>
@@ -3742,10 +4254,10 @@
       <w:color w:val="243F60" w:themeColor="accent1" w:themeShade="7F"/>
     </w:rPr>
   </w:style>
-  <w:style w:type="character" w:customStyle="1" w:styleId="Heading7Char">
-    <w:name w:val="Heading 7 Char"/>
-    <w:basedOn w:val="DefaultParagraphFont"/>
-    <w:link w:val="Heading7"/>
+  <w:style w:type="character" w:customStyle="1" w:styleId="Ttulo7Car">
+    <w:name w:val="Título 7 Car"/>
+    <w:basedOn w:val="Fuentedeprrafopredeter"/>
+    <w:link w:val="Ttulo7"/>
     <w:uiPriority w:val="9"/>
     <w:semiHidden/>
     <w:rsid w:val="00FC693F"/>
@@ -3756,10 +4268,10 @@
       <w:color w:val="404040" w:themeColor="text1" w:themeTint="BF"/>
     </w:rPr>
   </w:style>
-  <w:style w:type="character" w:customStyle="1" w:styleId="Heading8Char">
-    <w:name w:val="Heading 8 Char"/>
-    <w:basedOn w:val="DefaultParagraphFont"/>
-    <w:link w:val="Heading8"/>
+  <w:style w:type="character" w:customStyle="1" w:styleId="Ttulo8Car">
+    <w:name w:val="Título 8 Car"/>
+    <w:basedOn w:val="Fuentedeprrafopredeter"/>
+    <w:link w:val="Ttulo8"/>
     <w:uiPriority w:val="9"/>
     <w:semiHidden/>
     <w:rsid w:val="00FC693F"/>
@@ -3770,10 +4282,10 @@
       <w:szCs w:val="20"/>
     </w:rPr>
   </w:style>
-  <w:style w:type="character" w:customStyle="1" w:styleId="Heading9Char">
-    <w:name w:val="Heading 9 Char"/>
-    <w:basedOn w:val="DefaultParagraphFont"/>
-    <w:link w:val="Heading9"/>
+  <w:style w:type="character" w:customStyle="1" w:styleId="Ttulo9Car">
+    <w:name w:val="Título 9 Car"/>
+    <w:basedOn w:val="Fuentedeprrafopredeter"/>
+    <w:link w:val="Ttulo9"/>
     <w:uiPriority w:val="9"/>
     <w:semiHidden/>
     <w:rsid w:val="00FC693F"/>
@@ -3786,7 +4298,7 @@
       <w:szCs w:val="20"/>
     </w:rPr>
   </w:style>
-  <w:style w:type="paragraph" w:styleId="Caption">
+  <w:style w:type="paragraph" w:styleId="Descripcin">
     <w:name w:val="caption"/>
     <w:basedOn w:val="Normal"/>
     <w:next w:val="Normal"/>
@@ -3806,9 +4318,9 @@
       <w:szCs w:val="18"/>
     </w:rPr>
   </w:style>
-  <w:style w:type="character" w:styleId="Strong">
+  <w:style w:type="character" w:styleId="Fuerte">
     <w:name w:val="Strong"/>
-    <w:basedOn w:val="DefaultParagraphFont"/>
+    <w:basedOn w:val="Fuentedeprrafopredeter"/>
     <w:uiPriority w:val="22"/>
     <w:qFormat/>
     <w:rsid w:val="00FC693F"/>
@@ -3817,9 +4329,9 @@
       <w:bCs/>
     </w:rPr>
   </w:style>
-  <w:style w:type="character" w:styleId="Emphasis">
+  <w:style w:type="character" w:styleId="nfasis">
     <w:name w:val="Emphasis"/>
-    <w:basedOn w:val="DefaultParagraphFont"/>
+    <w:basedOn w:val="Fuentedeprrafopredeter"/>
     <w:uiPriority w:val="20"/>
     <w:qFormat/>
     <w:rsid w:val="00FC693F"/>
@@ -3828,11 +4340,11 @@
       <w:iCs/>
     </w:rPr>
   </w:style>
-  <w:style w:type="paragraph" w:styleId="IntenseQuote">
+  <w:style w:type="paragraph" w:styleId="Citadestacada">
     <w:name w:val="Intense Quote"/>
     <w:basedOn w:val="Normal"/>
     <w:next w:val="Normal"/>
-    <w:link w:val="IntenseQuoteChar"/>
+    <w:link w:val="CitadestacadaCar"/>
     <w:uiPriority w:val="30"/>
     <w:qFormat/>
     <w:rsid w:val="00FC693F"/>
@@ -3851,10 +4363,10 @@
       <w:color w:val="4F81BD" w:themeColor="accent1"/>
     </w:rPr>
   </w:style>
-  <w:style w:type="character" w:customStyle="1" w:styleId="IntenseQuoteChar">
-    <w:name w:val="Intense Quote Char"/>
-    <w:basedOn w:val="DefaultParagraphFont"/>
-    <w:link w:val="IntenseQuote"/>
+  <w:style w:type="character" w:customStyle="1" w:styleId="CitadestacadaCar">
+    <w:name w:val="Cita destacada Car"/>
+    <w:basedOn w:val="Fuentedeprrafopredeter"/>
+    <w:link w:val="Citadestacada"/>
     <w:uiPriority w:val="30"/>
     <w:rsid w:val="00FC693F"/>
     <w:rPr>
@@ -3865,9 +4377,9 @@
       <w:color w:val="4F81BD" w:themeColor="accent1"/>
     </w:rPr>
   </w:style>
-  <w:style w:type="character" w:styleId="SubtleEmphasis">
+  <w:style w:type="character" w:styleId="nfasissutil">
     <w:name w:val="Subtle Emphasis"/>
-    <w:basedOn w:val="DefaultParagraphFont"/>
+    <w:basedOn w:val="Fuentedeprrafopredeter"/>
     <w:uiPriority w:val="19"/>
     <w:qFormat/>
     <w:rsid w:val="00FC693F"/>
@@ -3877,9 +4389,9 @@
       <w:color w:val="808080" w:themeColor="text1" w:themeTint="7F"/>
     </w:rPr>
   </w:style>
-  <w:style w:type="character" w:styleId="IntenseEmphasis">
+  <w:style w:type="character" w:styleId="nfasisintenso">
     <w:name w:val="Intense Emphasis"/>
-    <w:basedOn w:val="DefaultParagraphFont"/>
+    <w:basedOn w:val="Fuentedeprrafopredeter"/>
     <w:uiPriority w:val="21"/>
     <w:qFormat/>
     <w:rsid w:val="00FC693F"/>
@@ -3891,9 +4403,9 @@
       <w:color w:val="4F81BD" w:themeColor="accent1"/>
     </w:rPr>
   </w:style>
-  <w:style w:type="character" w:styleId="SubtleReference">
+  <w:style w:type="character" w:styleId="Referenciasutil">
     <w:name w:val="Subtle Reference"/>
-    <w:basedOn w:val="DefaultParagraphFont"/>
+    <w:basedOn w:val="Fuentedeprrafopredeter"/>
     <w:uiPriority w:val="31"/>
     <w:qFormat/>
     <w:rsid w:val="00FC693F"/>
@@ -3903,9 +4415,9 @@
       <w:u w:val="single"/>
     </w:rPr>
   </w:style>
-  <w:style w:type="character" w:styleId="IntenseReference">
+  <w:style w:type="character" w:styleId="Referenciaintensa">
     <w:name w:val="Intense Reference"/>
-    <w:basedOn w:val="DefaultParagraphFont"/>
+    <w:basedOn w:val="Fuentedeprrafopredeter"/>
     <w:uiPriority w:val="32"/>
     <w:qFormat/>
     <w:rsid w:val="00FC693F"/>
@@ -3918,9 +4430,9 @@
       <w:u w:val="single"/>
     </w:rPr>
   </w:style>
-  <w:style w:type="character" w:styleId="BookTitle">
+  <w:style w:type="character" w:styleId="Ttulodellibro">
     <w:name w:val="Book Title"/>
-    <w:basedOn w:val="DefaultParagraphFont"/>
+    <w:basedOn w:val="Fuentedeprrafopredeter"/>
     <w:uiPriority w:val="33"/>
     <w:qFormat/>
     <w:rsid w:val="00FC693F"/>
@@ -3931,9 +4443,9 @@
       <w:spacing w:val="5"/>
     </w:rPr>
   </w:style>
-  <w:style w:type="paragraph" w:styleId="TOCHeading">
+  <w:style w:type="paragraph" w:styleId="TtuloTDC">
     <w:name w:val="TOC Heading"/>
-    <w:basedOn w:val="Heading1"/>
+    <w:basedOn w:val="Ttulo1"/>
     <w:next w:val="Normal"/>
     <w:uiPriority w:val="39"/>
     <w:semiHidden/>
@@ -3944,9 +4456,9 @@
       <w:outlineLvl w:val="9"/>
     </w:pPr>
   </w:style>
-  <w:style w:type="table" w:styleId="TableGrid">
+  <w:style w:type="table" w:styleId="Tablaconcuadrcula">
     <w:name w:val="Table Grid"/>
-    <w:basedOn w:val="TableNormal"/>
+    <w:basedOn w:val="Tablanormal"/>
     <w:uiPriority w:val="59"/>
     <w:rsid w:val="00FC693F"/>
     <w:pPr>
@@ -3963,9 +4475,9 @@
       </w:tblBorders>
     </w:tblPr>
   </w:style>
-  <w:style w:type="table" w:styleId="LightShading">
+  <w:style w:type="table" w:styleId="Sombreadoclaro">
     <w:name w:val="Light Shading"/>
-    <w:basedOn w:val="TableNormal"/>
+    <w:basedOn w:val="Tablanormal"/>
     <w:uiPriority w:val="60"/>
     <w:rsid w:val="00FC693F"/>
     <w:pPr>
@@ -4059,9 +4571,9 @@
       </w:tcPr>
     </w:tblStylePr>
   </w:style>
-  <w:style w:type="table" w:styleId="LightShading-Accent1">
+  <w:style w:type="table" w:styleId="Sombreadoclaro-nfasis1">
     <w:name w:val="Light Shading Accent 1"/>
-    <w:basedOn w:val="TableNormal"/>
+    <w:basedOn w:val="Tablanormal"/>
     <w:uiPriority w:val="60"/>
     <w:rsid w:val="00FC693F"/>
     <w:pPr>
@@ -4155,9 +4667,9 @@
       </w:tcPr>
     </w:tblStylePr>
   </w:style>
-  <w:style w:type="table" w:styleId="LightShading-Accent2">
+  <w:style w:type="table" w:styleId="Sombreadoclaro-nfasis2">
     <w:name w:val="Light Shading Accent 2"/>
-    <w:basedOn w:val="TableNormal"/>
+    <w:basedOn w:val="Tablanormal"/>
     <w:uiPriority w:val="60"/>
     <w:rsid w:val="00FC693F"/>
     <w:pPr>
@@ -4251,9 +4763,9 @@
       </w:tcPr>
     </w:tblStylePr>
   </w:style>
-  <w:style w:type="table" w:styleId="LightShading-Accent3">
+  <w:style w:type="table" w:styleId="Sombreadoclaro-nfasis3">
     <w:name w:val="Light Shading Accent 3"/>
-    <w:basedOn w:val="TableNormal"/>
+    <w:basedOn w:val="Tablanormal"/>
     <w:uiPriority w:val="60"/>
     <w:rsid w:val="00FC693F"/>
     <w:pPr>
@@ -4347,9 +4859,9 @@
       </w:tcPr>
     </w:tblStylePr>
   </w:style>
-  <w:style w:type="table" w:styleId="LightShading-Accent4">
+  <w:style w:type="table" w:styleId="Sombreadoclaro-nfasis4">
     <w:name w:val="Light Shading Accent 4"/>
-    <w:basedOn w:val="TableNormal"/>
+    <w:basedOn w:val="Tablanormal"/>
     <w:uiPriority w:val="60"/>
     <w:rsid w:val="00FC693F"/>
     <w:pPr>
@@ -4443,9 +4955,9 @@
       </w:tcPr>
     </w:tblStylePr>
   </w:style>
-  <w:style w:type="table" w:styleId="LightShading-Accent5">
+  <w:style w:type="table" w:styleId="Sombreadoclaro-nfasis5">
     <w:name w:val="Light Shading Accent 5"/>
-    <w:basedOn w:val="TableNormal"/>
+    <w:basedOn w:val="Tablanormal"/>
     <w:uiPriority w:val="60"/>
     <w:rsid w:val="00FC693F"/>
     <w:pPr>
@@ -4539,9 +5051,9 @@
       </w:tcPr>
     </w:tblStylePr>
   </w:style>
-  <w:style w:type="table" w:styleId="LightShading-Accent6">
+  <w:style w:type="table" w:styleId="Sombreadoclaro-nfasis6">
     <w:name w:val="Light Shading Accent 6"/>
-    <w:basedOn w:val="TableNormal"/>
+    <w:basedOn w:val="Tablanormal"/>
     <w:uiPriority w:val="60"/>
     <w:rsid w:val="00FC693F"/>
     <w:pPr>
@@ -4635,9 +5147,9 @@
       </w:tcPr>
     </w:tblStylePr>
   </w:style>
-  <w:style w:type="table" w:styleId="LightList">
+  <w:style w:type="table" w:styleId="Listaclara">
     <w:name w:val="Light List"/>
-    <w:basedOn w:val="TableNormal"/>
+    <w:basedOn w:val="Tablanormal"/>
     <w:uiPriority w:val="61"/>
     <w:rsid w:val="00FC693F"/>
     <w:pPr>
@@ -4720,9 +5232,9 @@
       </w:tcPr>
     </w:tblStylePr>
   </w:style>
-  <w:style w:type="table" w:styleId="LightList-Accent1">
+  <w:style w:type="table" w:styleId="Listaclara-nfasis1">
     <w:name w:val="Light List Accent 1"/>
-    <w:basedOn w:val="TableNormal"/>
+    <w:basedOn w:val="Tablanormal"/>
     <w:uiPriority w:val="61"/>
     <w:rsid w:val="00FC693F"/>
     <w:pPr>
@@ -4805,9 +5317,9 @@
       </w:tcPr>
     </w:tblStylePr>
   </w:style>
-  <w:style w:type="table" w:styleId="LightList-Accent2">
+  <w:style w:type="table" w:styleId="Listaclara-nfasis2">
     <w:name w:val="Light List Accent 2"/>
-    <w:basedOn w:val="TableNormal"/>
+    <w:basedOn w:val="Tablanormal"/>
     <w:uiPriority w:val="61"/>
     <w:rsid w:val="00CB0664"/>
     <w:pPr>
@@ -4890,9 +5402,9 @@
       </w:tcPr>
     </w:tblStylePr>
   </w:style>
-  <w:style w:type="table" w:styleId="LightList-Accent3">
+  <w:style w:type="table" w:styleId="Listaclara-nfasis3">
     <w:name w:val="Light List Accent 3"/>
-    <w:basedOn w:val="TableNormal"/>
+    <w:basedOn w:val="Tablanormal"/>
     <w:uiPriority w:val="61"/>
     <w:rsid w:val="00CB0664"/>
     <w:pPr>
@@ -4975,9 +5487,9 @@
       </w:tcPr>
     </w:tblStylePr>
   </w:style>
-  <w:style w:type="table" w:styleId="LightList-Accent4">
+  <w:style w:type="table" w:styleId="Listaclara-nfasis4">
     <w:name w:val="Light List Accent 4"/>
-    <w:basedOn w:val="TableNormal"/>
+    <w:basedOn w:val="Tablanormal"/>
     <w:uiPriority w:val="61"/>
     <w:rsid w:val="00CB0664"/>
     <w:pPr>
@@ -5060,9 +5572,9 @@
       </w:tcPr>
     </w:tblStylePr>
   </w:style>
-  <w:style w:type="table" w:styleId="LightList-Accent5">
+  <w:style w:type="table" w:styleId="Listaclara-nfasis5">
     <w:name w:val="Light List Accent 5"/>
-    <w:basedOn w:val="TableNormal"/>
+    <w:basedOn w:val="Tablanormal"/>
     <w:uiPriority w:val="61"/>
     <w:rsid w:val="00CB0664"/>
     <w:pPr>
@@ -5145,9 +5657,9 @@
       </w:tcPr>
     </w:tblStylePr>
   </w:style>
-  <w:style w:type="table" w:styleId="LightList-Accent6">
+  <w:style w:type="table" w:styleId="Listaclara-nfasis6">
     <w:name w:val="Light List Accent 6"/>
-    <w:basedOn w:val="TableNormal"/>
+    <w:basedOn w:val="Tablanormal"/>
     <w:uiPriority w:val="61"/>
     <w:rsid w:val="00CB0664"/>
     <w:pPr>
@@ -5230,9 +5742,9 @@
       </w:tcPr>
     </w:tblStylePr>
   </w:style>
-  <w:style w:type="table" w:styleId="LightGrid">
+  <w:style w:type="table" w:styleId="Cuadrculaclara">
     <w:name w:val="Light Grid"/>
-    <w:basedOn w:val="TableNormal"/>
+    <w:basedOn w:val="Tablanormal"/>
     <w:uiPriority w:val="62"/>
     <w:rsid w:val="00CB0664"/>
     <w:pPr>
@@ -5353,9 +5865,9 @@
       </w:tcPr>
     </w:tblStylePr>
   </w:style>
-  <w:style w:type="table" w:styleId="LightGrid-Accent1">
+  <w:style w:type="table" w:styleId="Cuadrculaclara-nfasis1">
     <w:name w:val="Light Grid Accent 1"/>
-    <w:basedOn w:val="TableNormal"/>
+    <w:basedOn w:val="Tablanormal"/>
     <w:uiPriority w:val="62"/>
     <w:rsid w:val="00CB0664"/>
     <w:pPr>
@@ -5476,9 +5988,9 @@
       </w:tcPr>
     </w:tblStylePr>
   </w:style>
-  <w:style w:type="table" w:styleId="LightGrid-Accent2">
+  <w:style w:type="table" w:styleId="Cuadrculaclara-nfasis2">
     <w:name w:val="Light Grid Accent 2"/>
-    <w:basedOn w:val="TableNormal"/>
+    <w:basedOn w:val="Tablanormal"/>
     <w:uiPriority w:val="62"/>
     <w:rsid w:val="00CB0664"/>
     <w:pPr>
@@ -5599,9 +6111,9 @@
       </w:tcPr>
     </w:tblStylePr>
   </w:style>
-  <w:style w:type="table" w:styleId="LightGrid-Accent3">
+  <w:style w:type="table" w:styleId="Cuadrculaclara-nfasis3">
     <w:name w:val="Light Grid Accent 3"/>
-    <w:basedOn w:val="TableNormal"/>
+    <w:basedOn w:val="Tablanormal"/>
     <w:uiPriority w:val="62"/>
     <w:rsid w:val="00CB0664"/>
     <w:pPr>
@@ -5722,9 +6234,9 @@
       </w:tcPr>
     </w:tblStylePr>
   </w:style>
-  <w:style w:type="table" w:styleId="LightGrid-Accent4">
+  <w:style w:type="table" w:styleId="Cuadrculaclara-nfasis4">
     <w:name w:val="Light Grid Accent 4"/>
-    <w:basedOn w:val="TableNormal"/>
+    <w:basedOn w:val="Tablanormal"/>
     <w:uiPriority w:val="62"/>
     <w:rsid w:val="00CB0664"/>
     <w:pPr>
@@ -5845,9 +6357,9 @@
       </w:tcPr>
     </w:tblStylePr>
   </w:style>
-  <w:style w:type="table" w:styleId="LightGrid-Accent5">
+  <w:style w:type="table" w:styleId="Cuadrculaclara-nfasis5">
     <w:name w:val="Light Grid Accent 5"/>
-    <w:basedOn w:val="TableNormal"/>
+    <w:basedOn w:val="Tablanormal"/>
     <w:uiPriority w:val="62"/>
     <w:rsid w:val="00CB0664"/>
     <w:pPr>
@@ -5968,9 +6480,9 @@
       </w:tcPr>
     </w:tblStylePr>
   </w:style>
-  <w:style w:type="table" w:styleId="LightGrid-Accent6">
+  <w:style w:type="table" w:styleId="Cuadrculaclara-nfasis6">
     <w:name w:val="Light Grid Accent 6"/>
-    <w:basedOn w:val="TableNormal"/>
+    <w:basedOn w:val="Tablanormal"/>
     <w:uiPriority w:val="62"/>
     <w:rsid w:val="00CB0664"/>
     <w:pPr>
@@ -6091,9 +6603,9 @@
       </w:tcPr>
     </w:tblStylePr>
   </w:style>
-  <w:style w:type="table" w:styleId="MediumShading1">
+  <w:style w:type="table" w:styleId="Sombreadomedio1">
     <w:name w:val="Medium Shading 1"/>
-    <w:basedOn w:val="TableNormal"/>
+    <w:basedOn w:val="Tablanormal"/>
     <w:uiPriority w:val="63"/>
     <w:rsid w:val="00CB0664"/>
     <w:pPr>
@@ -6190,9 +6702,9 @@
       </w:tcPr>
     </w:tblStylePr>
   </w:style>
-  <w:style w:type="table" w:styleId="MediumShading1-Accent1">
+  <w:style w:type="table" w:styleId="Sombreadomedio1-nfasis1">
     <w:name w:val="Medium Shading 1 Accent 1"/>
-    <w:basedOn w:val="TableNormal"/>
+    <w:basedOn w:val="Tablanormal"/>
     <w:uiPriority w:val="63"/>
     <w:rsid w:val="00CB0664"/>
     <w:pPr>
@@ -6289,9 +6801,9 @@
       </w:tcPr>
     </w:tblStylePr>
   </w:style>
-  <w:style w:type="table" w:styleId="MediumShading1-Accent2">
+  <w:style w:type="table" w:styleId="Sombreadomedio1-nfasis2">
     <w:name w:val="Medium Shading 1 Accent 2"/>
-    <w:basedOn w:val="TableNormal"/>
+    <w:basedOn w:val="Tablanormal"/>
     <w:uiPriority w:val="63"/>
     <w:rsid w:val="00CB0664"/>
     <w:pPr>
@@ -6388,9 +6900,9 @@
       </w:tcPr>
     </w:tblStylePr>
   </w:style>
-  <w:style w:type="table" w:styleId="MediumShading1-Accent3">
+  <w:style w:type="table" w:styleId="Sombreadomedio1-nfasis3">
     <w:name w:val="Medium Shading 1 Accent 3"/>
-    <w:basedOn w:val="TableNormal"/>
+    <w:basedOn w:val="Tablanormal"/>
     <w:uiPriority w:val="63"/>
     <w:rsid w:val="00CB0664"/>
     <w:pPr>
@@ -6487,9 +6999,9 @@
       </w:tcPr>
     </w:tblStylePr>
   </w:style>
-  <w:style w:type="table" w:styleId="MediumShading1-Accent4">
+  <w:style w:type="table" w:styleId="Sombreadomedio1-nfasis4">
     <w:name w:val="Medium Shading 1 Accent 4"/>
-    <w:basedOn w:val="TableNormal"/>
+    <w:basedOn w:val="Tablanormal"/>
     <w:uiPriority w:val="63"/>
     <w:rsid w:val="00CB0664"/>
     <w:pPr>
@@ -6586,9 +7098,9 @@
       </w:tcPr>
     </w:tblStylePr>
   </w:style>
-  <w:style w:type="table" w:styleId="MediumShading1-Accent5">
+  <w:style w:type="table" w:styleId="Sombreadomedio1-nfasis5">
     <w:name w:val="Medium Shading 1 Accent 5"/>
-    <w:basedOn w:val="TableNormal"/>
+    <w:basedOn w:val="Tablanormal"/>
     <w:uiPriority w:val="63"/>
     <w:rsid w:val="00CB0664"/>
     <w:pPr>
@@ -6685,9 +7197,9 @@
       </w:tcPr>
     </w:tblStylePr>
   </w:style>
-  <w:style w:type="table" w:styleId="MediumShading1-Accent6">
+  <w:style w:type="table" w:styleId="Sombreadomedio1-nfasis6">
     <w:name w:val="Medium Shading 1 Accent 6"/>
-    <w:basedOn w:val="TableNormal"/>
+    <w:basedOn w:val="Tablanormal"/>
     <w:uiPriority w:val="63"/>
     <w:rsid w:val="00CB0664"/>
     <w:pPr>
@@ -6784,9 +7296,9 @@
       </w:tcPr>
     </w:tblStylePr>
   </w:style>
-  <w:style w:type="table" w:styleId="MediumShading2">
+  <w:style w:type="table" w:styleId="Sombreadomedio2">
     <w:name w:val="Medium Shading 2"/>
-    <w:basedOn w:val="TableNormal"/>
+    <w:basedOn w:val="Tablanormal"/>
     <w:uiPriority w:val="64"/>
     <w:rsid w:val="00CB0664"/>
     <w:pPr>
@@ -6926,9 +7438,9 @@
       </w:tcPr>
     </w:tblStylePr>
   </w:style>
-  <w:style w:type="table" w:styleId="MediumShading2-Accent1">
+  <w:style w:type="table" w:styleId="Sombreadomedio2-nfasis1">
     <w:name w:val="Medium Shading 2 Accent 1"/>
-    <w:basedOn w:val="TableNormal"/>
+    <w:basedOn w:val="Tablanormal"/>
     <w:uiPriority w:val="64"/>
     <w:rsid w:val="00CB0664"/>
     <w:pPr>
@@ -7068,9 +7580,9 @@
       </w:tcPr>
     </w:tblStylePr>
   </w:style>
-  <w:style w:type="table" w:styleId="MediumShading2-Accent2">
+  <w:style w:type="table" w:styleId="Sombreadomedio2-nfasis2">
     <w:name w:val="Medium Shading 2 Accent 2"/>
-    <w:basedOn w:val="TableNormal"/>
+    <w:basedOn w:val="Tablanormal"/>
     <w:uiPriority w:val="64"/>
     <w:rsid w:val="00CB0664"/>
     <w:pPr>
@@ -7210,9 +7722,9 @@
       </w:tcPr>
     </w:tblStylePr>
   </w:style>
-  <w:style w:type="table" w:styleId="MediumShading2-Accent3">
+  <w:style w:type="table" w:styleId="Sombreadomedio2-nfasis3">
     <w:name w:val="Medium Shading 2 Accent 3"/>
-    <w:basedOn w:val="TableNormal"/>
+    <w:basedOn w:val="Tablanormal"/>
     <w:uiPriority w:val="64"/>
     <w:rsid w:val="00CB0664"/>
     <w:pPr>
@@ -7352,9 +7864,9 @@
       </w:tcPr>
     </w:tblStylePr>
   </w:style>
-  <w:style w:type="table" w:styleId="MediumShading2-Accent4">
+  <w:style w:type="table" w:styleId="Sombreadomedio2-nfasis4">
     <w:name w:val="Medium Shading 2 Accent 4"/>
-    <w:basedOn w:val="TableNormal"/>
+    <w:basedOn w:val="Tablanormal"/>
     <w:uiPriority w:val="64"/>
     <w:rsid w:val="00CB0664"/>
     <w:pPr>
@@ -7494,9 +8006,9 @@
       </w:tcPr>
     </w:tblStylePr>
   </w:style>
-  <w:style w:type="table" w:styleId="MediumShading2-Accent5">
+  <w:style w:type="table" w:styleId="Sombreadomedio2-nfasis5">
     <w:name w:val="Medium Shading 2 Accent 5"/>
-    <w:basedOn w:val="TableNormal"/>
+    <w:basedOn w:val="Tablanormal"/>
     <w:uiPriority w:val="64"/>
     <w:rsid w:val="00CB0664"/>
     <w:pPr>
@@ -7636,9 +8148,9 @@
       </w:tcPr>
     </w:tblStylePr>
   </w:style>
-  <w:style w:type="table" w:styleId="MediumShading2-Accent6">
+  <w:style w:type="table" w:styleId="Sombreadomedio2-nfasis6">
     <w:name w:val="Medium Shading 2 Accent 6"/>
-    <w:basedOn w:val="TableNormal"/>
+    <w:basedOn w:val="Tablanormal"/>
     <w:uiPriority w:val="64"/>
     <w:rsid w:val="00CB0664"/>
     <w:pPr>
@@ -7778,9 +8290,9 @@
       </w:tcPr>
     </w:tblStylePr>
   </w:style>
-  <w:style w:type="table" w:styleId="MediumList1">
+  <w:style w:type="table" w:styleId="Listamedia1">
     <w:name w:val="Medium List 1"/>
-    <w:basedOn w:val="TableNormal"/>
+    <w:basedOn w:val="Tablanormal"/>
     <w:uiPriority w:val="65"/>
     <w:rsid w:val="00CB0664"/>
     <w:pPr>
@@ -7855,9 +8367,9 @@
       </w:tcPr>
     </w:tblStylePr>
   </w:style>
-  <w:style w:type="table" w:styleId="MediumList1-Accent1">
+  <w:style w:type="table" w:styleId="Listamedia1-nfasis1">
     <w:name w:val="Medium List 1 Accent 1"/>
-    <w:basedOn w:val="TableNormal"/>
+    <w:basedOn w:val="Tablanormal"/>
     <w:uiPriority w:val="65"/>
     <w:rsid w:val="00CB0664"/>
     <w:pPr>
@@ -7932,9 +8444,9 @@
       </w:tcPr>
     </w:tblStylePr>
   </w:style>
-  <w:style w:type="table" w:styleId="MediumList1-Accent2">
+  <w:style w:type="table" w:styleId="Listamedia1-nfasis2">
     <w:name w:val="Medium List 1 Accent 2"/>
-    <w:basedOn w:val="TableNormal"/>
+    <w:basedOn w:val="Tablanormal"/>
     <w:uiPriority w:val="65"/>
     <w:rsid w:val="00CB0664"/>
     <w:pPr>
@@ -8009,9 +8521,9 @@
       </w:tcPr>
     </w:tblStylePr>
   </w:style>
-  <w:style w:type="table" w:styleId="MediumList1-Accent3">
+  <w:style w:type="table" w:styleId="Listamedia1-nfasis3">
     <w:name w:val="Medium List 1 Accent 3"/>
-    <w:basedOn w:val="TableNormal"/>
+    <w:basedOn w:val="Tablanormal"/>
     <w:uiPriority w:val="65"/>
     <w:rsid w:val="00CB0664"/>
     <w:pPr>
@@ -8086,9 +8598,9 @@
       </w:tcPr>
     </w:tblStylePr>
   </w:style>
-  <w:style w:type="table" w:styleId="MediumList1-Accent4">
+  <w:style w:type="table" w:styleId="Listamedia1-nfasis4">
     <w:name w:val="Medium List 1 Accent 4"/>
-    <w:basedOn w:val="TableNormal"/>
+    <w:basedOn w:val="Tablanormal"/>
     <w:uiPriority w:val="65"/>
     <w:rsid w:val="00CB0664"/>
     <w:pPr>
@@ -8163,9 +8675,9 @@
       </w:tcPr>
     </w:tblStylePr>
   </w:style>
-  <w:style w:type="table" w:styleId="MediumList1-Accent5">
+  <w:style w:type="table" w:styleId="Listamedia1-nfasis5">
     <w:name w:val="Medium List 1 Accent 5"/>
-    <w:basedOn w:val="TableNormal"/>
+    <w:basedOn w:val="Tablanormal"/>
     <w:uiPriority w:val="65"/>
     <w:rsid w:val="00CB0664"/>
     <w:pPr>
@@ -8240,9 +8752,9 @@
       </w:tcPr>
     </w:tblStylePr>
   </w:style>
-  <w:style w:type="table" w:styleId="MediumList1-Accent6">
+  <w:style w:type="table" w:styleId="Listamedia1-nfasis6">
     <w:name w:val="Medium List 1 Accent 6"/>
-    <w:basedOn w:val="TableNormal"/>
+    <w:basedOn w:val="Tablanormal"/>
     <w:uiPriority w:val="65"/>
     <w:rsid w:val="00CB0664"/>
     <w:pPr>
@@ -8317,9 +8829,9 @@
       </w:tcPr>
     </w:tblStylePr>
   </w:style>
-  <w:style w:type="table" w:styleId="MediumList2">
+  <w:style w:type="table" w:styleId="Listamedia2">
     <w:name w:val="Medium List 2"/>
-    <w:basedOn w:val="TableNormal"/>
+    <w:basedOn w:val="Tablanormal"/>
     <w:uiPriority w:val="66"/>
     <w:rsid w:val="00CB0664"/>
     <w:pPr>
@@ -8438,9 +8950,9 @@
       </w:tcPr>
     </w:tblStylePr>
   </w:style>
-  <w:style w:type="table" w:styleId="MediumList2-Accent1">
+  <w:style w:type="table" w:styleId="Listamedia2-nfasis1">
     <w:name w:val="Medium List 2 Accent 1"/>
-    <w:basedOn w:val="TableNormal"/>
+    <w:basedOn w:val="Tablanormal"/>
     <w:uiPriority w:val="66"/>
     <w:rsid w:val="00CB0664"/>
     <w:pPr>
@@ -8559,9 +9071,9 @@
       </w:tcPr>
     </w:tblStylePr>
   </w:style>
-  <w:style w:type="table" w:styleId="MediumList2-Accent2">
+  <w:style w:type="table" w:styleId="Listamedia2-nfasis2">
     <w:name w:val="Medium List 2 Accent 2"/>
-    <w:basedOn w:val="TableNormal"/>
+    <w:basedOn w:val="Tablanormal"/>
     <w:uiPriority w:val="66"/>
     <w:rsid w:val="00CB0664"/>
     <w:pPr>
@@ -8680,9 +9192,9 @@
       </w:tcPr>
     </w:tblStylePr>
   </w:style>
-  <w:style w:type="table" w:styleId="MediumList2-Accent3">
+  <w:style w:type="table" w:styleId="Listamedia2-nfasis3">
     <w:name w:val="Medium List 2 Accent 3"/>
-    <w:basedOn w:val="TableNormal"/>
+    <w:basedOn w:val="Tablanormal"/>
     <w:uiPriority w:val="66"/>
     <w:rsid w:val="00CB0664"/>
     <w:pPr>
@@ -8801,9 +9313,9 @@
       </w:tcPr>
     </w:tblStylePr>
   </w:style>
-  <w:style w:type="table" w:styleId="MediumList2-Accent4">
+  <w:style w:type="table" w:styleId="Listamedia2-nfasis4">
     <w:name w:val="Medium List 2 Accent 4"/>
-    <w:basedOn w:val="TableNormal"/>
+    <w:basedOn w:val="Tablanormal"/>
     <w:uiPriority w:val="66"/>
     <w:rsid w:val="00CB0664"/>
     <w:pPr>
@@ -8922,9 +9434,9 @@
       </w:tcPr>
     </w:tblStylePr>
   </w:style>
-  <w:style w:type="table" w:styleId="MediumList2-Accent5">
+  <w:style w:type="table" w:styleId="Listamedia2-nfasis5">
     <w:name w:val="Medium List 2 Accent 5"/>
-    <w:basedOn w:val="TableNormal"/>
+    <w:basedOn w:val="Tablanormal"/>
     <w:uiPriority w:val="66"/>
     <w:rsid w:val="00CB0664"/>
     <w:pPr>
@@ -9043,9 +9555,9 @@
       </w:tcPr>
     </w:tblStylePr>
   </w:style>
-  <w:style w:type="table" w:styleId="MediumList2-Accent6">
+  <w:style w:type="table" w:styleId="Listamedia2-nfasis6">
     <w:name w:val="Medium List 2 Accent 6"/>
-    <w:basedOn w:val="TableNormal"/>
+    <w:basedOn w:val="Tablanormal"/>
     <w:uiPriority w:val="66"/>
     <w:rsid w:val="00CB0664"/>
     <w:pPr>
@@ -9164,9 +9676,9 @@
       </w:tcPr>
     </w:tblStylePr>
   </w:style>
-  <w:style w:type="table" w:styleId="MediumGrid1">
+  <w:style w:type="table" w:styleId="Cuadrculamedia1">
     <w:name w:val="Medium Grid 1"/>
-    <w:basedOn w:val="TableNormal"/>
+    <w:basedOn w:val="Tablanormal"/>
     <w:uiPriority w:val="67"/>
     <w:rsid w:val="00CB0664"/>
     <w:pPr>
@@ -9230,9 +9742,9 @@
       </w:tcPr>
     </w:tblStylePr>
   </w:style>
-  <w:style w:type="table" w:styleId="MediumGrid1-Accent1">
+  <w:style w:type="table" w:styleId="Cuadrculamedia1-nfasis1">
     <w:name w:val="Medium Grid 1 Accent 1"/>
-    <w:basedOn w:val="TableNormal"/>
+    <w:basedOn w:val="Tablanormal"/>
     <w:uiPriority w:val="67"/>
     <w:rsid w:val="00CB0664"/>
     <w:pPr>
@@ -9296,9 +9808,9 @@
       </w:tcPr>
     </w:tblStylePr>
   </w:style>
-  <w:style w:type="table" w:styleId="MediumGrid1-Accent2">
+  <w:style w:type="table" w:styleId="Cuadrculamedia1-nfasis2">
     <w:name w:val="Medium Grid 1 Accent 2"/>
-    <w:basedOn w:val="TableNormal"/>
+    <w:basedOn w:val="Tablanormal"/>
     <w:uiPriority w:val="67"/>
     <w:rsid w:val="00CB0664"/>
     <w:pPr>
@@ -9362,9 +9874,9 @@
       </w:tcPr>
     </w:tblStylePr>
   </w:style>
-  <w:style w:type="table" w:styleId="MediumGrid1-Accent3">
+  <w:style w:type="table" w:styleId="Cuadrculamedia1-nfasis3">
     <w:name w:val="Medium Grid 1 Accent 3"/>
-    <w:basedOn w:val="TableNormal"/>
+    <w:basedOn w:val="Tablanormal"/>
     <w:uiPriority w:val="67"/>
     <w:rsid w:val="00CB0664"/>
     <w:pPr>
@@ -9428,9 +9940,9 @@
       </w:tcPr>
     </w:tblStylePr>
   </w:style>
-  <w:style w:type="table" w:styleId="MediumGrid1-Accent4">
+  <w:style w:type="table" w:styleId="Cuadrculamedia1-nfasis4">
     <w:name w:val="Medium Grid 1 Accent 4"/>
-    <w:basedOn w:val="TableNormal"/>
+    <w:basedOn w:val="Tablanormal"/>
     <w:uiPriority w:val="67"/>
     <w:rsid w:val="00CB0664"/>
     <w:pPr>
@@ -9494,9 +10006,9 @@
       </w:tcPr>
     </w:tblStylePr>
   </w:style>
-  <w:style w:type="table" w:styleId="MediumGrid1-Accent5">
+  <w:style w:type="table" w:styleId="Cuadrculamedia1-nfasis5">
     <w:name w:val="Medium Grid 1 Accent 5"/>
-    <w:basedOn w:val="TableNormal"/>
+    <w:basedOn w:val="Tablanormal"/>
     <w:uiPriority w:val="67"/>
     <w:rsid w:val="00CB0664"/>
     <w:pPr>
@@ -9560,9 +10072,9 @@
       </w:tcPr>
     </w:tblStylePr>
   </w:style>
-  <w:style w:type="table" w:styleId="MediumGrid1-Accent6">
+  <w:style w:type="table" w:styleId="Cuadrculamedia1-nfasis6">
     <w:name w:val="Medium Grid 1 Accent 6"/>
-    <w:basedOn w:val="TableNormal"/>
+    <w:basedOn w:val="Tablanormal"/>
     <w:uiPriority w:val="67"/>
     <w:rsid w:val="00CB0664"/>
     <w:pPr>
@@ -9626,9 +10138,9 @@
       </w:tcPr>
     </w:tblStylePr>
   </w:style>
-  <w:style w:type="table" w:styleId="MediumGrid2">
+  <w:style w:type="table" w:styleId="Cuadrculamedia2">
     <w:name w:val="Medium Grid 2"/>
-    <w:basedOn w:val="TableNormal"/>
+    <w:basedOn w:val="Tablanormal"/>
     <w:uiPriority w:val="68"/>
     <w:rsid w:val="00CB0664"/>
     <w:pPr>
@@ -9744,9 +10256,9 @@
       </w:tcPr>
     </w:tblStylePr>
   </w:style>
-  <w:style w:type="table" w:styleId="MediumGrid2-Accent1">
+  <w:style w:type="table" w:styleId="Cuadrculamedia2-nfasis1">
     <w:name w:val="Medium Grid 2 Accent 1"/>
-    <w:basedOn w:val="TableNormal"/>
+    <w:basedOn w:val="Tablanormal"/>
     <w:uiPriority w:val="68"/>
     <w:rsid w:val="00CB0664"/>
     <w:pPr>
@@ -9862,9 +10374,9 @@
       </w:tcPr>
     </w:tblStylePr>
   </w:style>
-  <w:style w:type="table" w:styleId="MediumGrid2-Accent2">
+  <w:style w:type="table" w:styleId="Cuadrculamedia2-nfasis2">
     <w:name w:val="Medium Grid 2 Accent 2"/>
-    <w:basedOn w:val="TableNormal"/>
+    <w:basedOn w:val="Tablanormal"/>
     <w:uiPriority w:val="68"/>
     <w:rsid w:val="00CB0664"/>
     <w:pPr>
@@ -9980,9 +10492,9 @@
       </w:tcPr>
     </w:tblStylePr>
   </w:style>
-  <w:style w:type="table" w:styleId="MediumGrid2-Accent3">
+  <w:style w:type="table" w:styleId="Cuadrculamedia2-nfasis3">
     <w:name w:val="Medium Grid 2 Accent 3"/>
-    <w:basedOn w:val="TableNormal"/>
+    <w:basedOn w:val="Tablanormal"/>
     <w:uiPriority w:val="68"/>
     <w:rsid w:val="00CB0664"/>
     <w:pPr>
@@ -10098,9 +10610,9 @@
       </w:tcPr>
     </w:tblStylePr>
   </w:style>
-  <w:style w:type="table" w:styleId="MediumGrid2-Accent4">
+  <w:style w:type="table" w:styleId="Cuadrculamedia2-nfasis4">
     <w:name w:val="Medium Grid 2 Accent 4"/>
-    <w:basedOn w:val="TableNormal"/>
+    <w:basedOn w:val="Tablanormal"/>
     <w:uiPriority w:val="68"/>
     <w:rsid w:val="00CB0664"/>
     <w:pPr>
@@ -10216,9 +10728,9 @@
       </w:tcPr>
     </w:tblStylePr>
   </w:style>
-  <w:style w:type="table" w:styleId="MediumGrid2-Accent5">
+  <w:style w:type="table" w:styleId="Cuadrculamedia2-nfasis5">
     <w:name w:val="Medium Grid 2 Accent 5"/>
-    <w:basedOn w:val="TableNormal"/>
+    <w:basedOn w:val="Tablanormal"/>
     <w:uiPriority w:val="68"/>
     <w:rsid w:val="00CB0664"/>
     <w:pPr>
@@ -10334,9 +10846,9 @@
       </w:tcPr>
     </w:tblStylePr>
   </w:style>
-  <w:style w:type="table" w:styleId="MediumGrid2-Accent6">
+  <w:style w:type="table" w:styleId="Cuadrculamedia2-nfasis6">
     <w:name w:val="Medium Grid 2 Accent 6"/>
-    <w:basedOn w:val="TableNormal"/>
+    <w:basedOn w:val="Tablanormal"/>
     <w:uiPriority w:val="68"/>
     <w:rsid w:val="00CB0664"/>
     <w:pPr>
@@ -10452,9 +10964,9 @@
       </w:tcPr>
     </w:tblStylePr>
   </w:style>
-  <w:style w:type="table" w:styleId="MediumGrid3">
+  <w:style w:type="table" w:styleId="Cuadrculamedia3">
     <w:name w:val="Medium Grid 3"/>
-    <w:basedOn w:val="TableNormal"/>
+    <w:basedOn w:val="Tablanormal"/>
     <w:uiPriority w:val="69"/>
     <w:rsid w:val="00CB0664"/>
     <w:pPr>
@@ -10586,9 +11098,9 @@
       </w:tcPr>
     </w:tblStylePr>
   </w:style>
-  <w:style w:type="table" w:styleId="MediumGrid3-Accent1">
+  <w:style w:type="table" w:styleId="Cuadrculamedia3-nfasis1">
     <w:name w:val="Medium Grid 3 Accent 1"/>
-    <w:basedOn w:val="TableNormal"/>
+    <w:basedOn w:val="Tablanormal"/>
     <w:uiPriority w:val="69"/>
     <w:rsid w:val="00CB0664"/>
     <w:pPr>
@@ -10720,9 +11232,9 @@
       </w:tcPr>
     </w:tblStylePr>
   </w:style>
-  <w:style w:type="table" w:styleId="MediumGrid3-Accent2">
+  <w:style w:type="table" w:styleId="Cuadrculamedia3-nfasis2">
     <w:name w:val="Medium Grid 3 Accent 2"/>
-    <w:basedOn w:val="TableNormal"/>
+    <w:basedOn w:val="Tablanormal"/>
     <w:uiPriority w:val="69"/>
     <w:rsid w:val="00CB0664"/>
     <w:pPr>
@@ -10854,9 +11366,9 @@
       </w:tcPr>
     </w:tblStylePr>
   </w:style>
-  <w:style w:type="table" w:styleId="MediumGrid3-Accent3">
+  <w:style w:type="table" w:styleId="Cuadrculamedia3-nfasis3">
     <w:name w:val="Medium Grid 3 Accent 3"/>
-    <w:basedOn w:val="TableNormal"/>
+    <w:basedOn w:val="Tablanormal"/>
     <w:uiPriority w:val="69"/>
     <w:rsid w:val="00CB0664"/>
     <w:pPr>
@@ -10988,9 +11500,9 @@
       </w:tcPr>
     </w:tblStylePr>
   </w:style>
-  <w:style w:type="table" w:styleId="MediumGrid3-Accent4">
+  <w:style w:type="table" w:styleId="Cuadrculamedia3-nfasis4">
     <w:name w:val="Medium Grid 3 Accent 4"/>
-    <w:basedOn w:val="TableNormal"/>
+    <w:basedOn w:val="Tablanormal"/>
     <w:uiPriority w:val="69"/>
     <w:rsid w:val="00CB0664"/>
     <w:pPr>
@@ -11122,9 +11634,9 @@
       </w:tcPr>
     </w:tblStylePr>
   </w:style>
-  <w:style w:type="table" w:styleId="MediumGrid3-Accent5">
+  <w:style w:type="table" w:styleId="Cuadrculamedia3-nfasis5">
     <w:name w:val="Medium Grid 3 Accent 5"/>
-    <w:basedOn w:val="TableNormal"/>
+    <w:basedOn w:val="Tablanormal"/>
     <w:uiPriority w:val="69"/>
     <w:rsid w:val="00CB0664"/>
     <w:pPr>
@@ -11256,9 +11768,9 @@
       </w:tcPr>
     </w:tblStylePr>
   </w:style>
-  <w:style w:type="table" w:styleId="MediumGrid3-Accent6">
+  <w:style w:type="table" w:styleId="Cuadrculamedia3-nfasis6">
     <w:name w:val="Medium Grid 3 Accent 6"/>
-    <w:basedOn w:val="TableNormal"/>
+    <w:basedOn w:val="Tablanormal"/>
     <w:uiPriority w:val="69"/>
     <w:rsid w:val="00CB0664"/>
     <w:pPr>
@@ -11390,9 +11902,9 @@
       </w:tcPr>
     </w:tblStylePr>
   </w:style>
-  <w:style w:type="table" w:styleId="DarkList">
+  <w:style w:type="table" w:styleId="Listaoscura">
     <w:name w:val="Dark List"/>
-    <w:basedOn w:val="TableNormal"/>
+    <w:basedOn w:val="Tablanormal"/>
     <w:uiPriority w:val="70"/>
     <w:rsid w:val="00CB0664"/>
     <w:pPr>
@@ -11497,9 +12009,9 @@
       </w:tcPr>
     </w:tblStylePr>
   </w:style>
-  <w:style w:type="table" w:styleId="DarkList-Accent1">
+  <w:style w:type="table" w:styleId="Listaoscura-nfasis1">
     <w:name w:val="Dark List Accent 1"/>
-    <w:basedOn w:val="TableNormal"/>
+    <w:basedOn w:val="Tablanormal"/>
     <w:uiPriority w:val="70"/>
     <w:rsid w:val="00CB0664"/>
     <w:pPr>
@@ -11604,9 +12116,9 @@
       </w:tcPr>
     </w:tblStylePr>
   </w:style>
-  <w:style w:type="table" w:styleId="DarkList-Accent2">
+  <w:style w:type="table" w:styleId="Listaoscura-nfasis2">
     <w:name w:val="Dark List Accent 2"/>
-    <w:basedOn w:val="TableNormal"/>
+    <w:basedOn w:val="Tablanormal"/>
     <w:uiPriority w:val="70"/>
     <w:rsid w:val="00CB0664"/>
     <w:pPr>
@@ -11711,9 +12223,9 @@
       </w:tcPr>
     </w:tblStylePr>
   </w:style>
-  <w:style w:type="table" w:styleId="DarkList-Accent3">
+  <w:style w:type="table" w:styleId="Listaoscura-nfasis3">
     <w:name w:val="Dark List Accent 3"/>
-    <w:basedOn w:val="TableNormal"/>
+    <w:basedOn w:val="Tablanormal"/>
     <w:uiPriority w:val="70"/>
     <w:rsid w:val="00CB0664"/>
     <w:pPr>
@@ -11818,9 +12330,9 @@
       </w:tcPr>
     </w:tblStylePr>
   </w:style>
-  <w:style w:type="table" w:styleId="DarkList-Accent4">
+  <w:style w:type="table" w:styleId="Listaoscura-nfasis4">
     <w:name w:val="Dark List Accent 4"/>
-    <w:basedOn w:val="TableNormal"/>
+    <w:basedOn w:val="Tablanormal"/>
     <w:uiPriority w:val="70"/>
     <w:rsid w:val="00CB0664"/>
     <w:pPr>
@@ -11925,9 +12437,9 @@
       </w:tcPr>
     </w:tblStylePr>
   </w:style>
-  <w:style w:type="table" w:styleId="DarkList-Accent5">
+  <w:style w:type="table" w:styleId="Listaoscura-nfasis5">
     <w:name w:val="Dark List Accent 5"/>
-    <w:basedOn w:val="TableNormal"/>
+    <w:basedOn w:val="Tablanormal"/>
     <w:uiPriority w:val="70"/>
     <w:rsid w:val="00CB0664"/>
     <w:pPr>
@@ -12032,9 +12544,9 @@
       </w:tcPr>
     </w:tblStylePr>
   </w:style>
-  <w:style w:type="table" w:styleId="DarkList-Accent6">
+  <w:style w:type="table" w:styleId="Listaoscura-nfasis6">
     <w:name w:val="Dark List Accent 6"/>
-    <w:basedOn w:val="TableNormal"/>
+    <w:basedOn w:val="Tablanormal"/>
     <w:uiPriority w:val="70"/>
     <w:rsid w:val="00CB0664"/>
     <w:pPr>
@@ -12139,9 +12651,9 @@
       </w:tcPr>
     </w:tblStylePr>
   </w:style>
-  <w:style w:type="table" w:styleId="ColorfulShading">
+  <w:style w:type="table" w:styleId="Sombreadovistoso">
     <w:name w:val="Colorful Shading"/>
-    <w:basedOn w:val="TableNormal"/>
+    <w:basedOn w:val="Tablanormal"/>
     <w:uiPriority w:val="71"/>
     <w:rsid w:val="00CB0664"/>
     <w:pPr>
@@ -12254,9 +12766,9 @@
       </w:rPr>
     </w:tblStylePr>
   </w:style>
-  <w:style w:type="table" w:styleId="ColorfulShading-Accent1">
+  <w:style w:type="table" w:styleId="Sombreadovistoso-nfasis1">
     <w:name w:val="Colorful Shading Accent 1"/>
-    <w:basedOn w:val="TableNormal"/>
+    <w:basedOn w:val="Tablanormal"/>
     <w:uiPriority w:val="71"/>
     <w:rsid w:val="00CB0664"/>
     <w:pPr>
@@ -12369,9 +12881,9 @@
       </w:rPr>
     </w:tblStylePr>
   </w:style>
-  <w:style w:type="table" w:styleId="ColorfulShading-Accent2">
+  <w:style w:type="table" w:styleId="Sombreadovistoso-nfasis2">
     <w:name w:val="Colorful Shading Accent 2"/>
-    <w:basedOn w:val="TableNormal"/>
+    <w:basedOn w:val="Tablanormal"/>
     <w:uiPriority w:val="71"/>
     <w:rsid w:val="00CB0664"/>
     <w:pPr>
@@ -12484,9 +12996,9 @@
       </w:rPr>
     </w:tblStylePr>
   </w:style>
-  <w:style w:type="table" w:styleId="ColorfulShading-Accent3">
+  <w:style w:type="table" w:styleId="Sombreadovistoso-nfasis3">
     <w:name w:val="Colorful Shading Accent 3"/>
-    <w:basedOn w:val="TableNormal"/>
+    <w:basedOn w:val="Tablanormal"/>
     <w:uiPriority w:val="71"/>
     <w:rsid w:val="00CB0664"/>
     <w:pPr>
@@ -12589,9 +13101,9 @@
       </w:tcPr>
     </w:tblStylePr>
   </w:style>
-  <w:style w:type="table" w:styleId="ColorfulShading-Accent4">
+  <w:style w:type="table" w:styleId="Sombreadovistoso-nfasis4">
     <w:name w:val="Colorful Shading Accent 4"/>
-    <w:basedOn w:val="TableNormal"/>
+    <w:basedOn w:val="Tablanormal"/>
     <w:uiPriority w:val="71"/>
     <w:rsid w:val="00CB0664"/>
     <w:pPr>
@@ -12704,9 +13216,9 @@
       </w:rPr>
     </w:tblStylePr>
   </w:style>
-  <w:style w:type="table" w:styleId="ColorfulShading-Accent5">
+  <w:style w:type="table" w:styleId="Sombreadovistoso-nfasis5">
     <w:name w:val="Colorful Shading Accent 5"/>
-    <w:basedOn w:val="TableNormal"/>
+    <w:basedOn w:val="Tablanormal"/>
     <w:uiPriority w:val="71"/>
     <w:rsid w:val="00CB0664"/>
     <w:pPr>
@@ -12819,9 +13331,9 @@
       </w:rPr>
     </w:tblStylePr>
   </w:style>
-  <w:style w:type="table" w:styleId="ColorfulShading-Accent6">
+  <w:style w:type="table" w:styleId="Sombreadovistoso-nfasis6">
     <w:name w:val="Colorful Shading Accent 6"/>
-    <w:basedOn w:val="TableNormal"/>
+    <w:basedOn w:val="Tablanormal"/>
     <w:uiPriority w:val="71"/>
     <w:rsid w:val="00CB0664"/>
     <w:pPr>
@@ -12934,9 +13446,9 @@
       </w:rPr>
     </w:tblStylePr>
   </w:style>
-  <w:style w:type="table" w:styleId="ColorfulList">
+  <w:style w:type="table" w:styleId="Listavistosa">
     <w:name w:val="Colorful List"/>
-    <w:basedOn w:val="TableNormal"/>
+    <w:basedOn w:val="Tablanormal"/>
     <w:uiPriority w:val="72"/>
     <w:rsid w:val="00CB0664"/>
     <w:pPr>
@@ -13013,9 +13525,9 @@
       </w:tcPr>
     </w:tblStylePr>
   </w:style>
-  <w:style w:type="table" w:styleId="ColorfulList-Accent1">
+  <w:style w:type="table" w:styleId="Listavistosa-nfasis1">
     <w:name w:val="Colorful List Accent 1"/>
-    <w:basedOn w:val="TableNormal"/>
+    <w:basedOn w:val="Tablanormal"/>
     <w:uiPriority w:val="72"/>
     <w:rsid w:val="00CB0664"/>
     <w:pPr>
@@ -13092,9 +13604,9 @@
       </w:tcPr>
     </w:tblStylePr>
   </w:style>
-  <w:style w:type="table" w:styleId="ColorfulList-Accent2">
+  <w:style w:type="table" w:styleId="Listavistosa-nfasis2">
     <w:name w:val="Colorful List Accent 2"/>
-    <w:basedOn w:val="TableNormal"/>
+    <w:basedOn w:val="Tablanormal"/>
     <w:uiPriority w:val="72"/>
     <w:rsid w:val="00CB0664"/>
     <w:pPr>
@@ -13171,9 +13683,9 @@
       </w:tcPr>
     </w:tblStylePr>
   </w:style>
-  <w:style w:type="table" w:styleId="ColorfulList-Accent3">
+  <w:style w:type="table" w:styleId="Listavistosa-nfasis3">
     <w:name w:val="Colorful List Accent 3"/>
-    <w:basedOn w:val="TableNormal"/>
+    <w:basedOn w:val="Tablanormal"/>
     <w:uiPriority w:val="72"/>
     <w:rsid w:val="00CB0664"/>
     <w:pPr>
@@ -13250,9 +13762,9 @@
       </w:tcPr>
     </w:tblStylePr>
   </w:style>
-  <w:style w:type="table" w:styleId="ColorfulList-Accent4">
+  <w:style w:type="table" w:styleId="Listavistosa-nfasis4">
     <w:name w:val="Colorful List Accent 4"/>
-    <w:basedOn w:val="TableNormal"/>
+    <w:basedOn w:val="Tablanormal"/>
     <w:uiPriority w:val="72"/>
     <w:rsid w:val="00CB0664"/>
     <w:pPr>
@@ -13329,9 +13841,9 @@
       </w:tcPr>
     </w:tblStylePr>
   </w:style>
-  <w:style w:type="table" w:styleId="ColorfulList-Accent5">
+  <w:style w:type="table" w:styleId="Listavistosa-nfasis5">
     <w:name w:val="Colorful List Accent 5"/>
-    <w:basedOn w:val="TableNormal"/>
+    <w:basedOn w:val="Tablanormal"/>
     <w:uiPriority w:val="72"/>
     <w:rsid w:val="00CB0664"/>
     <w:pPr>
@@ -13408,9 +13920,9 @@
       </w:tcPr>
     </w:tblStylePr>
   </w:style>
-  <w:style w:type="table" w:styleId="ColorfulList-Accent6">
+  <w:style w:type="table" w:styleId="Listavistosa-nfasis6">
     <w:name w:val="Colorful List Accent 6"/>
-    <w:basedOn w:val="TableNormal"/>
+    <w:basedOn w:val="Tablanormal"/>
     <w:uiPriority w:val="72"/>
     <w:rsid w:val="00CB0664"/>
     <w:pPr>
@@ -13487,9 +13999,9 @@
       </w:tcPr>
     </w:tblStylePr>
   </w:style>
-  <w:style w:type="table" w:styleId="ColorfulGrid">
+  <w:style w:type="table" w:styleId="Cuadrculavistosa">
     <w:name w:val="Colorful Grid"/>
-    <w:basedOn w:val="TableNormal"/>
+    <w:basedOn w:val="Tablanormal"/>
     <w:uiPriority w:val="73"/>
     <w:rsid w:val="00CB0664"/>
     <w:pPr>
@@ -13560,9 +14072,9 @@
       </w:tcPr>
     </w:tblStylePr>
   </w:style>
-  <w:style w:type="table" w:styleId="ColorfulGrid-Accent1">
+  <w:style w:type="table" w:styleId="Cuadrculavistosa-nfasis1">
     <w:name w:val="Colorful Grid Accent 1"/>
-    <w:basedOn w:val="TableNormal"/>
+    <w:basedOn w:val="Tablanormal"/>
     <w:uiPriority w:val="73"/>
     <w:rsid w:val="00CB0664"/>
     <w:pPr>
@@ -13633,9 +14145,9 @@
       </w:tcPr>
     </w:tblStylePr>
   </w:style>
-  <w:style w:type="table" w:styleId="ColorfulGrid-Accent2">
+  <w:style w:type="table" w:styleId="Cuadrculavistosa-nfasis2">
     <w:name w:val="Colorful Grid Accent 2"/>
-    <w:basedOn w:val="TableNormal"/>
+    <w:basedOn w:val="Tablanormal"/>
     <w:uiPriority w:val="73"/>
     <w:rsid w:val="00CB0664"/>
     <w:pPr>
@@ -13706,9 +14218,9 @@
       </w:tcPr>
     </w:tblStylePr>
   </w:style>
-  <w:style w:type="table" w:styleId="ColorfulGrid-Accent3">
+  <w:style w:type="table" w:styleId="Cuadrculavistosa-nfasis3">
     <w:name w:val="Colorful Grid Accent 3"/>
-    <w:basedOn w:val="TableNormal"/>
+    <w:basedOn w:val="Tablanormal"/>
     <w:uiPriority w:val="73"/>
     <w:rsid w:val="00CB0664"/>
     <w:pPr>
@@ -13779,9 +14291,9 @@
       </w:tcPr>
     </w:tblStylePr>
   </w:style>
-  <w:style w:type="table" w:styleId="ColorfulGrid-Accent4">
+  <w:style w:type="table" w:styleId="Cuadrculavistosa-nfasis4">
     <w:name w:val="Colorful Grid Accent 4"/>
-    <w:basedOn w:val="TableNormal"/>
+    <w:basedOn w:val="Tablanormal"/>
     <w:uiPriority w:val="73"/>
     <w:rsid w:val="00CB0664"/>
     <w:pPr>
@@ -13852,9 +14364,9 @@
       </w:tcPr>
     </w:tblStylePr>
   </w:style>
-  <w:style w:type="table" w:styleId="ColorfulGrid-Accent5">
+  <w:style w:type="table" w:styleId="Cuadrculavistosa-nfasis5">
     <w:name w:val="Colorful Grid Accent 5"/>
-    <w:basedOn w:val="TableNormal"/>
+    <w:basedOn w:val="Tablanormal"/>
     <w:uiPriority w:val="73"/>
     <w:rsid w:val="00CB0664"/>
     <w:pPr>
@@ -13925,9 +14437,9 @@
       </w:tcPr>
     </w:tblStylePr>
   </w:style>
-  <w:style w:type="table" w:styleId="ColorfulGrid-Accent6">
+  <w:style w:type="table" w:styleId="Cuadrculavistosa-nfasis6">
     <w:name w:val="Colorful Grid Accent 6"/>
-    <w:basedOn w:val="TableNormal"/>
+    <w:basedOn w:val="Tablanormal"/>
     <w:uiPriority w:val="73"/>
     <w:rsid w:val="00CB0664"/>
     <w:pPr>
@@ -13997,6 +14509,11 @@
         <w:shd w:val="clear" w:color="auto" w:fill="FBCAA2" w:themeFill="accent6" w:themeFillTint="7F"/>
       </w:tcPr>
     </w:tblStylePr>
+  </w:style>
+  <w:style w:type="character" w:customStyle="1" w:styleId="source-title">
+    <w:name w:val="source-title"/>
+    <w:basedOn w:val="Fuentedeprrafopredeter"/>
+    <w:rsid w:val="00697533"/>
   </w:style>
 </w:styles>
 </file>

</xml_diff>

<commit_message>
Task 3 almost done
</commit_message>
<xml_diff>
--- a/Practica 3/Ladder Design Timers REV02.docx
+++ b/Practica 3/Ladder Design Timers REV02.docx
@@ -192,7 +192,21 @@
           <w:sz w:val="24"/>
           <w:szCs w:val="24"/>
         </w:rPr>
-        <w:t>: To be confirmed during the semester</w:t>
+        <w:t xml:space="preserve">: </w:t>
+      </w:r>
+      <w:r>
+        <w:rPr>
+          <w:sz w:val="24"/>
+          <w:szCs w:val="24"/>
+        </w:rPr>
+        <w:t>30</w:t>
+      </w:r>
+      <w:r>
+        <w:rPr>
+          <w:sz w:val="24"/>
+          <w:szCs w:val="24"/>
+        </w:rPr>
+        <w:t>/10/2026</w:t>
       </w:r>
     </w:p>
     <w:p/>
@@ -583,47 +597,297 @@
       <w:r>
         <w:tab/>
       </w:r>
-      <w:proofErr w:type="gramStart"/>
-      <w:r>
-        <w:rPr>
-          <w:b/>
-          <w:bCs/>
-        </w:rPr>
-        <w:t xml:space="preserve">( </w:t>
-      </w:r>
-      <w:r>
-        <w:rPr>
-          <w:b/>
-          <w:bCs/>
-        </w:rPr>
-        <w:t>2</w:t>
-      </w:r>
-      <w:r>
-        <w:rPr>
-          <w:b/>
-          <w:bCs/>
-        </w:rPr>
-        <w:t>0</w:t>
-      </w:r>
-      <w:proofErr w:type="gramEnd"/>
-      <w:r>
-        <w:rPr>
-          <w:b/>
-          <w:bCs/>
-        </w:rPr>
-        <w:t xml:space="preserve"> Marks)</w:t>
-      </w:r>
     </w:p>
     <w:bookmarkEnd w:id="1"/>
     <w:p>
       <w:pPr>
-        <w:jc w:val="right"/>
-      </w:pPr>
+        <w:keepNext/>
+        <w:jc w:val="center"/>
+      </w:pPr>
+      <w:r>
+        <w:lastRenderedPageBreak/>
+        <w:drawing>
+          <wp:inline distT="0" distB="0" distL="0" distR="0" wp14:anchorId="7261ABA4" wp14:editId="3750E85A">
+            <wp:extent cx="5486400" cy="2915920"/>
+            <wp:effectExtent l="0" t="0" r="0" b="0"/>
+            <wp:docPr id="642961137" name="Imagen 1"/>
+            <wp:cNvGraphicFramePr>
+              <a:graphicFrameLocks xmlns:a="http://schemas.openxmlformats.org/drawingml/2006/main" noChangeAspect="1"/>
+            </wp:cNvGraphicFramePr>
+            <a:graphic xmlns:a="http://schemas.openxmlformats.org/drawingml/2006/main">
+              <a:graphicData uri="http://schemas.openxmlformats.org/drawingml/2006/picture">
+                <pic:pic xmlns:pic="http://schemas.openxmlformats.org/drawingml/2006/picture">
+                  <pic:nvPicPr>
+                    <pic:cNvPr id="642961137" name=""/>
+                    <pic:cNvPicPr/>
+                  </pic:nvPicPr>
+                  <pic:blipFill>
+                    <a:blip r:embed="rId10"/>
+                    <a:stretch>
+                      <a:fillRect/>
+                    </a:stretch>
+                  </pic:blipFill>
+                  <pic:spPr>
+                    <a:xfrm>
+                      <a:off x="0" y="0"/>
+                      <a:ext cx="5486400" cy="2915920"/>
+                    </a:xfrm>
+                    <a:prstGeom prst="rect">
+                      <a:avLst/>
+                    </a:prstGeom>
+                  </pic:spPr>
+                </pic:pic>
+              </a:graphicData>
+            </a:graphic>
+          </wp:inline>
+        </w:drawing>
+      </w:r>
     </w:p>
     <w:p>
       <w:pPr>
-        <w:jc w:val="right"/>
-      </w:pPr>
+        <w:pStyle w:val="Descripcin"/>
+        <w:jc w:val="center"/>
+      </w:pPr>
+      <w:r>
+        <w:t xml:space="preserve">Figure </w:t>
+      </w:r>
+      <w:r>
+        <w:fldChar w:fldCharType="begin"/>
+      </w:r>
+      <w:r>
+        <w:instrText xml:space="preserve"> SEQ Figure \* ARABIC </w:instrText>
+      </w:r>
+      <w:r>
+        <w:fldChar w:fldCharType="separate"/>
+      </w:r>
+      <w:r>
+        <w:rPr>
+          <w:noProof/>
+        </w:rPr>
+        <w:t>1</w:t>
+      </w:r>
+      <w:r>
+        <w:fldChar w:fldCharType="end"/>
+      </w:r>
+      <w:r>
+        <w:t>: Exercise 1 Test</w:t>
+      </w:r>
+    </w:p>
+    <w:p/>
+    <w:p>
+      <w:pPr>
+        <w:rPr>
+          <w:lang w:val="en-GB"/>
+        </w:rPr>
+      </w:pPr>
+      <w:r>
+        <w:rPr>
+          <w:b/>
+          <w:bCs/>
+          <w:lang w:val="en-GB"/>
+        </w:rPr>
+        <w:t>Line 0</w:t>
+      </w:r>
+      <w:r>
+        <w:rPr>
+          <w:b/>
+          <w:bCs/>
+          <w:lang w:val="en-GB"/>
+        </w:rPr>
+        <w:t xml:space="preserve">: </w:t>
+      </w:r>
+      <w:r>
+        <w:rPr>
+          <w:lang w:val="en-GB"/>
+        </w:rPr>
+        <w:t>Input X</w:t>
+      </w:r>
+      <w:r>
+        <w:rPr>
+          <w:lang w:val="en-GB"/>
+        </w:rPr>
+        <w:t>0</w:t>
+      </w:r>
+      <w:r>
+        <w:rPr>
+          <w:lang w:val="en-GB"/>
+        </w:rPr>
+        <w:t xml:space="preserve"> is configured as a rising-edge pulse contact connected to the SET Y</w:t>
+      </w:r>
+      <w:r>
+        <w:rPr>
+          <w:lang w:val="en-GB"/>
+        </w:rPr>
+        <w:t xml:space="preserve">0 </w:t>
+      </w:r>
+      <w:r>
+        <w:rPr>
+          <w:lang w:val="en-GB"/>
+        </w:rPr>
+        <w:t xml:space="preserve">instruction. When pushbutton X000 is pressed, this contact only allows power to pass for a single scan cycle on the rising edge. This momentary pulse sets and latches lamp Y0 </w:t>
+      </w:r>
+      <w:r>
+        <w:rPr>
+          <w:lang w:val="en-GB"/>
+        </w:rPr>
+        <w:t>on</w:t>
+      </w:r>
+      <w:r>
+        <w:rPr>
+          <w:lang w:val="en-GB"/>
+        </w:rPr>
+        <w:t xml:space="preserve"> immediately. Because X0 only triggers on the rising edge, holding the button down for more than 10 seconds will not keep sending power to the SET instruction. </w:t>
+      </w:r>
+    </w:p>
+    <w:p>
+      <w:pPr>
+        <w:rPr>
+          <w:lang w:val="en-GB"/>
+        </w:rPr>
+      </w:pPr>
+      <w:r>
+        <w:rPr>
+          <w:b/>
+          <w:bCs/>
+          <w:lang w:val="en-GB"/>
+        </w:rPr>
+        <w:t xml:space="preserve">Line </w:t>
+      </w:r>
+      <w:r>
+        <w:rPr>
+          <w:b/>
+          <w:bCs/>
+          <w:lang w:val="en-GB"/>
+        </w:rPr>
+        <w:t>3</w:t>
+      </w:r>
+      <w:r>
+        <w:rPr>
+          <w:b/>
+          <w:bCs/>
+          <w:lang w:val="en-GB"/>
+        </w:rPr>
+        <w:t xml:space="preserve">: </w:t>
+      </w:r>
+      <w:r>
+        <w:rPr>
+          <w:lang w:val="en-GB"/>
+        </w:rPr>
+        <w:t>A N</w:t>
+      </w:r>
+      <w:r>
+        <w:rPr>
+          <w:lang w:val="en-GB"/>
+        </w:rPr>
+        <w:t>O</w:t>
+      </w:r>
+      <w:r>
+        <w:rPr>
+          <w:lang w:val="en-GB"/>
+        </w:rPr>
+        <w:t xml:space="preserve"> contact of Y</w:t>
+      </w:r>
+      <w:r>
+        <w:rPr>
+          <w:lang w:val="en-GB"/>
+        </w:rPr>
+        <w:t>0</w:t>
+      </w:r>
+      <w:r>
+        <w:rPr>
+          <w:lang w:val="en-GB"/>
+        </w:rPr>
+        <w:t xml:space="preserve"> is connected to timer T0 with a preset value of 100</w:t>
+      </w:r>
+      <w:r>
+        <w:rPr>
+          <w:lang w:val="en-GB"/>
+        </w:rPr>
+        <w:t xml:space="preserve">. </w:t>
+      </w:r>
+      <w:r>
+        <w:rPr>
+          <w:lang w:val="en-GB"/>
+        </w:rPr>
+        <w:t xml:space="preserve">While lamp Y0 is latched ON, its contact stays closed and powers T0 </w:t>
+      </w:r>
+      <w:proofErr w:type="gramStart"/>
+      <w:r>
+        <w:rPr>
+          <w:lang w:val="en-GB"/>
+        </w:rPr>
+        <w:t>continuously</w:t>
+      </w:r>
+      <w:proofErr w:type="gramEnd"/>
+      <w:r>
+        <w:rPr>
+          <w:lang w:val="en-GB"/>
+        </w:rPr>
+        <w:t xml:space="preserve"> so it </w:t>
+      </w:r>
+      <w:proofErr w:type="gramStart"/>
+      <w:r>
+        <w:rPr>
+          <w:lang w:val="en-GB"/>
+        </w:rPr>
+        <w:t>counts up</w:t>
+      </w:r>
+      <w:proofErr w:type="gramEnd"/>
+      <w:r>
+        <w:rPr>
+          <w:lang w:val="en-GB"/>
+        </w:rPr>
+        <w:t xml:space="preserve"> to 100. </w:t>
+      </w:r>
+    </w:p>
+    <w:p>
+      <w:pPr>
+        <w:rPr>
+          <w:lang w:val="en-GB"/>
+        </w:rPr>
+      </w:pPr>
+      <w:r>
+        <w:rPr>
+          <w:b/>
+          <w:bCs/>
+          <w:lang w:val="en-GB"/>
+        </w:rPr>
+        <w:t xml:space="preserve">Line </w:t>
+      </w:r>
+      <w:r>
+        <w:rPr>
+          <w:b/>
+          <w:bCs/>
+          <w:lang w:val="en-GB"/>
+        </w:rPr>
+        <w:t>7</w:t>
+      </w:r>
+      <w:r>
+        <w:rPr>
+          <w:b/>
+          <w:bCs/>
+          <w:lang w:val="en-GB"/>
+        </w:rPr>
+        <w:t xml:space="preserve">: </w:t>
+      </w:r>
+      <w:r>
+        <w:rPr>
+          <w:lang w:val="en-GB"/>
+        </w:rPr>
+        <w:t xml:space="preserve">A Normally Open contact of timer T0 is connected to the RST Y0 instruction. Once 10 seconds have </w:t>
+      </w:r>
+      <w:r>
+        <w:rPr>
+          <w:lang w:val="en-GB"/>
+        </w:rPr>
+        <w:t>passed</w:t>
+      </w:r>
+      <w:r>
+        <w:rPr>
+          <w:lang w:val="en-GB"/>
+        </w:rPr>
+        <w:t xml:space="preserve">, T0 reaches K100 and closes its contact, which resets Y0 and turns the lamp OFF. When Y000 turns off, its contact in Rung 2 opens, removing power from T0 and resetting the timer back to 0 automatically. </w:t>
+      </w:r>
     </w:p>
     <w:p/>
     <w:p>
@@ -821,7 +1085,7 @@
                     <pic:cNvPicPr/>
                   </pic:nvPicPr>
                   <pic:blipFill>
-                    <a:blip r:embed="rId10"/>
+                    <a:blip r:embed="rId11"/>
                     <a:stretch>
                       <a:fillRect/>
                     </a:stretch>
@@ -870,72 +1134,510 @@
       </w:r>
     </w:p>
     <w:p>
-      <w:pPr>
+      <w:r>
+        <w:tab/>
+      </w:r>
+      <w:r>
+        <w:tab/>
+      </w:r>
+      <w:r>
+        <w:tab/>
+      </w:r>
+      <w:r>
+        <w:tab/>
+      </w:r>
+      <w:r>
+        <w:tab/>
+      </w:r>
+    </w:p>
+    <w:p>
+      <w:pPr>
+        <w:keepNext/>
+        <w:jc w:val="center"/>
+      </w:pPr>
+      <w:r>
         <w:rPr>
           <w:b/>
           <w:bCs/>
         </w:rPr>
-      </w:pPr>
-      <w:r>
-        <w:tab/>
-      </w:r>
-      <w:r>
-        <w:tab/>
-      </w:r>
-      <w:r>
-        <w:tab/>
-      </w:r>
-      <w:r>
-        <w:tab/>
-      </w:r>
-      <w:r>
-        <w:tab/>
-      </w:r>
-      <w:r>
-        <w:tab/>
-      </w:r>
-      <w:r>
-        <w:tab/>
-      </w:r>
-      <w:r>
-        <w:tab/>
-      </w:r>
-      <w:r>
-        <w:tab/>
-      </w:r>
-      <w:proofErr w:type="gramStart"/>
+        <w:lastRenderedPageBreak/>
+        <w:drawing>
+          <wp:inline distT="0" distB="0" distL="0" distR="0" wp14:anchorId="47794FFB" wp14:editId="5CB65C99">
+            <wp:extent cx="5486400" cy="2910205"/>
+            <wp:effectExtent l="0" t="0" r="0" b="4445"/>
+            <wp:docPr id="1418459358" name="Imagen 1"/>
+            <wp:cNvGraphicFramePr>
+              <a:graphicFrameLocks xmlns:a="http://schemas.openxmlformats.org/drawingml/2006/main" noChangeAspect="1"/>
+            </wp:cNvGraphicFramePr>
+            <a:graphic xmlns:a="http://schemas.openxmlformats.org/drawingml/2006/main">
+              <a:graphicData uri="http://schemas.openxmlformats.org/drawingml/2006/picture">
+                <pic:pic xmlns:pic="http://schemas.openxmlformats.org/drawingml/2006/picture">
+                  <pic:nvPicPr>
+                    <pic:cNvPr id="1418459358" name=""/>
+                    <pic:cNvPicPr/>
+                  </pic:nvPicPr>
+                  <pic:blipFill>
+                    <a:blip r:embed="rId12"/>
+                    <a:stretch>
+                      <a:fillRect/>
+                    </a:stretch>
+                  </pic:blipFill>
+                  <pic:spPr>
+                    <a:xfrm>
+                      <a:off x="0" y="0"/>
+                      <a:ext cx="5486400" cy="2910205"/>
+                    </a:xfrm>
+                    <a:prstGeom prst="rect">
+                      <a:avLst/>
+                    </a:prstGeom>
+                  </pic:spPr>
+                </pic:pic>
+              </a:graphicData>
+            </a:graphic>
+          </wp:inline>
+        </w:drawing>
+      </w:r>
+    </w:p>
+    <w:p>
+      <w:pPr>
+        <w:pStyle w:val="Descripcin"/>
+        <w:jc w:val="center"/>
+      </w:pPr>
+      <w:r>
+        <w:t xml:space="preserve">Figure </w:t>
+      </w:r>
+      <w:r>
+        <w:fldChar w:fldCharType="begin"/>
+      </w:r>
+      <w:r>
+        <w:instrText xml:space="preserve"> SEQ Figure \* ARABIC </w:instrText>
+      </w:r>
+      <w:r>
+        <w:fldChar w:fldCharType="separate"/>
+      </w:r>
+      <w:r>
+        <w:rPr>
+          <w:noProof/>
+        </w:rPr>
+        <w:t>2</w:t>
+      </w:r>
+      <w:r>
+        <w:fldChar w:fldCharType="end"/>
+      </w:r>
+      <w:r>
+        <w:t>: Exercise 2 Test</w:t>
+      </w:r>
+    </w:p>
+    <w:p/>
+    <w:p>
       <w:r>
         <w:rPr>
           <w:b/>
           <w:bCs/>
         </w:rPr>
-        <w:t xml:space="preserve">( </w:t>
-      </w:r>
+        <w:t>Line 0:</w:t>
+      </w:r>
+      <w:r>
+        <w:t xml:space="preserve"> Input X0</w:t>
+      </w:r>
+      <w:r>
+        <w:t xml:space="preserve"> </w:t>
+      </w:r>
+      <w:r>
+        <w:t>and timer T3 are placed in parallel to trigger SET M1. Pressing X0 starts the first stage</w:t>
+      </w:r>
+      <w:r>
+        <w:t>, M1,</w:t>
+      </w:r>
+      <w:r>
+        <w:t xml:space="preserve"> manually, while the falling edge of the last timer</w:t>
+      </w:r>
+      <w:r>
+        <w:t>, T3,</w:t>
+      </w:r>
+      <w:r>
+        <w:t xml:space="preserve"> sets M1 again at the end of the fourth lamp cycle so the sequence loops forever without pressing X000 again.</w:t>
+      </w:r>
+    </w:p>
+    <w:p>
+      <w:pPr>
+        <w:rPr>
+          <w:lang w:val="en-GB"/>
+        </w:rPr>
+      </w:pPr>
       <w:r>
         <w:rPr>
           <w:b/>
           <w:bCs/>
-        </w:rPr>
-        <w:t>3</w:t>
+          <w:lang w:val="en-GB"/>
+        </w:rPr>
+        <w:t>Lines 5 to 11:</w:t>
       </w:r>
       <w:r>
         <w:rPr>
           <w:b/>
           <w:bCs/>
-        </w:rPr>
-        <w:t>0</w:t>
-      </w:r>
-      <w:proofErr w:type="gramEnd"/>
+          <w:lang w:val="en-GB"/>
+        </w:rPr>
+        <w:t xml:space="preserve"> First Stage</w:t>
+      </w:r>
+    </w:p>
+    <w:p>
+      <w:pPr>
+        <w:numPr>
+          <w:ilvl w:val="0"/>
+          <w:numId w:val="26"/>
+        </w:numPr>
+        <w:rPr>
+          <w:lang w:val="en-GB"/>
+        </w:rPr>
+      </w:pPr>
       <w:r>
         <w:rPr>
           <w:b/>
           <w:bCs/>
-        </w:rPr>
-        <w:t xml:space="preserve"> Marks)</w:t>
+          <w:lang w:val="en-GB"/>
+        </w:rPr>
+        <w:t>Line 5:</w:t>
+      </w:r>
+      <w:r>
+        <w:rPr>
+          <w:lang w:val="en-GB"/>
+        </w:rPr>
+        <w:t xml:space="preserve"> When</w:t>
+      </w:r>
+      <w:r>
+        <w:rPr>
+          <w:lang w:val="en-GB"/>
+        </w:rPr>
+        <w:t xml:space="preserve"> </w:t>
+      </w:r>
+      <w:r>
+        <w:rPr>
+          <w:lang w:val="en-GB"/>
+        </w:rPr>
+        <w:t xml:space="preserve">M1 is active, its </w:t>
+      </w:r>
+      <w:r>
+        <w:rPr>
+          <w:lang w:val="en-GB"/>
+        </w:rPr>
+        <w:t>NO</w:t>
+      </w:r>
+      <w:r>
+        <w:rPr>
+          <w:lang w:val="en-GB"/>
+        </w:rPr>
+        <w:t xml:space="preserve"> contact powers timer T0 with a preset of K20</w:t>
+      </w:r>
+      <w:r>
+        <w:rPr>
+          <w:lang w:val="en-GB"/>
+        </w:rPr>
+        <w:t>, 2 seconds.</w:t>
       </w:r>
     </w:p>
-    <w:bookmarkEnd w:id="3"/>
-    <w:p/>
+    <w:p>
+      <w:pPr>
+        <w:numPr>
+          <w:ilvl w:val="0"/>
+          <w:numId w:val="26"/>
+        </w:numPr>
+        <w:rPr>
+          <w:lang w:val="en-GB"/>
+        </w:rPr>
+      </w:pPr>
+      <w:r>
+        <w:rPr>
+          <w:b/>
+          <w:bCs/>
+          <w:lang w:val="en-GB"/>
+        </w:rPr>
+        <w:t>Line 9:</w:t>
+      </w:r>
+      <w:r>
+        <w:rPr>
+          <w:lang w:val="en-GB"/>
+        </w:rPr>
+        <w:t xml:space="preserve"> Once T0 reaches 2 seconds, its NO contact closes and executes RST M1, turning M1 and T0 off. </w:t>
+      </w:r>
+    </w:p>
+    <w:p>
+      <w:pPr>
+        <w:numPr>
+          <w:ilvl w:val="0"/>
+          <w:numId w:val="26"/>
+        </w:numPr>
+        <w:rPr>
+          <w:lang w:val="en-GB"/>
+        </w:rPr>
+      </w:pPr>
+      <w:r>
+        <w:rPr>
+          <w:b/>
+          <w:bCs/>
+          <w:lang w:val="en-GB"/>
+        </w:rPr>
+        <w:t>Line 11:</w:t>
+      </w:r>
+      <w:r>
+        <w:rPr>
+          <w:lang w:val="en-GB"/>
+        </w:rPr>
+        <w:t xml:space="preserve"> A N</w:t>
+      </w:r>
+      <w:r>
+        <w:rPr>
+          <w:lang w:val="en-GB"/>
+        </w:rPr>
+        <w:t xml:space="preserve">O </w:t>
+      </w:r>
+      <w:r>
+        <w:rPr>
+          <w:lang w:val="en-GB"/>
+        </w:rPr>
+        <w:t>contact of M1 powers output coil Y0, keeping the first lamp ON during the 2 seconds that M1 is active.</w:t>
+      </w:r>
+      <w:bookmarkEnd w:id="3"/>
+    </w:p>
+    <w:p>
+      <w:pPr>
+        <w:rPr>
+          <w:lang w:val="en-GB"/>
+        </w:rPr>
+      </w:pPr>
+      <w:r>
+        <w:rPr>
+          <w:b/>
+          <w:bCs/>
+        </w:rPr>
+        <w:t>Line 13</w:t>
+      </w:r>
+      <w:r>
+        <w:rPr>
+          <w:b/>
+          <w:bCs/>
+        </w:rPr>
+        <w:t xml:space="preserve">: </w:t>
+      </w:r>
+      <w:r>
+        <w:t>A falling-edge pulse contact of timer T0 is connected to SET M2. At the exact moment M1 is reset and T0 drops from ON to OFF, this falling edge triggers SET M2 to start the second lamp stage.</w:t>
+      </w:r>
+    </w:p>
+    <w:p>
+      <w:pPr>
+        <w:rPr>
+          <w:lang w:val="en-GB"/>
+        </w:rPr>
+      </w:pPr>
+      <w:r>
+        <w:rPr>
+          <w:b/>
+          <w:bCs/>
+          <w:lang w:val="en-GB"/>
+        </w:rPr>
+        <w:t>Lines 16 to 46</w:t>
+      </w:r>
+      <w:r>
+        <w:rPr>
+          <w:b/>
+          <w:bCs/>
+          <w:lang w:val="en-GB"/>
+        </w:rPr>
+        <w:t xml:space="preserve">: </w:t>
+      </w:r>
+      <w:r>
+        <w:rPr>
+          <w:lang w:val="en-GB"/>
+        </w:rPr>
+        <w:t xml:space="preserve">The remaining lines repeat the exact same 4-rung structure used in </w:t>
+      </w:r>
+      <w:r>
+        <w:rPr>
+          <w:lang w:val="en-GB"/>
+        </w:rPr>
+        <w:t xml:space="preserve">first stage </w:t>
+      </w:r>
+      <w:r>
+        <w:rPr>
+          <w:lang w:val="en-GB"/>
+        </w:rPr>
+        <w:t>only changing the internal relay, timer, and output addresses for each 2</w:t>
+      </w:r>
+      <w:r>
+        <w:rPr>
+          <w:lang w:val="en-GB"/>
+        </w:rPr>
+        <w:t xml:space="preserve"> </w:t>
+      </w:r>
+      <w:r>
+        <w:rPr>
+          <w:lang w:val="en-GB"/>
+        </w:rPr>
+        <w:t xml:space="preserve">second step: </w:t>
+      </w:r>
+    </w:p>
+    <w:p>
+      <w:pPr>
+        <w:numPr>
+          <w:ilvl w:val="0"/>
+          <w:numId w:val="27"/>
+        </w:numPr>
+        <w:rPr>
+          <w:lang w:val="en-GB"/>
+        </w:rPr>
+      </w:pPr>
+      <w:r>
+        <w:rPr>
+          <w:b/>
+          <w:bCs/>
+          <w:lang w:val="en-GB"/>
+        </w:rPr>
+        <w:t>Stage 2:</w:t>
+      </w:r>
+      <w:r>
+        <w:rPr>
+          <w:lang w:val="en-GB"/>
+        </w:rPr>
+        <w:t xml:space="preserve"> M2 powers timer T1 and turns on lamp </w:t>
+      </w:r>
+      <w:r>
+        <w:rPr>
+          <w:lang w:val="en-GB"/>
+        </w:rPr>
+        <w:t>Y1</w:t>
+      </w:r>
+      <w:r>
+        <w:rPr>
+          <w:lang w:val="en-GB"/>
+        </w:rPr>
+        <w:t xml:space="preserve"> for 2 seconds. When T1 finishes, it resets M2 and its falling edge</w:t>
+      </w:r>
+      <w:r>
+        <w:rPr>
+          <w:lang w:val="en-GB"/>
+        </w:rPr>
+        <w:t xml:space="preserve"> </w:t>
+      </w:r>
+      <w:r>
+        <w:rPr>
+          <w:lang w:val="en-GB"/>
+        </w:rPr>
+        <w:t xml:space="preserve">triggers SET M3. </w:t>
+      </w:r>
+    </w:p>
+    <w:p>
+      <w:pPr>
+        <w:numPr>
+          <w:ilvl w:val="0"/>
+          <w:numId w:val="27"/>
+        </w:numPr>
+        <w:rPr>
+          <w:lang w:val="en-GB"/>
+        </w:rPr>
+      </w:pPr>
+      <w:r>
+        <w:rPr>
+          <w:b/>
+          <w:bCs/>
+          <w:lang w:val="en-GB"/>
+        </w:rPr>
+        <w:t>Stage 3:</w:t>
+      </w:r>
+      <w:r>
+        <w:rPr>
+          <w:lang w:val="en-GB"/>
+        </w:rPr>
+        <w:t xml:space="preserve"> M3 powers timer T2 and turns on lamp </w:t>
+      </w:r>
+      <w:r>
+        <w:rPr>
+          <w:lang w:val="en-GB"/>
+        </w:rPr>
+        <w:t>Y2</w:t>
+      </w:r>
+      <w:r>
+        <w:rPr>
+          <w:lang w:val="en-GB"/>
+        </w:rPr>
+        <w:t xml:space="preserve"> for 2 seconds. When T2 finishes, it resets M3</w:t>
+      </w:r>
+      <w:r>
+        <w:rPr>
+          <w:lang w:val="en-GB"/>
+        </w:rPr>
+        <w:t xml:space="preserve"> </w:t>
+      </w:r>
+      <w:r>
+        <w:rPr>
+          <w:lang w:val="en-GB"/>
+        </w:rPr>
+        <w:t xml:space="preserve">and its falling edge triggers SET M4. </w:t>
+      </w:r>
+    </w:p>
+    <w:p>
+      <w:pPr>
+        <w:numPr>
+          <w:ilvl w:val="0"/>
+          <w:numId w:val="27"/>
+        </w:numPr>
+        <w:rPr>
+          <w:lang w:val="en-GB"/>
+        </w:rPr>
+      </w:pPr>
+      <w:r>
+        <w:rPr>
+          <w:b/>
+          <w:bCs/>
+          <w:lang w:val="en-GB"/>
+        </w:rPr>
+        <w:lastRenderedPageBreak/>
+        <w:t>Stage 4:</w:t>
+      </w:r>
+      <w:r>
+        <w:rPr>
+          <w:lang w:val="en-GB"/>
+        </w:rPr>
+        <w:t xml:space="preserve"> M4 powers timer T3 and turns on lamp </w:t>
+      </w:r>
+      <w:r>
+        <w:rPr>
+          <w:lang w:val="en-GB"/>
+        </w:rPr>
+        <w:t>Y3</w:t>
+      </w:r>
+      <w:r>
+        <w:rPr>
+          <w:lang w:val="en-GB"/>
+        </w:rPr>
+        <w:t xml:space="preserve"> for 2 seconds. When T3 reaches K20, it triggers RST M4. As T3 turns off, its falling-edge contact in </w:t>
+      </w:r>
+      <w:r>
+        <w:rPr>
+          <w:lang w:val="en-GB"/>
+        </w:rPr>
+        <w:t>l</w:t>
+      </w:r>
+      <w:r>
+        <w:rPr>
+          <w:lang w:val="en-GB"/>
+        </w:rPr>
+        <w:t>ine 0</w:t>
+      </w:r>
+      <w:r>
+        <w:rPr>
+          <w:lang w:val="en-GB"/>
+        </w:rPr>
+        <w:t xml:space="preserve"> activates SET M1, restarting the entire sequence from Y000 automatically.</w:t>
+      </w:r>
+    </w:p>
+    <w:p>
+      <w:pPr>
+        <w:rPr>
+          <w:lang w:val="en-GB"/>
+        </w:rPr>
+      </w:pPr>
+    </w:p>
     <w:p>
       <w:pPr>
         <w:contextualSpacing/>
@@ -953,7 +1655,6 @@
           <w:sz w:val="28"/>
           <w:szCs w:val="28"/>
         </w:rPr>
-        <w:lastRenderedPageBreak/>
         <w:t xml:space="preserve">Automation Problem </w:t>
       </w:r>
       <w:r>
@@ -1030,7 +1731,7 @@
                     <pic:cNvPicPr/>
                   </pic:nvPicPr>
                   <pic:blipFill>
-                    <a:blip r:embed="rId11"/>
+                    <a:blip r:embed="rId13"/>
                     <a:stretch>
                       <a:fillRect/>
                     </a:stretch>
@@ -1099,6 +1800,7 @@
         <w:rPr>
           <w:noProof/>
         </w:rPr>
+        <w:lastRenderedPageBreak/>
         <w:drawing>
           <wp:inline distT="0" distB="0" distL="0" distR="0" wp14:anchorId="4BB09336" wp14:editId="53D302A9">
             <wp:extent cx="5486400" cy="2842260"/>
@@ -1115,7 +1817,7 @@
                     <pic:cNvPicPr/>
                   </pic:nvPicPr>
                   <pic:blipFill>
-                    <a:blip r:embed="rId12"/>
+                    <a:blip r:embed="rId14"/>
                     <a:stretch>
                       <a:fillRect/>
                     </a:stretch>
@@ -1148,7 +1850,6 @@
     </w:p>
     <w:p>
       <w:r>
-        <w:lastRenderedPageBreak/>
         <w:t>3: Test on Simulator to ensure correct Operation</w:t>
       </w:r>
     </w:p>
@@ -1747,16 +2448,86 @@
     <w:p>
       <w:pPr>
         <w:pStyle w:val="Listaconnmeros"/>
+        <w:keepNext/>
         <w:numPr>
           <w:ilvl w:val="0"/>
           <w:numId w:val="0"/>
         </w:numPr>
         <w:spacing w:line="360" w:lineRule="auto"/>
+        <w:jc w:val="center"/>
+      </w:pPr>
+      <w:r>
+        <w:lastRenderedPageBreak/>
+        <w:drawing>
+          <wp:inline distT="0" distB="0" distL="0" distR="0" wp14:anchorId="719357CC" wp14:editId="6BDD9EC4">
+            <wp:extent cx="5486400" cy="2915920"/>
+            <wp:effectExtent l="0" t="0" r="0" b="0"/>
+            <wp:docPr id="215280614" name="Imagen 1"/>
+            <wp:cNvGraphicFramePr>
+              <a:graphicFrameLocks xmlns:a="http://schemas.openxmlformats.org/drawingml/2006/main" noChangeAspect="1"/>
+            </wp:cNvGraphicFramePr>
+            <a:graphic xmlns:a="http://schemas.openxmlformats.org/drawingml/2006/main">
+              <a:graphicData uri="http://schemas.openxmlformats.org/drawingml/2006/picture">
+                <pic:pic xmlns:pic="http://schemas.openxmlformats.org/drawingml/2006/picture">
+                  <pic:nvPicPr>
+                    <pic:cNvPr id="215280614" name=""/>
+                    <pic:cNvPicPr/>
+                  </pic:nvPicPr>
+                  <pic:blipFill>
+                    <a:blip r:embed="rId15"/>
+                    <a:stretch>
+                      <a:fillRect/>
+                    </a:stretch>
+                  </pic:blipFill>
+                  <pic:spPr>
+                    <a:xfrm>
+                      <a:off x="0" y="0"/>
+                      <a:ext cx="5486400" cy="2915920"/>
+                    </a:xfrm>
+                    <a:prstGeom prst="rect">
+                      <a:avLst/>
+                    </a:prstGeom>
+                  </pic:spPr>
+                </pic:pic>
+              </a:graphicData>
+            </a:graphic>
+          </wp:inline>
+        </w:drawing>
+      </w:r>
+    </w:p>
+    <w:p>
+      <w:pPr>
+        <w:pStyle w:val="Descripcin"/>
+        <w:jc w:val="center"/>
         <w:rPr>
           <w:rFonts w:cstheme="majorHAnsi"/>
           <w:color w:val="365F91" w:themeColor="accent1" w:themeShade="BF"/>
         </w:rPr>
       </w:pPr>
+      <w:r>
+        <w:t xml:space="preserve">Figure </w:t>
+      </w:r>
+      <w:r>
+        <w:fldChar w:fldCharType="begin"/>
+      </w:r>
+      <w:r>
+        <w:instrText xml:space="preserve"> SEQ Figure \* ARABIC </w:instrText>
+      </w:r>
+      <w:r>
+        <w:fldChar w:fldCharType="separate"/>
+      </w:r>
+      <w:r>
+        <w:rPr>
+          <w:noProof/>
+        </w:rPr>
+        <w:t>3</w:t>
+      </w:r>
+      <w:r>
+        <w:fldChar w:fldCharType="end"/>
+      </w:r>
+      <w:r>
+        <w:t>: Exercise 3 Test</w:t>
+      </w:r>
     </w:p>
     <w:p>
       <w:pPr>
@@ -1776,14 +2547,615 @@
     </w:p>
     <w:p>
       <w:pPr>
+        <w:pStyle w:val="Ttulo3"/>
+      </w:pPr>
+      <w:r>
+        <w:t>States and Transitions</w:t>
+      </w:r>
+      <w:r>
+        <w:t xml:space="preserve"> Logic</w:t>
+      </w:r>
+    </w:p>
+    <w:p>
+      <w:pPr>
+        <w:rPr>
+          <w:lang w:val="en-GB"/>
+        </w:rPr>
+      </w:pPr>
+      <w:r>
+        <w:rPr>
+          <w:lang w:val="en-GB"/>
+        </w:rPr>
+        <w:t>Instead of using multiple individual internal relays to track each step, this program uses Data Register</w:t>
+      </w:r>
+      <w:r>
+        <w:rPr>
+          <w:lang w:val="en-GB"/>
+        </w:rPr>
+        <w:t>,</w:t>
+      </w:r>
+      <w:r>
+        <w:rPr>
+          <w:lang w:val="en-GB"/>
+        </w:rPr>
+        <w:t xml:space="preserve"> D0</w:t>
+      </w:r>
+      <w:r>
+        <w:rPr>
+          <w:lang w:val="en-GB"/>
+        </w:rPr>
+        <w:t>,</w:t>
+      </w:r>
+      <w:r>
+        <w:rPr>
+          <w:lang w:val="en-GB"/>
+        </w:rPr>
+        <w:t xml:space="preserve"> as a state machine variable.</w:t>
+      </w:r>
+    </w:p>
+    <w:p>
+      <w:pPr>
+        <w:numPr>
+          <w:ilvl w:val="0"/>
+          <w:numId w:val="28"/>
+        </w:numPr>
+        <w:rPr>
+          <w:lang w:val="en-GB"/>
+        </w:rPr>
+      </w:pPr>
+      <w:r>
+        <w:rPr>
+          <w:lang w:val="en-GB"/>
+        </w:rPr>
+        <w:t>Setting States [MOV K</w:t>
+      </w:r>
+      <w:r>
+        <w:rPr>
+          <w:lang w:val="en-GB"/>
+        </w:rPr>
+        <w:t>x</w:t>
+      </w:r>
+      <w:r>
+        <w:rPr>
+          <w:lang w:val="en-GB"/>
+        </w:rPr>
+        <w:t xml:space="preserve"> D0]: The MOV instruction moves a constant int</w:t>
+      </w:r>
+      <w:r>
+        <w:rPr>
+          <w:lang w:val="en-GB"/>
+        </w:rPr>
+        <w:t>eger</w:t>
+      </w:r>
+      <w:r>
+        <w:rPr>
+          <w:lang w:val="en-GB"/>
+        </w:rPr>
+        <w:t xml:space="preserve">, </w:t>
+      </w:r>
+      <w:r>
+        <w:rPr>
+          <w:lang w:val="en-GB"/>
+        </w:rPr>
+        <w:t>K1 to K6</w:t>
+      </w:r>
+      <w:r>
+        <w:rPr>
+          <w:lang w:val="en-GB"/>
+        </w:rPr>
+        <w:t>,</w:t>
+      </w:r>
+      <w:r>
+        <w:rPr>
+          <w:lang w:val="en-GB"/>
+        </w:rPr>
+        <w:t xml:space="preserve"> into data register D0 to represent which of the 6 traffic light steps is currently active. </w:t>
+      </w:r>
+    </w:p>
+    <w:p>
+      <w:pPr>
+        <w:numPr>
+          <w:ilvl w:val="0"/>
+          <w:numId w:val="28"/>
+        </w:numPr>
+        <w:rPr>
+          <w:lang w:val="en-GB"/>
+        </w:rPr>
+      </w:pPr>
+      <w:r>
+        <w:rPr>
+          <w:lang w:val="en-GB"/>
+        </w:rPr>
+        <w:t xml:space="preserve">Reading States [= D0 Kx]: In-line comparison instructions (= D0 K1, = D0 K2, etc.) check the current number stored inside D0. When the value in D0 matches the constant Kx, the comparison </w:t>
+      </w:r>
+      <w:proofErr w:type="gramStart"/>
+      <w:r>
+        <w:rPr>
+          <w:lang w:val="en-GB"/>
+        </w:rPr>
+        <w:t>contact</w:t>
+      </w:r>
+      <w:proofErr w:type="gramEnd"/>
+      <w:r>
+        <w:rPr>
+          <w:lang w:val="en-GB"/>
+        </w:rPr>
+        <w:t xml:space="preserve"> acts as a closed switch enabling the timer and the specific traffic light outputs required for that step. </w:t>
+      </w:r>
+    </w:p>
+    <w:p>
+      <w:pPr>
+        <w:pStyle w:val="Ttulo3"/>
+        <w:rPr>
+          <w:lang w:val="en-GB"/>
+        </w:rPr>
+      </w:pPr>
+      <w:r>
+        <w:t>Line-by-Line</w:t>
+      </w:r>
+      <w:r>
+        <w:t xml:space="preserve"> explanation:</w:t>
+      </w:r>
+    </w:p>
+    <w:p>
+      <w:pPr>
+        <w:rPr>
+          <w:lang w:val="en-GB"/>
+        </w:rPr>
+      </w:pPr>
+      <w:r>
+        <w:rPr>
+          <w:lang w:val="en-GB"/>
+        </w:rPr>
+        <w:t>Initial State</w:t>
+      </w:r>
+      <w:r>
+        <w:rPr>
+          <w:lang w:val="en-GB"/>
+        </w:rPr>
+        <w:t xml:space="preserve">: </w:t>
+      </w:r>
+      <w:r>
+        <w:rPr>
+          <w:lang w:val="en-GB"/>
+        </w:rPr>
+        <w:t>When the PLC starts, data register D0 initially holds a value of 0. This initial condition</w:t>
+      </w:r>
+      <w:r>
+        <w:rPr>
+          <w:lang w:val="en-GB"/>
+        </w:rPr>
+        <w:t xml:space="preserve">, </w:t>
+      </w:r>
+      <w:r>
+        <w:rPr>
+          <w:lang w:val="en-GB"/>
+        </w:rPr>
+        <w:t>or the completion of Step 6</w:t>
+      </w:r>
+      <w:r>
+        <w:rPr>
+          <w:lang w:val="en-GB"/>
+        </w:rPr>
+        <w:t>,</w:t>
+      </w:r>
+      <w:r>
+        <w:rPr>
+          <w:lang w:val="en-GB"/>
+        </w:rPr>
+        <w:t xml:space="preserve"> executes [MOV K1 D0], placing the traffic light into Step 1 by default so the road is open to vehicles and closed to pedestrians</w:t>
+      </w:r>
+      <w:r>
+        <w:rPr>
+          <w:lang w:val="en-GB"/>
+        </w:rPr>
+        <w:t>.</w:t>
+      </w:r>
+    </w:p>
+    <w:p>
+      <w:pPr>
+        <w:rPr>
+          <w:lang w:val="en-GB"/>
+        </w:rPr>
+      </w:pPr>
+      <w:r>
+        <w:rPr>
+          <w:lang w:val="en-GB"/>
+        </w:rPr>
+        <w:t xml:space="preserve">Transition from Step 1 to Step 2: When the system is in Step 1 and a </w:t>
+      </w:r>
+      <w:proofErr w:type="gramStart"/>
+      <w:r>
+        <w:rPr>
+          <w:lang w:val="en-GB"/>
+        </w:rPr>
+        <w:t>pedestrian presses</w:t>
+      </w:r>
+      <w:proofErr w:type="gramEnd"/>
+      <w:r>
+        <w:rPr>
+          <w:lang w:val="en-GB"/>
+        </w:rPr>
+        <w:t xml:space="preserve"> either pushbutton S1 (X0) OR S2 (X1), the rung executes [MOV K2 D0]. This overwrites D0 with the value 2, immediately transitioning the system to Step 2. </w:t>
+      </w:r>
+    </w:p>
+    <w:p>
+      <w:pPr>
+        <w:rPr>
+          <w:lang w:val="en-GB"/>
+        </w:rPr>
+      </w:pPr>
+      <w:r>
+        <w:rPr>
+          <w:lang w:val="en-GB"/>
+        </w:rPr>
+        <w:lastRenderedPageBreak/>
+        <w:t>Step 2 to Step 6 Timed Transitions: Steps 2 through 6 follow the exact same ladder structure, changing only the state number being compared (= D0 Kx), the timer address and preset time (Tx Kx), and the next state number moved into D0</w:t>
+      </w:r>
+      <w:r>
+        <w:rPr>
+          <w:lang w:val="en-GB"/>
+        </w:rPr>
+        <w:t>:</w:t>
+      </w:r>
+    </w:p>
+    <w:p>
+      <w:pPr>
+        <w:numPr>
+          <w:ilvl w:val="0"/>
+          <w:numId w:val="29"/>
+        </w:numPr>
+        <w:rPr>
+          <w:lang w:val="en-GB"/>
+        </w:rPr>
+      </w:pPr>
+      <w:r>
+        <w:rPr>
+          <w:lang w:val="en-GB"/>
+        </w:rPr>
+        <w:t xml:space="preserve">Step 2: When [= D0 K2] is true, it powers timer T0. Once 8 seconds pass, T0 closes its contact and executes [MOV K3 D0], advancing the state to Step 3. </w:t>
+      </w:r>
+    </w:p>
+    <w:p>
+      <w:pPr>
+        <w:numPr>
+          <w:ilvl w:val="0"/>
+          <w:numId w:val="29"/>
+        </w:numPr>
+        <w:rPr>
+          <w:lang w:val="en-GB"/>
+        </w:rPr>
+      </w:pPr>
+      <w:r>
+        <w:rPr>
+          <w:lang w:val="en-GB"/>
+        </w:rPr>
+        <w:t xml:space="preserve">Step 3: When [= D0 K3] is true, it powers timer T1. After 10 seconds, T1 executes [MOV K4 D0] to transition to Step 4. </w:t>
+      </w:r>
+    </w:p>
+    <w:p>
+      <w:pPr>
+        <w:numPr>
+          <w:ilvl w:val="0"/>
+          <w:numId w:val="29"/>
+        </w:numPr>
+        <w:rPr>
+          <w:lang w:val="en-GB"/>
+        </w:rPr>
+      </w:pPr>
+      <w:r>
+        <w:rPr>
+          <w:lang w:val="en-GB"/>
+        </w:rPr>
+        <w:t xml:space="preserve">Step 4: When [= D0 K4] is true, it powers timer T2. After 30 seconds of green walking time, T2 executes [MOV K5 D0] to move to Step 5. </w:t>
+      </w:r>
+    </w:p>
+    <w:p>
+      <w:pPr>
+        <w:numPr>
+          <w:ilvl w:val="0"/>
+          <w:numId w:val="29"/>
+        </w:numPr>
+        <w:rPr>
+          <w:lang w:val="en-GB"/>
+        </w:rPr>
+      </w:pPr>
+      <w:r>
+        <w:rPr>
+          <w:lang w:val="en-GB"/>
+        </w:rPr>
+        <w:t xml:space="preserve">Step 5: When [= D0 K5] is true, it powers timer T3. </w:t>
+      </w:r>
+      <w:r>
+        <w:rPr>
+          <w:lang w:val="en-GB"/>
+        </w:rPr>
+        <w:t>After</w:t>
+      </w:r>
+      <w:r>
+        <w:rPr>
+          <w:lang w:val="en-GB"/>
+        </w:rPr>
+        <w:t xml:space="preserve"> 5 seconds elapse, T3 executes [MOV K6 D0] to enter Step 6. </w:t>
+      </w:r>
+    </w:p>
+    <w:p>
+      <w:pPr>
+        <w:numPr>
+          <w:ilvl w:val="0"/>
+          <w:numId w:val="29"/>
+        </w:numPr>
+        <w:rPr>
+          <w:lang w:val="en-GB"/>
+        </w:rPr>
+      </w:pPr>
+      <w:r>
+        <w:rPr>
+          <w:lang w:val="en-GB"/>
+        </w:rPr>
+        <w:t>Step 6: When [= D0 K6] is true, it powers timer T4. Once the 3 seconds finish, T4 executes [MOV K1 D0], returning the traffic signal back to Step 1 and waiting for the next pedestrian button press.</w:t>
+      </w:r>
+    </w:p>
+    <w:p>
+      <w:pPr>
+        <w:pStyle w:val="Ttulo3"/>
+        <w:rPr>
+          <w:lang w:val="en-GB"/>
+        </w:rPr>
+      </w:pPr>
+      <w:r>
+        <w:rPr>
+          <w:lang w:val="en-GB"/>
+        </w:rPr>
+        <w:t>Output Control Rungs</w:t>
+      </w:r>
+    </w:p>
+    <w:p>
+      <w:pPr>
+        <w:rPr>
+          <w:lang w:val="en-GB"/>
+        </w:rPr>
+      </w:pPr>
+      <w:r>
+        <w:rPr>
+          <w:lang w:val="en-GB"/>
+        </w:rPr>
+        <w:t>At the bottom of the program, each physical lamp coil is energized in a single rung using parallel branches of the states</w:t>
+      </w:r>
+      <w:r>
+        <w:rPr>
+          <w:lang w:val="en-GB"/>
+        </w:rPr>
+        <w:t xml:space="preserve"> </w:t>
+      </w:r>
+      <w:r>
+        <w:rPr>
+          <w:lang w:val="en-GB"/>
+        </w:rPr>
+        <w:t xml:space="preserve">where that specific light must be ON according to the sequence table: </w:t>
+      </w:r>
+    </w:p>
+    <w:p>
+      <w:pPr>
+        <w:numPr>
+          <w:ilvl w:val="0"/>
+          <w:numId w:val="30"/>
+        </w:numPr>
+        <w:rPr>
+          <w:lang w:val="en-GB"/>
+        </w:rPr>
+      </w:pPr>
+      <w:r>
         <w:rPr>
           <w:b/>
           <w:bCs/>
+          <w:lang w:val="en-GB"/>
+        </w:rPr>
+        <w:t>Y000 (P1 – Vehicle Red):</w:t>
+      </w:r>
+      <w:r>
+        <w:rPr>
+          <w:lang w:val="en-GB"/>
+        </w:rPr>
+        <w:t xml:space="preserve"> Turned ON when D0 is in </w:t>
+      </w:r>
+      <w:r>
+        <w:rPr>
+          <w:lang w:val="en-GB"/>
+        </w:rPr>
+        <w:t xml:space="preserve">Step 3, Step 4, Step 5, or Step 6. </w:t>
+      </w:r>
+    </w:p>
+    <w:p>
+      <w:pPr>
+        <w:numPr>
+          <w:ilvl w:val="0"/>
+          <w:numId w:val="30"/>
+        </w:numPr>
+        <w:rPr>
+          <w:lang w:val="en-GB"/>
+        </w:rPr>
+      </w:pPr>
+      <w:r>
+        <w:rPr>
+          <w:b/>
+          <w:bCs/>
+          <w:lang w:val="en-GB"/>
+        </w:rPr>
+        <w:t>Y001 (P2 – Vehicle Amber):</w:t>
+      </w:r>
+      <w:r>
+        <w:rPr>
+          <w:lang w:val="en-GB"/>
+        </w:rPr>
+        <w:t xml:space="preserve"> Turned ON when D0 is in </w:t>
+      </w:r>
+      <w:r>
+        <w:rPr>
+          <w:lang w:val="en-GB"/>
+        </w:rPr>
+        <w:t>Step 2 or Step 6.</w:t>
+      </w:r>
+      <w:r>
+        <w:rPr>
+          <w:lang w:val="en-GB"/>
+        </w:rPr>
+        <w:t xml:space="preserve"> </w:t>
+      </w:r>
+    </w:p>
+    <w:p>
+      <w:pPr>
+        <w:numPr>
+          <w:ilvl w:val="0"/>
+          <w:numId w:val="30"/>
+        </w:numPr>
+        <w:rPr>
+          <w:lang w:val="en-GB"/>
+        </w:rPr>
+      </w:pPr>
+      <w:r>
+        <w:rPr>
+          <w:b/>
+          <w:bCs/>
+          <w:lang w:val="en-GB"/>
+        </w:rPr>
+        <w:t>Y002 (P3 – Vehicle Green):</w:t>
+      </w:r>
+      <w:r>
+        <w:rPr>
+          <w:lang w:val="en-GB"/>
+        </w:rPr>
+        <w:t xml:space="preserve"> Turned ON only when D0 is in </w:t>
+      </w:r>
+      <w:r>
+        <w:rPr>
+          <w:lang w:val="en-GB"/>
+        </w:rPr>
+        <w:t>Step 1.</w:t>
+      </w:r>
+      <w:r>
+        <w:rPr>
+          <w:lang w:val="en-GB"/>
+        </w:rPr>
+        <w:t xml:space="preserve"> </w:t>
+      </w:r>
+    </w:p>
+    <w:p>
+      <w:pPr>
+        <w:numPr>
+          <w:ilvl w:val="0"/>
+          <w:numId w:val="30"/>
+        </w:numPr>
+        <w:rPr>
+          <w:lang w:val="en-GB"/>
+        </w:rPr>
+      </w:pPr>
+      <w:r>
+        <w:rPr>
+          <w:b/>
+          <w:bCs/>
+          <w:lang w:val="en-GB"/>
+        </w:rPr>
+        <w:t>Y003 (P4 – Pedestrian Red):</w:t>
+      </w:r>
+      <w:r>
+        <w:rPr>
+          <w:lang w:val="en-GB"/>
+        </w:rPr>
+        <w:t xml:space="preserve"> Turned ON when D0 is in </w:t>
+      </w:r>
+      <w:r>
+        <w:rPr>
+          <w:lang w:val="en-GB"/>
+        </w:rPr>
+        <w:t xml:space="preserve">Step 1, Step 2, Step 3, Step 5, or Step 6. </w:t>
+      </w:r>
+    </w:p>
+    <w:p>
+      <w:pPr>
+        <w:numPr>
+          <w:ilvl w:val="0"/>
+          <w:numId w:val="30"/>
+        </w:numPr>
+        <w:rPr>
+          <w:lang w:val="en-GB"/>
+        </w:rPr>
+      </w:pPr>
+      <w:r>
+        <w:rPr>
+          <w:b/>
+          <w:bCs/>
+          <w:lang w:val="en-GB"/>
+        </w:rPr>
+        <w:t>Y004 (P5 – Pedestrian Green):</w:t>
+      </w:r>
+      <w:r>
+        <w:rPr>
+          <w:lang w:val="en-GB"/>
+        </w:rPr>
+        <w:t xml:space="preserve"> Turned ON only when D0 is in </w:t>
+      </w:r>
+      <w:r>
+        <w:rPr>
+          <w:lang w:val="en-GB"/>
+        </w:rPr>
+        <w:t>Step 4</w:t>
+      </w:r>
+      <w:r>
+        <w:rPr>
+          <w:lang w:val="en-GB"/>
+        </w:rPr>
+        <w:t>.</w:t>
+      </w:r>
+    </w:p>
+    <w:p>
+      <w:pPr>
+        <w:pStyle w:val="Ttulo3"/>
+      </w:pPr>
+      <w:r>
+        <w:t xml:space="preserve">Conclusion </w:t>
+      </w:r>
+    </w:p>
+    <w:p>
+      <w:pPr>
+        <w:rPr>
+          <w:lang w:val="en-GB"/>
+        </w:rPr>
+      </w:pPr>
+      <w:r>
+        <w:t xml:space="preserve">During this laboratory </w:t>
+      </w:r>
+      <w:proofErr w:type="gramStart"/>
+      <w:r>
+        <w:t>practical</w:t>
+      </w:r>
+      <w:proofErr w:type="gramEnd"/>
+      <w:r>
+        <w:t xml:space="preserve">, we learned how to design, simulate, and test timer-based sequential Ladder Logic programs on the Mitsubishi FX3G PLC using GX Works2. In Problem 1, combining a rising-edge pulse contact (|↑|) with [SET] and [RST] instructions ensured that the output lamp only stayed on for the exact 10-second duration of timer T0 (K100), preventing the circuit from re-triggering if the start button was held down. In Problem 2, internal relays (M1 to M4) and falling-edge timer contacts (|↓|) were used to build a continuous 2-second chaser loop across four warning lamps. Finally, Problem 3 demonstrated a much cleaner method for programming larger multi-step processes (such as a 6-step pedestrian traffic crossing) by storing the active state number inside a Data Register (D0) with the [MOV] instruction and triggering transitions with = D0 Kx </w:t>
+      </w:r>
+      <w:r>
+        <w:lastRenderedPageBreak/>
+        <w:t>comparators and timers. Using data registers for state control makes complex industrial sequences much easier to read, debug, and modify compared to wiring dozens of individual relay contacts.</w:t>
+      </w:r>
+    </w:p>
+    <w:p>
+      <w:pPr>
+        <w:rPr>
+          <w:lang w:val="en-GB"/>
+        </w:rPr>
+      </w:pPr>
+    </w:p>
+    <w:p>
+      <w:pPr>
+        <w:rPr>
+          <w:b/>
+          <w:bCs/>
+          <w:lang w:val="en-GB"/>
         </w:rPr>
       </w:pPr>
     </w:p>
     <w:sectPr>
-      <w:headerReference w:type="default" r:id="rId13"/>
+      <w:headerReference w:type="default" r:id="rId16"/>
       <w:pgSz w:w="12240" w:h="15840"/>
       <w:pgMar w:top="1440" w:right="1800" w:bottom="1440" w:left="1800" w:header="720" w:footer="720" w:gutter="0"/>
       <w:pgBorders w:offsetFrom="page">
@@ -2372,6 +3744,453 @@
     </w:lvl>
   </w:abstractNum>
   <w:abstractNum w:abstractNumId="12" w15:restartNumberingAfterBreak="0">
+    <w:nsid w:val="2C782A07"/>
+    <w:multiLevelType w:val="multilevel"/>
+    <w:tmpl w:val="094295D0"/>
+    <w:lvl w:ilvl="0">
+      <w:start w:val="1"/>
+      <w:numFmt w:val="bullet"/>
+      <w:lvlText w:val=""/>
+      <w:lvlJc w:val="left"/>
+      <w:pPr>
+        <w:tabs>
+          <w:tab w:val="num" w:pos="720"/>
+        </w:tabs>
+        <w:ind w:left="720" w:hanging="360"/>
+      </w:pPr>
+      <w:rPr>
+        <w:rFonts w:ascii="Symbol" w:hAnsi="Symbol" w:hint="default"/>
+        <w:sz w:val="20"/>
+      </w:rPr>
+    </w:lvl>
+    <w:lvl w:ilvl="1" w:tentative="1">
+      <w:start w:val="1"/>
+      <w:numFmt w:val="bullet"/>
+      <w:lvlText w:val="o"/>
+      <w:lvlJc w:val="left"/>
+      <w:pPr>
+        <w:tabs>
+          <w:tab w:val="num" w:pos="1440"/>
+        </w:tabs>
+        <w:ind w:left="1440" w:hanging="360"/>
+      </w:pPr>
+      <w:rPr>
+        <w:rFonts w:ascii="Courier New" w:hAnsi="Courier New" w:hint="default"/>
+        <w:sz w:val="20"/>
+      </w:rPr>
+    </w:lvl>
+    <w:lvl w:ilvl="2" w:tentative="1">
+      <w:start w:val="1"/>
+      <w:numFmt w:val="bullet"/>
+      <w:lvlText w:val=""/>
+      <w:lvlJc w:val="left"/>
+      <w:pPr>
+        <w:tabs>
+          <w:tab w:val="num" w:pos="2160"/>
+        </w:tabs>
+        <w:ind w:left="2160" w:hanging="360"/>
+      </w:pPr>
+      <w:rPr>
+        <w:rFonts w:ascii="Wingdings" w:hAnsi="Wingdings" w:hint="default"/>
+        <w:sz w:val="20"/>
+      </w:rPr>
+    </w:lvl>
+    <w:lvl w:ilvl="3" w:tentative="1">
+      <w:start w:val="1"/>
+      <w:numFmt w:val="bullet"/>
+      <w:lvlText w:val=""/>
+      <w:lvlJc w:val="left"/>
+      <w:pPr>
+        <w:tabs>
+          <w:tab w:val="num" w:pos="2880"/>
+        </w:tabs>
+        <w:ind w:left="2880" w:hanging="360"/>
+      </w:pPr>
+      <w:rPr>
+        <w:rFonts w:ascii="Wingdings" w:hAnsi="Wingdings" w:hint="default"/>
+        <w:sz w:val="20"/>
+      </w:rPr>
+    </w:lvl>
+    <w:lvl w:ilvl="4" w:tentative="1">
+      <w:start w:val="1"/>
+      <w:numFmt w:val="bullet"/>
+      <w:lvlText w:val=""/>
+      <w:lvlJc w:val="left"/>
+      <w:pPr>
+        <w:tabs>
+          <w:tab w:val="num" w:pos="3600"/>
+        </w:tabs>
+        <w:ind w:left="3600" w:hanging="360"/>
+      </w:pPr>
+      <w:rPr>
+        <w:rFonts w:ascii="Wingdings" w:hAnsi="Wingdings" w:hint="default"/>
+        <w:sz w:val="20"/>
+      </w:rPr>
+    </w:lvl>
+    <w:lvl w:ilvl="5" w:tentative="1">
+      <w:start w:val="1"/>
+      <w:numFmt w:val="bullet"/>
+      <w:lvlText w:val=""/>
+      <w:lvlJc w:val="left"/>
+      <w:pPr>
+        <w:tabs>
+          <w:tab w:val="num" w:pos="4320"/>
+        </w:tabs>
+        <w:ind w:left="4320" w:hanging="360"/>
+      </w:pPr>
+      <w:rPr>
+        <w:rFonts w:ascii="Wingdings" w:hAnsi="Wingdings" w:hint="default"/>
+        <w:sz w:val="20"/>
+      </w:rPr>
+    </w:lvl>
+    <w:lvl w:ilvl="6" w:tentative="1">
+      <w:start w:val="1"/>
+      <w:numFmt w:val="bullet"/>
+      <w:lvlText w:val=""/>
+      <w:lvlJc w:val="left"/>
+      <w:pPr>
+        <w:tabs>
+          <w:tab w:val="num" w:pos="5040"/>
+        </w:tabs>
+        <w:ind w:left="5040" w:hanging="360"/>
+      </w:pPr>
+      <w:rPr>
+        <w:rFonts w:ascii="Wingdings" w:hAnsi="Wingdings" w:hint="default"/>
+        <w:sz w:val="20"/>
+      </w:rPr>
+    </w:lvl>
+    <w:lvl w:ilvl="7" w:tentative="1">
+      <w:start w:val="1"/>
+      <w:numFmt w:val="bullet"/>
+      <w:lvlText w:val=""/>
+      <w:lvlJc w:val="left"/>
+      <w:pPr>
+        <w:tabs>
+          <w:tab w:val="num" w:pos="5760"/>
+        </w:tabs>
+        <w:ind w:left="5760" w:hanging="360"/>
+      </w:pPr>
+      <w:rPr>
+        <w:rFonts w:ascii="Wingdings" w:hAnsi="Wingdings" w:hint="default"/>
+        <w:sz w:val="20"/>
+      </w:rPr>
+    </w:lvl>
+    <w:lvl w:ilvl="8" w:tentative="1">
+      <w:start w:val="1"/>
+      <w:numFmt w:val="bullet"/>
+      <w:lvlText w:val=""/>
+      <w:lvlJc w:val="left"/>
+      <w:pPr>
+        <w:tabs>
+          <w:tab w:val="num" w:pos="6480"/>
+        </w:tabs>
+        <w:ind w:left="6480" w:hanging="360"/>
+      </w:pPr>
+      <w:rPr>
+        <w:rFonts w:ascii="Wingdings" w:hAnsi="Wingdings" w:hint="default"/>
+        <w:sz w:val="20"/>
+      </w:rPr>
+    </w:lvl>
+  </w:abstractNum>
+  <w:abstractNum w:abstractNumId="13" w15:restartNumberingAfterBreak="0">
+    <w:nsid w:val="2FA63835"/>
+    <w:multiLevelType w:val="multilevel"/>
+    <w:tmpl w:val="F3BAD5CE"/>
+    <w:lvl w:ilvl="0">
+      <w:start w:val="1"/>
+      <w:numFmt w:val="bullet"/>
+      <w:lvlText w:val=""/>
+      <w:lvlJc w:val="left"/>
+      <w:pPr>
+        <w:tabs>
+          <w:tab w:val="num" w:pos="720"/>
+        </w:tabs>
+        <w:ind w:left="720" w:hanging="360"/>
+      </w:pPr>
+      <w:rPr>
+        <w:rFonts w:ascii="Symbol" w:hAnsi="Symbol" w:hint="default"/>
+        <w:sz w:val="20"/>
+      </w:rPr>
+    </w:lvl>
+    <w:lvl w:ilvl="1" w:tentative="1">
+      <w:start w:val="1"/>
+      <w:numFmt w:val="bullet"/>
+      <w:lvlText w:val="o"/>
+      <w:lvlJc w:val="left"/>
+      <w:pPr>
+        <w:tabs>
+          <w:tab w:val="num" w:pos="1440"/>
+        </w:tabs>
+        <w:ind w:left="1440" w:hanging="360"/>
+      </w:pPr>
+      <w:rPr>
+        <w:rFonts w:ascii="Courier New" w:hAnsi="Courier New" w:hint="default"/>
+        <w:sz w:val="20"/>
+      </w:rPr>
+    </w:lvl>
+    <w:lvl w:ilvl="2" w:tentative="1">
+      <w:start w:val="1"/>
+      <w:numFmt w:val="bullet"/>
+      <w:lvlText w:val=""/>
+      <w:lvlJc w:val="left"/>
+      <w:pPr>
+        <w:tabs>
+          <w:tab w:val="num" w:pos="2160"/>
+        </w:tabs>
+        <w:ind w:left="2160" w:hanging="360"/>
+      </w:pPr>
+      <w:rPr>
+        <w:rFonts w:ascii="Wingdings" w:hAnsi="Wingdings" w:hint="default"/>
+        <w:sz w:val="20"/>
+      </w:rPr>
+    </w:lvl>
+    <w:lvl w:ilvl="3" w:tentative="1">
+      <w:start w:val="1"/>
+      <w:numFmt w:val="bullet"/>
+      <w:lvlText w:val=""/>
+      <w:lvlJc w:val="left"/>
+      <w:pPr>
+        <w:tabs>
+          <w:tab w:val="num" w:pos="2880"/>
+        </w:tabs>
+        <w:ind w:left="2880" w:hanging="360"/>
+      </w:pPr>
+      <w:rPr>
+        <w:rFonts w:ascii="Wingdings" w:hAnsi="Wingdings" w:hint="default"/>
+        <w:sz w:val="20"/>
+      </w:rPr>
+    </w:lvl>
+    <w:lvl w:ilvl="4" w:tentative="1">
+      <w:start w:val="1"/>
+      <w:numFmt w:val="bullet"/>
+      <w:lvlText w:val=""/>
+      <w:lvlJc w:val="left"/>
+      <w:pPr>
+        <w:tabs>
+          <w:tab w:val="num" w:pos="3600"/>
+        </w:tabs>
+        <w:ind w:left="3600" w:hanging="360"/>
+      </w:pPr>
+      <w:rPr>
+        <w:rFonts w:ascii="Wingdings" w:hAnsi="Wingdings" w:hint="default"/>
+        <w:sz w:val="20"/>
+      </w:rPr>
+    </w:lvl>
+    <w:lvl w:ilvl="5" w:tentative="1">
+      <w:start w:val="1"/>
+      <w:numFmt w:val="bullet"/>
+      <w:lvlText w:val=""/>
+      <w:lvlJc w:val="left"/>
+      <w:pPr>
+        <w:tabs>
+          <w:tab w:val="num" w:pos="4320"/>
+        </w:tabs>
+        <w:ind w:left="4320" w:hanging="360"/>
+      </w:pPr>
+      <w:rPr>
+        <w:rFonts w:ascii="Wingdings" w:hAnsi="Wingdings" w:hint="default"/>
+        <w:sz w:val="20"/>
+      </w:rPr>
+    </w:lvl>
+    <w:lvl w:ilvl="6" w:tentative="1">
+      <w:start w:val="1"/>
+      <w:numFmt w:val="bullet"/>
+      <w:lvlText w:val=""/>
+      <w:lvlJc w:val="left"/>
+      <w:pPr>
+        <w:tabs>
+          <w:tab w:val="num" w:pos="5040"/>
+        </w:tabs>
+        <w:ind w:left="5040" w:hanging="360"/>
+      </w:pPr>
+      <w:rPr>
+        <w:rFonts w:ascii="Wingdings" w:hAnsi="Wingdings" w:hint="default"/>
+        <w:sz w:val="20"/>
+      </w:rPr>
+    </w:lvl>
+    <w:lvl w:ilvl="7" w:tentative="1">
+      <w:start w:val="1"/>
+      <w:numFmt w:val="bullet"/>
+      <w:lvlText w:val=""/>
+      <w:lvlJc w:val="left"/>
+      <w:pPr>
+        <w:tabs>
+          <w:tab w:val="num" w:pos="5760"/>
+        </w:tabs>
+        <w:ind w:left="5760" w:hanging="360"/>
+      </w:pPr>
+      <w:rPr>
+        <w:rFonts w:ascii="Wingdings" w:hAnsi="Wingdings" w:hint="default"/>
+        <w:sz w:val="20"/>
+      </w:rPr>
+    </w:lvl>
+    <w:lvl w:ilvl="8" w:tentative="1">
+      <w:start w:val="1"/>
+      <w:numFmt w:val="bullet"/>
+      <w:lvlText w:val=""/>
+      <w:lvlJc w:val="left"/>
+      <w:pPr>
+        <w:tabs>
+          <w:tab w:val="num" w:pos="6480"/>
+        </w:tabs>
+        <w:ind w:left="6480" w:hanging="360"/>
+      </w:pPr>
+      <w:rPr>
+        <w:rFonts w:ascii="Wingdings" w:hAnsi="Wingdings" w:hint="default"/>
+        <w:sz w:val="20"/>
+      </w:rPr>
+    </w:lvl>
+  </w:abstractNum>
+  <w:abstractNum w:abstractNumId="14" w15:restartNumberingAfterBreak="0">
+    <w:nsid w:val="31E71AD4"/>
+    <w:multiLevelType w:val="multilevel"/>
+    <w:tmpl w:val="E1C874C4"/>
+    <w:lvl w:ilvl="0">
+      <w:start w:val="1"/>
+      <w:numFmt w:val="bullet"/>
+      <w:lvlText w:val=""/>
+      <w:lvlJc w:val="left"/>
+      <w:pPr>
+        <w:tabs>
+          <w:tab w:val="num" w:pos="720"/>
+        </w:tabs>
+        <w:ind w:left="720" w:hanging="360"/>
+      </w:pPr>
+      <w:rPr>
+        <w:rFonts w:ascii="Symbol" w:hAnsi="Symbol" w:hint="default"/>
+        <w:sz w:val="20"/>
+      </w:rPr>
+    </w:lvl>
+    <w:lvl w:ilvl="1" w:tentative="1">
+      <w:start w:val="1"/>
+      <w:numFmt w:val="bullet"/>
+      <w:lvlText w:val="o"/>
+      <w:lvlJc w:val="left"/>
+      <w:pPr>
+        <w:tabs>
+          <w:tab w:val="num" w:pos="1440"/>
+        </w:tabs>
+        <w:ind w:left="1440" w:hanging="360"/>
+      </w:pPr>
+      <w:rPr>
+        <w:rFonts w:ascii="Courier New" w:hAnsi="Courier New" w:hint="default"/>
+        <w:sz w:val="20"/>
+      </w:rPr>
+    </w:lvl>
+    <w:lvl w:ilvl="2" w:tentative="1">
+      <w:start w:val="1"/>
+      <w:numFmt w:val="bullet"/>
+      <w:lvlText w:val=""/>
+      <w:lvlJc w:val="left"/>
+      <w:pPr>
+        <w:tabs>
+          <w:tab w:val="num" w:pos="2160"/>
+        </w:tabs>
+        <w:ind w:left="2160" w:hanging="360"/>
+      </w:pPr>
+      <w:rPr>
+        <w:rFonts w:ascii="Wingdings" w:hAnsi="Wingdings" w:hint="default"/>
+        <w:sz w:val="20"/>
+      </w:rPr>
+    </w:lvl>
+    <w:lvl w:ilvl="3" w:tentative="1">
+      <w:start w:val="1"/>
+      <w:numFmt w:val="bullet"/>
+      <w:lvlText w:val=""/>
+      <w:lvlJc w:val="left"/>
+      <w:pPr>
+        <w:tabs>
+          <w:tab w:val="num" w:pos="2880"/>
+        </w:tabs>
+        <w:ind w:left="2880" w:hanging="360"/>
+      </w:pPr>
+      <w:rPr>
+        <w:rFonts w:ascii="Wingdings" w:hAnsi="Wingdings" w:hint="default"/>
+        <w:sz w:val="20"/>
+      </w:rPr>
+    </w:lvl>
+    <w:lvl w:ilvl="4" w:tentative="1">
+      <w:start w:val="1"/>
+      <w:numFmt w:val="bullet"/>
+      <w:lvlText w:val=""/>
+      <w:lvlJc w:val="left"/>
+      <w:pPr>
+        <w:tabs>
+          <w:tab w:val="num" w:pos="3600"/>
+        </w:tabs>
+        <w:ind w:left="3600" w:hanging="360"/>
+      </w:pPr>
+      <w:rPr>
+        <w:rFonts w:ascii="Wingdings" w:hAnsi="Wingdings" w:hint="default"/>
+        <w:sz w:val="20"/>
+      </w:rPr>
+    </w:lvl>
+    <w:lvl w:ilvl="5" w:tentative="1">
+      <w:start w:val="1"/>
+      <w:numFmt w:val="bullet"/>
+      <w:lvlText w:val=""/>
+      <w:lvlJc w:val="left"/>
+      <w:pPr>
+        <w:tabs>
+          <w:tab w:val="num" w:pos="4320"/>
+        </w:tabs>
+        <w:ind w:left="4320" w:hanging="360"/>
+      </w:pPr>
+      <w:rPr>
+        <w:rFonts w:ascii="Wingdings" w:hAnsi="Wingdings" w:hint="default"/>
+        <w:sz w:val="20"/>
+      </w:rPr>
+    </w:lvl>
+    <w:lvl w:ilvl="6" w:tentative="1">
+      <w:start w:val="1"/>
+      <w:numFmt w:val="bullet"/>
+      <w:lvlText w:val=""/>
+      <w:lvlJc w:val="left"/>
+      <w:pPr>
+        <w:tabs>
+          <w:tab w:val="num" w:pos="5040"/>
+        </w:tabs>
+        <w:ind w:left="5040" w:hanging="360"/>
+      </w:pPr>
+      <w:rPr>
+        <w:rFonts w:ascii="Wingdings" w:hAnsi="Wingdings" w:hint="default"/>
+        <w:sz w:val="20"/>
+      </w:rPr>
+    </w:lvl>
+    <w:lvl w:ilvl="7" w:tentative="1">
+      <w:start w:val="1"/>
+      <w:numFmt w:val="bullet"/>
+      <w:lvlText w:val=""/>
+      <w:lvlJc w:val="left"/>
+      <w:pPr>
+        <w:tabs>
+          <w:tab w:val="num" w:pos="5760"/>
+        </w:tabs>
+        <w:ind w:left="5760" w:hanging="360"/>
+      </w:pPr>
+      <w:rPr>
+        <w:rFonts w:ascii="Wingdings" w:hAnsi="Wingdings" w:hint="default"/>
+        <w:sz w:val="20"/>
+      </w:rPr>
+    </w:lvl>
+    <w:lvl w:ilvl="8" w:tentative="1">
+      <w:start w:val="1"/>
+      <w:numFmt w:val="bullet"/>
+      <w:lvlText w:val=""/>
+      <w:lvlJc w:val="left"/>
+      <w:pPr>
+        <w:tabs>
+          <w:tab w:val="num" w:pos="6480"/>
+        </w:tabs>
+        <w:ind w:left="6480" w:hanging="360"/>
+      </w:pPr>
+      <w:rPr>
+        <w:rFonts w:ascii="Wingdings" w:hAnsi="Wingdings" w:hint="default"/>
+        <w:sz w:val="20"/>
+      </w:rPr>
+    </w:lvl>
+  </w:abstractNum>
+  <w:abstractNum w:abstractNumId="15" w15:restartNumberingAfterBreak="0">
     <w:nsid w:val="3590013A"/>
     <w:multiLevelType w:val="hybridMultilevel"/>
     <w:tmpl w:val="974A6FEC"/>
@@ -2484,7 +4303,7 @@
       </w:rPr>
     </w:lvl>
   </w:abstractNum>
-  <w:abstractNum w:abstractNumId="13" w15:restartNumberingAfterBreak="0">
+  <w:abstractNum w:abstractNumId="16" w15:restartNumberingAfterBreak="0">
     <w:nsid w:val="43A41B73"/>
     <w:multiLevelType w:val="hybridMultilevel"/>
     <w:tmpl w:val="9560022C"/>
@@ -2597,7 +4416,7 @@
       </w:rPr>
     </w:lvl>
   </w:abstractNum>
-  <w:abstractNum w:abstractNumId="14" w15:restartNumberingAfterBreak="0">
+  <w:abstractNum w:abstractNumId="17" w15:restartNumberingAfterBreak="0">
     <w:nsid w:val="46B97A52"/>
     <w:multiLevelType w:val="hybridMultilevel"/>
     <w:tmpl w:val="CC124820"/>
@@ -2710,7 +4529,156 @@
       </w:rPr>
     </w:lvl>
   </w:abstractNum>
-  <w:abstractNum w:abstractNumId="15" w15:restartNumberingAfterBreak="0">
+  <w:abstractNum w:abstractNumId="18" w15:restartNumberingAfterBreak="0">
+    <w:nsid w:val="4D847CD2"/>
+    <w:multiLevelType w:val="multilevel"/>
+    <w:tmpl w:val="9C9CAF2E"/>
+    <w:lvl w:ilvl="0">
+      <w:start w:val="1"/>
+      <w:numFmt w:val="bullet"/>
+      <w:lvlText w:val=""/>
+      <w:lvlJc w:val="left"/>
+      <w:pPr>
+        <w:tabs>
+          <w:tab w:val="num" w:pos="720"/>
+        </w:tabs>
+        <w:ind w:left="720" w:hanging="360"/>
+      </w:pPr>
+      <w:rPr>
+        <w:rFonts w:ascii="Symbol" w:hAnsi="Symbol" w:hint="default"/>
+        <w:sz w:val="20"/>
+      </w:rPr>
+    </w:lvl>
+    <w:lvl w:ilvl="1" w:tentative="1">
+      <w:start w:val="1"/>
+      <w:numFmt w:val="bullet"/>
+      <w:lvlText w:val="o"/>
+      <w:lvlJc w:val="left"/>
+      <w:pPr>
+        <w:tabs>
+          <w:tab w:val="num" w:pos="1440"/>
+        </w:tabs>
+        <w:ind w:left="1440" w:hanging="360"/>
+      </w:pPr>
+      <w:rPr>
+        <w:rFonts w:ascii="Courier New" w:hAnsi="Courier New" w:hint="default"/>
+        <w:sz w:val="20"/>
+      </w:rPr>
+    </w:lvl>
+    <w:lvl w:ilvl="2" w:tentative="1">
+      <w:start w:val="1"/>
+      <w:numFmt w:val="bullet"/>
+      <w:lvlText w:val=""/>
+      <w:lvlJc w:val="left"/>
+      <w:pPr>
+        <w:tabs>
+          <w:tab w:val="num" w:pos="2160"/>
+        </w:tabs>
+        <w:ind w:left="2160" w:hanging="360"/>
+      </w:pPr>
+      <w:rPr>
+        <w:rFonts w:ascii="Wingdings" w:hAnsi="Wingdings" w:hint="default"/>
+        <w:sz w:val="20"/>
+      </w:rPr>
+    </w:lvl>
+    <w:lvl w:ilvl="3" w:tentative="1">
+      <w:start w:val="1"/>
+      <w:numFmt w:val="bullet"/>
+      <w:lvlText w:val=""/>
+      <w:lvlJc w:val="left"/>
+      <w:pPr>
+        <w:tabs>
+          <w:tab w:val="num" w:pos="2880"/>
+        </w:tabs>
+        <w:ind w:left="2880" w:hanging="360"/>
+      </w:pPr>
+      <w:rPr>
+        <w:rFonts w:ascii="Wingdings" w:hAnsi="Wingdings" w:hint="default"/>
+        <w:sz w:val="20"/>
+      </w:rPr>
+    </w:lvl>
+    <w:lvl w:ilvl="4" w:tentative="1">
+      <w:start w:val="1"/>
+      <w:numFmt w:val="bullet"/>
+      <w:lvlText w:val=""/>
+      <w:lvlJc w:val="left"/>
+      <w:pPr>
+        <w:tabs>
+          <w:tab w:val="num" w:pos="3600"/>
+        </w:tabs>
+        <w:ind w:left="3600" w:hanging="360"/>
+      </w:pPr>
+      <w:rPr>
+        <w:rFonts w:ascii="Wingdings" w:hAnsi="Wingdings" w:hint="default"/>
+        <w:sz w:val="20"/>
+      </w:rPr>
+    </w:lvl>
+    <w:lvl w:ilvl="5" w:tentative="1">
+      <w:start w:val="1"/>
+      <w:numFmt w:val="bullet"/>
+      <w:lvlText w:val=""/>
+      <w:lvlJc w:val="left"/>
+      <w:pPr>
+        <w:tabs>
+          <w:tab w:val="num" w:pos="4320"/>
+        </w:tabs>
+        <w:ind w:left="4320" w:hanging="360"/>
+      </w:pPr>
+      <w:rPr>
+        <w:rFonts w:ascii="Wingdings" w:hAnsi="Wingdings" w:hint="default"/>
+        <w:sz w:val="20"/>
+      </w:rPr>
+    </w:lvl>
+    <w:lvl w:ilvl="6" w:tentative="1">
+      <w:start w:val="1"/>
+      <w:numFmt w:val="bullet"/>
+      <w:lvlText w:val=""/>
+      <w:lvlJc w:val="left"/>
+      <w:pPr>
+        <w:tabs>
+          <w:tab w:val="num" w:pos="5040"/>
+        </w:tabs>
+        <w:ind w:left="5040" w:hanging="360"/>
+      </w:pPr>
+      <w:rPr>
+        <w:rFonts w:ascii="Wingdings" w:hAnsi="Wingdings" w:hint="default"/>
+        <w:sz w:val="20"/>
+      </w:rPr>
+    </w:lvl>
+    <w:lvl w:ilvl="7" w:tentative="1">
+      <w:start w:val="1"/>
+      <w:numFmt w:val="bullet"/>
+      <w:lvlText w:val=""/>
+      <w:lvlJc w:val="left"/>
+      <w:pPr>
+        <w:tabs>
+          <w:tab w:val="num" w:pos="5760"/>
+        </w:tabs>
+        <w:ind w:left="5760" w:hanging="360"/>
+      </w:pPr>
+      <w:rPr>
+        <w:rFonts w:ascii="Wingdings" w:hAnsi="Wingdings" w:hint="default"/>
+        <w:sz w:val="20"/>
+      </w:rPr>
+    </w:lvl>
+    <w:lvl w:ilvl="8" w:tentative="1">
+      <w:start w:val="1"/>
+      <w:numFmt w:val="bullet"/>
+      <w:lvlText w:val=""/>
+      <w:lvlJc w:val="left"/>
+      <w:pPr>
+        <w:tabs>
+          <w:tab w:val="num" w:pos="6480"/>
+        </w:tabs>
+        <w:ind w:left="6480" w:hanging="360"/>
+      </w:pPr>
+      <w:rPr>
+        <w:rFonts w:ascii="Wingdings" w:hAnsi="Wingdings" w:hint="default"/>
+        <w:sz w:val="20"/>
+      </w:rPr>
+    </w:lvl>
+  </w:abstractNum>
+  <w:abstractNum w:abstractNumId="19" w15:restartNumberingAfterBreak="0">
     <w:nsid w:val="52932727"/>
     <w:multiLevelType w:val="hybridMultilevel"/>
     <w:tmpl w:val="8C12F7A2"/>
@@ -2823,7 +4791,7 @@
       </w:rPr>
     </w:lvl>
   </w:abstractNum>
-  <w:abstractNum w:abstractNumId="16" w15:restartNumberingAfterBreak="0">
+  <w:abstractNum w:abstractNumId="20" w15:restartNumberingAfterBreak="0">
     <w:nsid w:val="582F3FF9"/>
     <w:multiLevelType w:val="hybridMultilevel"/>
     <w:tmpl w:val="D5D60F46"/>
@@ -2936,7 +4904,7 @@
       </w:rPr>
     </w:lvl>
   </w:abstractNum>
-  <w:abstractNum w:abstractNumId="17" w15:restartNumberingAfterBreak="0">
+  <w:abstractNum w:abstractNumId="21" w15:restartNumberingAfterBreak="0">
     <w:nsid w:val="7DE80C31"/>
     <w:multiLevelType w:val="hybridMultilevel"/>
     <w:tmpl w:val="B1DE3E2A"/>
@@ -3046,6 +5014,155 @@
       </w:pPr>
       <w:rPr>
         <w:rFonts w:ascii="Wingdings" w:hAnsi="Wingdings" w:hint="default"/>
+      </w:rPr>
+    </w:lvl>
+  </w:abstractNum>
+  <w:abstractNum w:abstractNumId="22" w15:restartNumberingAfterBreak="0">
+    <w:nsid w:val="7E6A7267"/>
+    <w:multiLevelType w:val="multilevel"/>
+    <w:tmpl w:val="58EE220E"/>
+    <w:lvl w:ilvl="0">
+      <w:start w:val="1"/>
+      <w:numFmt w:val="bullet"/>
+      <w:lvlText w:val=""/>
+      <w:lvlJc w:val="left"/>
+      <w:pPr>
+        <w:tabs>
+          <w:tab w:val="num" w:pos="720"/>
+        </w:tabs>
+        <w:ind w:left="720" w:hanging="360"/>
+      </w:pPr>
+      <w:rPr>
+        <w:rFonts w:ascii="Symbol" w:hAnsi="Symbol" w:hint="default"/>
+        <w:sz w:val="20"/>
+      </w:rPr>
+    </w:lvl>
+    <w:lvl w:ilvl="1" w:tentative="1">
+      <w:start w:val="1"/>
+      <w:numFmt w:val="bullet"/>
+      <w:lvlText w:val="o"/>
+      <w:lvlJc w:val="left"/>
+      <w:pPr>
+        <w:tabs>
+          <w:tab w:val="num" w:pos="1440"/>
+        </w:tabs>
+        <w:ind w:left="1440" w:hanging="360"/>
+      </w:pPr>
+      <w:rPr>
+        <w:rFonts w:ascii="Courier New" w:hAnsi="Courier New" w:hint="default"/>
+        <w:sz w:val="20"/>
+      </w:rPr>
+    </w:lvl>
+    <w:lvl w:ilvl="2" w:tentative="1">
+      <w:start w:val="1"/>
+      <w:numFmt w:val="bullet"/>
+      <w:lvlText w:val=""/>
+      <w:lvlJc w:val="left"/>
+      <w:pPr>
+        <w:tabs>
+          <w:tab w:val="num" w:pos="2160"/>
+        </w:tabs>
+        <w:ind w:left="2160" w:hanging="360"/>
+      </w:pPr>
+      <w:rPr>
+        <w:rFonts w:ascii="Wingdings" w:hAnsi="Wingdings" w:hint="default"/>
+        <w:sz w:val="20"/>
+      </w:rPr>
+    </w:lvl>
+    <w:lvl w:ilvl="3" w:tentative="1">
+      <w:start w:val="1"/>
+      <w:numFmt w:val="bullet"/>
+      <w:lvlText w:val=""/>
+      <w:lvlJc w:val="left"/>
+      <w:pPr>
+        <w:tabs>
+          <w:tab w:val="num" w:pos="2880"/>
+        </w:tabs>
+        <w:ind w:left="2880" w:hanging="360"/>
+      </w:pPr>
+      <w:rPr>
+        <w:rFonts w:ascii="Wingdings" w:hAnsi="Wingdings" w:hint="default"/>
+        <w:sz w:val="20"/>
+      </w:rPr>
+    </w:lvl>
+    <w:lvl w:ilvl="4" w:tentative="1">
+      <w:start w:val="1"/>
+      <w:numFmt w:val="bullet"/>
+      <w:lvlText w:val=""/>
+      <w:lvlJc w:val="left"/>
+      <w:pPr>
+        <w:tabs>
+          <w:tab w:val="num" w:pos="3600"/>
+        </w:tabs>
+        <w:ind w:left="3600" w:hanging="360"/>
+      </w:pPr>
+      <w:rPr>
+        <w:rFonts w:ascii="Wingdings" w:hAnsi="Wingdings" w:hint="default"/>
+        <w:sz w:val="20"/>
+      </w:rPr>
+    </w:lvl>
+    <w:lvl w:ilvl="5" w:tentative="1">
+      <w:start w:val="1"/>
+      <w:numFmt w:val="bullet"/>
+      <w:lvlText w:val=""/>
+      <w:lvlJc w:val="left"/>
+      <w:pPr>
+        <w:tabs>
+          <w:tab w:val="num" w:pos="4320"/>
+        </w:tabs>
+        <w:ind w:left="4320" w:hanging="360"/>
+      </w:pPr>
+      <w:rPr>
+        <w:rFonts w:ascii="Wingdings" w:hAnsi="Wingdings" w:hint="default"/>
+        <w:sz w:val="20"/>
+      </w:rPr>
+    </w:lvl>
+    <w:lvl w:ilvl="6" w:tentative="1">
+      <w:start w:val="1"/>
+      <w:numFmt w:val="bullet"/>
+      <w:lvlText w:val=""/>
+      <w:lvlJc w:val="left"/>
+      <w:pPr>
+        <w:tabs>
+          <w:tab w:val="num" w:pos="5040"/>
+        </w:tabs>
+        <w:ind w:left="5040" w:hanging="360"/>
+      </w:pPr>
+      <w:rPr>
+        <w:rFonts w:ascii="Wingdings" w:hAnsi="Wingdings" w:hint="default"/>
+        <w:sz w:val="20"/>
+      </w:rPr>
+    </w:lvl>
+    <w:lvl w:ilvl="7" w:tentative="1">
+      <w:start w:val="1"/>
+      <w:numFmt w:val="bullet"/>
+      <w:lvlText w:val=""/>
+      <w:lvlJc w:val="left"/>
+      <w:pPr>
+        <w:tabs>
+          <w:tab w:val="num" w:pos="5760"/>
+        </w:tabs>
+        <w:ind w:left="5760" w:hanging="360"/>
+      </w:pPr>
+      <w:rPr>
+        <w:rFonts w:ascii="Wingdings" w:hAnsi="Wingdings" w:hint="default"/>
+        <w:sz w:val="20"/>
+      </w:rPr>
+    </w:lvl>
+    <w:lvl w:ilvl="8" w:tentative="1">
+      <w:start w:val="1"/>
+      <w:numFmt w:val="bullet"/>
+      <w:lvlText w:val=""/>
+      <w:lvlJc w:val="left"/>
+      <w:pPr>
+        <w:tabs>
+          <w:tab w:val="num" w:pos="6480"/>
+        </w:tabs>
+        <w:ind w:left="6480" w:hanging="360"/>
+      </w:pPr>
+      <w:rPr>
+        <w:rFonts w:ascii="Wingdings" w:hAnsi="Wingdings" w:hint="default"/>
+        <w:sz w:val="20"/>
       </w:rPr>
     </w:lvl>
   </w:abstractNum>
@@ -3077,7 +5194,7 @@
     <w:abstractNumId w:val="0"/>
   </w:num>
   <w:num w:numId="10" w16cid:durableId="305088644">
-    <w:abstractNumId w:val="14"/>
+    <w:abstractNumId w:val="17"/>
   </w:num>
   <w:num w:numId="11" w16cid:durableId="1222866210">
     <w:abstractNumId w:val="7"/>
@@ -3092,13 +5209,13 @@
     <w:abstractNumId w:val="7"/>
   </w:num>
   <w:num w:numId="14" w16cid:durableId="1907062206">
-    <w:abstractNumId w:val="16"/>
+    <w:abstractNumId w:val="20"/>
   </w:num>
   <w:num w:numId="15" w16cid:durableId="324627829">
     <w:abstractNumId w:val="7"/>
   </w:num>
   <w:num w:numId="16" w16cid:durableId="398552392">
-    <w:abstractNumId w:val="12"/>
+    <w:abstractNumId w:val="15"/>
   </w:num>
   <w:num w:numId="17" w16cid:durableId="1304964255">
     <w:abstractNumId w:val="10"/>
@@ -3107,13 +5224,13 @@
     <w:abstractNumId w:val="7"/>
   </w:num>
   <w:num w:numId="19" w16cid:durableId="2100562283">
-    <w:abstractNumId w:val="17"/>
+    <w:abstractNumId w:val="21"/>
   </w:num>
   <w:num w:numId="20" w16cid:durableId="1176386272">
-    <w:abstractNumId w:val="15"/>
+    <w:abstractNumId w:val="19"/>
   </w:num>
   <w:num w:numId="21" w16cid:durableId="1073890016">
-    <w:abstractNumId w:val="13"/>
+    <w:abstractNumId w:val="16"/>
   </w:num>
   <w:num w:numId="22" w16cid:durableId="1107232145">
     <w:abstractNumId w:val="7"/>
@@ -3126,6 +5243,21 @@
   </w:num>
   <w:num w:numId="25" w16cid:durableId="1671591784">
     <w:abstractNumId w:val="11"/>
+  </w:num>
+  <w:num w:numId="26" w16cid:durableId="180321887">
+    <w:abstractNumId w:val="14"/>
+  </w:num>
+  <w:num w:numId="27" w16cid:durableId="1751153646">
+    <w:abstractNumId w:val="12"/>
+  </w:num>
+  <w:num w:numId="28" w16cid:durableId="1629434030">
+    <w:abstractNumId w:val="13"/>
+  </w:num>
+  <w:num w:numId="29" w16cid:durableId="55857244">
+    <w:abstractNumId w:val="18"/>
+  </w:num>
+  <w:num w:numId="30" w16cid:durableId="1623228222">
+    <w:abstractNumId w:val="22"/>
   </w:num>
 </w:numbering>
 </file>
@@ -3733,7 +5865,6 @@
   <w:style w:type="character" w:default="1" w:styleId="Fuentedeprrafopredeter">
     <w:name w:val="Default Paragraph Font"/>
     <w:uiPriority w:val="1"/>
-    <w:semiHidden/>
     <w:unhideWhenUsed/>
   </w:style>
   <w:style w:type="table" w:default="1" w:styleId="Tablanormal">
@@ -4303,7 +6434,6 @@
     <w:basedOn w:val="Normal"/>
     <w:next w:val="Normal"/>
     <w:uiPriority w:val="35"/>
-    <w:semiHidden/>
     <w:unhideWhenUsed/>
     <w:qFormat/>
     <w:rsid w:val="00FC693F"/>
@@ -14514,6 +16644,16 @@
     <w:name w:val="source-title"/>
     <w:basedOn w:val="Fuentedeprrafopredeter"/>
     <w:rsid w:val="00697533"/>
+  </w:style>
+  <w:style w:type="character" w:styleId="Textodelmarcadordeposicin">
+    <w:name w:val="Placeholder Text"/>
+    <w:basedOn w:val="Fuentedeprrafopredeter"/>
+    <w:uiPriority w:val="99"/>
+    <w:semiHidden/>
+    <w:rsid w:val="00A429D5"/>
+    <w:rPr>
+      <w:color w:val="666666"/>
+    </w:rPr>
   </w:style>
 </w:styles>
 </file>

</xml_diff>

<commit_message>
Task 3: Faltan fotos
</commit_message>
<xml_diff>
--- a/Practica 3/Ladder Design Timers REV02.docx
+++ b/Practica 3/Ladder Design Timers REV02.docx
@@ -209,7 +209,18 @@
         <w:t>/10/2026</w:t>
       </w:r>
     </w:p>
-    <w:p/>
+    <w:p>
+      <w:r>
+        <w:rPr>
+          <w:b/>
+          <w:bCs/>
+        </w:rPr>
+        <w:t xml:space="preserve">Student Name: </w:t>
+      </w:r>
+      <w:r>
+        <w:t>David Roberto Tapia Caicedo</w:t>
+      </w:r>
+    </w:p>
     <w:p>
       <w:pPr>
         <w:pStyle w:val="Ttulo1"/>
@@ -605,6 +616,9 @@
         <w:jc w:val="center"/>
       </w:pPr>
       <w:r>
+        <w:rPr>
+          <w:noProof/>
+        </w:rPr>
         <w:lastRenderedPageBreak/>
         <w:drawing>
           <wp:inline distT="0" distB="0" distL="0" distR="0" wp14:anchorId="7261ABA4" wp14:editId="3750E85A">
@@ -651,24 +665,14 @@
       <w:r>
         <w:t xml:space="preserve">Figure </w:t>
       </w:r>
-      <w:r>
-        <w:fldChar w:fldCharType="begin"/>
-      </w:r>
-      <w:r>
-        <w:instrText xml:space="preserve"> SEQ Figure \* ARABIC </w:instrText>
-      </w:r>
-      <w:r>
-        <w:fldChar w:fldCharType="separate"/>
-      </w:r>
-      <w:r>
-        <w:rPr>
-          <w:noProof/>
-        </w:rPr>
-        <w:t>1</w:t>
-      </w:r>
-      <w:r>
-        <w:fldChar w:fldCharType="end"/>
-      </w:r>
+      <w:fldSimple w:instr=" SEQ Figure \* ARABIC ">
+        <w:r>
+          <w:rPr>
+            <w:noProof/>
+          </w:rPr>
+          <w:t>1</w:t>
+        </w:r>
+      </w:fldSimple>
       <w:r>
         <w:t>: Exercise 1 Test</w:t>
       </w:r>
@@ -886,7 +890,22 @@
         <w:rPr>
           <w:lang w:val="en-GB"/>
         </w:rPr>
-        <w:t xml:space="preserve">, T0 reaches K100 and closes its contact, which resets Y0 and turns the lamp OFF. When Y000 turns off, its contact in Rung 2 opens, removing power from T0 and resetting the timer back to 0 automatically. </w:t>
+        <w:t>, T0 reaches K100 and closes its contact, which resets Y0 and turns the lamp OFF. When Y000 turns off, it</w:t>
+      </w:r>
+      <w:r>
+        <w:rPr>
+          <w:lang w:val="en-GB"/>
+        </w:rPr>
+        <w:t>s</w:t>
+      </w:r>
+      <w:r>
+        <w:t xml:space="preserve"> contact in line 3 opens</w:t>
+      </w:r>
+      <w:r>
+        <w:rPr>
+          <w:lang w:val="en-GB"/>
+        </w:rPr>
+        <w:t xml:space="preserve">, removing power from T0 and resetting the timer back to 0 automatically. </w:t>
       </w:r>
     </w:p>
     <w:p/>
@@ -1159,6 +1178,7 @@
         <w:rPr>
           <w:b/>
           <w:bCs/>
+          <w:noProof/>
         </w:rPr>
         <w:lastRenderedPageBreak/>
         <w:drawing>
@@ -1206,24 +1226,14 @@
       <w:r>
         <w:t xml:space="preserve">Figure </w:t>
       </w:r>
-      <w:r>
-        <w:fldChar w:fldCharType="begin"/>
-      </w:r>
-      <w:r>
-        <w:instrText xml:space="preserve"> SEQ Figure \* ARABIC </w:instrText>
-      </w:r>
-      <w:r>
-        <w:fldChar w:fldCharType="separate"/>
-      </w:r>
-      <w:r>
-        <w:rPr>
-          <w:noProof/>
-        </w:rPr>
-        <w:t>2</w:t>
-      </w:r>
-      <w:r>
-        <w:fldChar w:fldCharType="end"/>
-      </w:r>
+      <w:fldSimple w:instr=" SEQ Figure \* ARABIC ">
+        <w:r>
+          <w:rPr>
+            <w:noProof/>
+          </w:rPr>
+          <w:t>2</w:t>
+        </w:r>
+      </w:fldSimple>
       <w:r>
         <w:t>: Exercise 2 Test</w:t>
       </w:r>
@@ -2000,7 +2010,25 @@
                 <w:sz w:val="24"/>
                 <w:szCs w:val="24"/>
               </w:rPr>
-              <w:t>PLC Adress</w:t>
+              <w:t>PLC Ad</w:t>
+            </w:r>
+            <w:r>
+              <w:rPr>
+                <w:b/>
+                <w:bCs/>
+                <w:sz w:val="24"/>
+                <w:szCs w:val="24"/>
+              </w:rPr>
+              <w:t>d</w:t>
+            </w:r>
+            <w:r>
+              <w:rPr>
+                <w:b/>
+                <w:bCs/>
+                <w:sz w:val="24"/>
+                <w:szCs w:val="24"/>
+              </w:rPr>
+              <w:t>ress</w:t>
             </w:r>
           </w:p>
         </w:tc>
@@ -2457,6 +2485,9 @@
         <w:jc w:val="center"/>
       </w:pPr>
       <w:r>
+        <w:rPr>
+          <w:noProof/>
+        </w:rPr>
         <w:lastRenderedPageBreak/>
         <w:drawing>
           <wp:inline distT="0" distB="0" distL="0" distR="0" wp14:anchorId="719357CC" wp14:editId="6BDD9EC4">
@@ -2507,43 +2538,17 @@
       <w:r>
         <w:t xml:space="preserve">Figure </w:t>
       </w:r>
-      <w:r>
-        <w:fldChar w:fldCharType="begin"/>
-      </w:r>
-      <w:r>
-        <w:instrText xml:space="preserve"> SEQ Figure \* ARABIC </w:instrText>
-      </w:r>
-      <w:r>
-        <w:fldChar w:fldCharType="separate"/>
-      </w:r>
-      <w:r>
-        <w:rPr>
-          <w:noProof/>
-        </w:rPr>
-        <w:t>3</w:t>
-      </w:r>
-      <w:r>
-        <w:fldChar w:fldCharType="end"/>
-      </w:r>
+      <w:fldSimple w:instr=" SEQ Figure \* ARABIC ">
+        <w:r>
+          <w:rPr>
+            <w:noProof/>
+          </w:rPr>
+          <w:t>3</w:t>
+        </w:r>
+      </w:fldSimple>
       <w:r>
         <w:t>: Exercise 3 Test</w:t>
       </w:r>
-    </w:p>
-    <w:p>
-      <w:pPr>
-        <w:rPr>
-          <w:b/>
-          <w:bCs/>
-        </w:rPr>
-      </w:pPr>
-    </w:p>
-    <w:p>
-      <w:pPr>
-        <w:rPr>
-          <w:b/>
-          <w:bCs/>
-        </w:rPr>
-      </w:pPr>
     </w:p>
     <w:p>
       <w:pPr>
@@ -2691,10 +2696,7 @@
         </w:rPr>
       </w:pPr>
       <w:r>
-        <w:t>Line-by-Line</w:t>
-      </w:r>
-      <w:r>
-        <w:t xml:space="preserve"> explanation:</w:t>
+        <w:t>Line-by-Line explanation:</w:t>
       </w:r>
     </w:p>
     <w:p>
@@ -2704,52 +2706,16 @@
         </w:rPr>
       </w:pPr>
       <w:r>
-        <w:rPr>
-          <w:lang w:val="en-GB"/>
-        </w:rPr>
-        <w:t>Initial State</w:t>
-      </w:r>
-      <w:r>
-        <w:rPr>
-          <w:lang w:val="en-GB"/>
-        </w:rPr>
-        <w:t xml:space="preserve">: </w:t>
-      </w:r>
-      <w:r>
-        <w:rPr>
-          <w:lang w:val="en-GB"/>
-        </w:rPr>
-        <w:t>When the PLC starts, data register D0 initially holds a value of 0. This initial condition</w:t>
-      </w:r>
-      <w:r>
-        <w:rPr>
-          <w:lang w:val="en-GB"/>
-        </w:rPr>
-        <w:t xml:space="preserve">, </w:t>
-      </w:r>
-      <w:r>
-        <w:rPr>
-          <w:lang w:val="en-GB"/>
-        </w:rPr>
-        <w:t>or the completion of Step 6</w:t>
-      </w:r>
-      <w:r>
-        <w:rPr>
-          <w:lang w:val="en-GB"/>
-        </w:rPr>
-        <w:t>,</w:t>
-      </w:r>
-      <w:r>
-        <w:rPr>
-          <w:lang w:val="en-GB"/>
-        </w:rPr>
-        <w:t xml:space="preserve"> executes [MOV K1 D0], placing the traffic light into Step 1 by default so the road is open to vehicles and closed to pedestrians</w:t>
-      </w:r>
-      <w:r>
-        <w:rPr>
-          <w:lang w:val="en-GB"/>
-        </w:rPr>
-        <w:t>.</w:t>
+        <w:t>Line 0 (Initial State</w:t>
+      </w:r>
+      <w:r>
+        <w:t>)</w:t>
+      </w:r>
+      <w:r>
+        <w:t>: Before any button is pressed, memory coil M0 is off, so its Normally Closed contact in line 0 lets power pass to turn on Y002 (Green Car Light) and Y003 (Pedestrian Red Light) by default.</w:t>
+      </w:r>
+      <w:r>
+        <w:t xml:space="preserve"> </w:t>
       </w:r>
     </w:p>
     <w:p>
@@ -2789,7 +2755,6 @@
         <w:rPr>
           <w:lang w:val="en-GB"/>
         </w:rPr>
-        <w:lastRenderedPageBreak/>
         <w:t>Step 2 to Step 6 Timed Transitions: Steps 2 through 6 follow the exact same ladder structure, changing only the state number being compared (= D0 Kx), the timer address and preset time (Tx Kx), and the next state number moved into D0</w:t>
       </w:r>
       <w:r>
@@ -2813,6 +2778,7 @@
         <w:rPr>
           <w:lang w:val="en-GB"/>
         </w:rPr>
+        <w:lastRenderedPageBreak/>
         <w:t xml:space="preserve">Step 2: When [= D0 K2] is true, it powers timer T0. Once 8 seconds pass, T0 closes its contact and executes [MOV K3 D0], advancing the state to Step 3. </w:t>
       </w:r>
     </w:p>
@@ -2951,7 +2917,23 @@
           <w:bCs/>
           <w:lang w:val="en-GB"/>
         </w:rPr>
-        <w:t>Y000 (P1 – Vehicle Red):</w:t>
+        <w:t>Y</w:t>
+      </w:r>
+      <w:r>
+        <w:rPr>
+          <w:b/>
+          <w:bCs/>
+          <w:lang w:val="en-GB"/>
+        </w:rPr>
+        <w:t>0</w:t>
+      </w:r>
+      <w:r>
+        <w:rPr>
+          <w:b/>
+          <w:bCs/>
+          <w:lang w:val="en-GB"/>
+        </w:rPr>
+        <w:t>:</w:t>
       </w:r>
       <w:r>
         <w:rPr>
@@ -2982,7 +2964,23 @@
           <w:bCs/>
           <w:lang w:val="en-GB"/>
         </w:rPr>
-        <w:t>Y001 (P2 – Vehicle Amber):</w:t>
+        <w:t>Y</w:t>
+      </w:r>
+      <w:r>
+        <w:rPr>
+          <w:b/>
+          <w:bCs/>
+          <w:lang w:val="en-GB"/>
+        </w:rPr>
+        <w:t>1</w:t>
+      </w:r>
+      <w:r>
+        <w:rPr>
+          <w:b/>
+          <w:bCs/>
+          <w:lang w:val="en-GB"/>
+        </w:rPr>
+        <w:t>:</w:t>
       </w:r>
       <w:r>
         <w:rPr>
@@ -3019,7 +3017,23 @@
           <w:bCs/>
           <w:lang w:val="en-GB"/>
         </w:rPr>
-        <w:t>Y002 (P3 – Vehicle Green):</w:t>
+        <w:t>Y</w:t>
+      </w:r>
+      <w:r>
+        <w:rPr>
+          <w:b/>
+          <w:bCs/>
+          <w:lang w:val="en-GB"/>
+        </w:rPr>
+        <w:t>2</w:t>
+      </w:r>
+      <w:r>
+        <w:rPr>
+          <w:b/>
+          <w:bCs/>
+          <w:lang w:val="en-GB"/>
+        </w:rPr>
+        <w:t>:</w:t>
       </w:r>
       <w:r>
         <w:rPr>
@@ -3056,7 +3070,23 @@
           <w:bCs/>
           <w:lang w:val="en-GB"/>
         </w:rPr>
-        <w:t>Y003 (P4 – Pedestrian Red):</w:t>
+        <w:t>Y</w:t>
+      </w:r>
+      <w:r>
+        <w:rPr>
+          <w:b/>
+          <w:bCs/>
+          <w:lang w:val="en-GB"/>
+        </w:rPr>
+        <w:t>3</w:t>
+      </w:r>
+      <w:r>
+        <w:rPr>
+          <w:b/>
+          <w:bCs/>
+          <w:lang w:val="en-GB"/>
+        </w:rPr>
+        <w:t>:</w:t>
       </w:r>
       <w:r>
         <w:rPr>
@@ -3087,7 +3117,23 @@
           <w:bCs/>
           <w:lang w:val="en-GB"/>
         </w:rPr>
-        <w:t>Y004 (P5 – Pedestrian Green):</w:t>
+        <w:t>Y</w:t>
+      </w:r>
+      <w:r>
+        <w:rPr>
+          <w:b/>
+          <w:bCs/>
+          <w:lang w:val="en-GB"/>
+        </w:rPr>
+        <w:t>4</w:t>
+      </w:r>
+      <w:r>
+        <w:rPr>
+          <w:b/>
+          <w:bCs/>
+          <w:lang w:val="en-GB"/>
+        </w:rPr>
+        <w:t>:</w:t>
       </w:r>
       <w:r>
         <w:rPr>
@@ -3125,17 +3171,82 @@
       <w:r>
         <w:t xml:space="preserve">During this laboratory </w:t>
       </w:r>
+      <w:r>
+        <w:t>practice</w:t>
+      </w:r>
+      <w:r>
+        <w:t>, we learned how to design, simulate, and test timer</w:t>
+      </w:r>
+      <w:r>
+        <w:t xml:space="preserve"> </w:t>
+      </w:r>
+      <w:r>
+        <w:t>on</w:t>
+      </w:r>
+      <w:r>
+        <w:t xml:space="preserve"> </w:t>
+      </w:r>
+      <w:r>
+        <w:t>Mitsubishi FX3G PLC using GX Works2. In Problem 1, combining a rising</w:t>
+      </w:r>
+      <w:r>
+        <w:t xml:space="preserve"> </w:t>
+      </w:r>
+      <w:r>
+        <w:t>edge pulse contact</w:t>
+      </w:r>
+      <w:r>
+        <w:t xml:space="preserve"> </w:t>
+      </w:r>
+      <w:r>
+        <w:t>with SET and RST instructions ensured that the output lamp only stayed on for the exact 10-second duration of timer T0 (K100), preventing the circuit from retriggering if the start button was held down. In Problem 2, internal relays</w:t>
+      </w:r>
+      <w:r>
+        <w:t xml:space="preserve">, </w:t>
+      </w:r>
+      <w:r>
+        <w:t>M1 to M4</w:t>
+      </w:r>
+      <w:r>
+        <w:t>,</w:t>
+      </w:r>
+      <w:r>
+        <w:t xml:space="preserve"> and falling</w:t>
+      </w:r>
+      <w:r>
+        <w:t xml:space="preserve"> </w:t>
+      </w:r>
+      <w:r>
+        <w:t>edge timer contacts were used to build a continuous 2</w:t>
+      </w:r>
+      <w:r>
+        <w:t xml:space="preserve"> </w:t>
+      </w:r>
+      <w:r>
+        <w:t xml:space="preserve">second chaser loop across four warning lamps. </w:t>
+      </w:r>
+      <w:r>
+        <w:t xml:space="preserve">Finally, Problem 3 showed how to program a longer 6-step pedestrian crossing sequence by combining memory bits, timers, and data register D0 with MOV and </w:t>
+      </w:r>
+      <w:r>
+        <w:t xml:space="preserve">comparison </w:t>
+      </w:r>
+      <w:r>
+        <w:t>instructions</w:t>
+      </w:r>
+      <w:r>
+        <w:t xml:space="preserve">. </w:t>
+      </w:r>
+      <w:r>
+        <w:t xml:space="preserve">Using data registers to track each step makes a multi-step program much cleaner and easier to follow than using </w:t>
+      </w:r>
       <w:proofErr w:type="gramStart"/>
       <w:r>
-        <w:t>practical</w:t>
+        <w:t>a large number of</w:t>
       </w:r>
       <w:proofErr w:type="gramEnd"/>
       <w:r>
-        <w:t xml:space="preserve">, we learned how to design, simulate, and test timer-based sequential Ladder Logic programs on the Mitsubishi FX3G PLC using GX Works2. In Problem 1, combining a rising-edge pulse contact (|↑|) with [SET] and [RST] instructions ensured that the output lamp only stayed on for the exact 10-second duration of timer T0 (K100), preventing the circuit from re-triggering if the start button was held down. In Problem 2, internal relays (M1 to M4) and falling-edge timer contacts (|↓|) were used to build a continuous 2-second chaser loop across four warning lamps. Finally, Problem 3 demonstrated a much cleaner method for programming larger multi-step processes (such as a 6-step pedestrian traffic crossing) by storing the active state number inside a Data Register (D0) with the [MOV] instruction and triggering transitions with = D0 Kx </w:t>
-      </w:r>
-      <w:r>
-        <w:lastRenderedPageBreak/>
-        <w:t>comparators and timers. Using data registers for state control makes complex industrial sequences much easier to read, debug, and modify compared to wiring dozens of individual relay contacts.</w:t>
+        <w:t xml:space="preserve"> normal relay contacts.</w:t>
       </w:r>
     </w:p>
     <w:p>

</xml_diff>